<commit_message>
Build polished universal contract flow
</commit_message>
<xml_diff>
--- a/app/templates/contracts/master_v1.docx
+++ b/app/templates/contracts/master_v1.docx
@@ -4,509 +4,381 @@
   <w:body>
     <w:p>
       <w:pPr>
-        <w:spacing w:after="160"/>
+        <w:spacing w:before="160" w:after="40"/>
         <w:jc w:val="center"/>
       </w:pPr>
       <w:r>
         <w:rPr>
+          <w:rFonts w:ascii="Times New Roman" w:hAnsi="Times New Roman" w:eastAsia="Times New Roman"/>
           <w:b/>
+          <w:color w:val="17365D"/>
           <w:sz w:val="30"/>
         </w:rPr>
-        <w:t>ДОГОВОР ОКАЗАНИЯ УСЛУГ № {{ contract_number }}</w:t>
+        <w:t>ДОГОВОР ОКАЗАНИЯ УСЛУГ</w:t>
       </w:r>
     </w:p>
     <w:p>
       <w:pPr>
-        <w:tabs>
-          <w:tab w:pos="9071" w:val="left"/>
-        </w:tabs>
-        <w:jc w:val="left"/>
+        <w:spacing w:before="0" w:after="140"/>
+        <w:jc w:val="center"/>
       </w:pPr>
       <w:r>
-        <w:t>{{ contract_city }}</w:t>
-        <w:tab/>
-        <w:t>«{{ contract_date }}»</w:t>
+        <w:rPr>
+          <w:rFonts w:ascii="Times New Roman" w:hAnsi="Times New Roman" w:eastAsia="Times New Roman"/>
+          <w:b/>
+          <w:sz w:val="23"/>
+        </w:rPr>
+        <w:t>№ {{ contract_number }}</w:t>
       </w:r>
     </w:p>
-    <w:p/>
+    <w:tbl>
+      <w:tblPr>
+        <w:tblW w:type="dxa" w:w="9865"/>
+        <w:jc w:val="center"/>
+        <w:tblLayout w:type="fixed"/>
+        <w:tblLook w:firstColumn="1" w:firstRow="1" w:lastColumn="0" w:lastRow="0" w:noHBand="0" w:noVBand="1" w:val="04A0"/>
+        <w:tblInd w:w="0" w:type="dxa"/>
+        <w:tblBorders>
+          <w:top w:val="nil"/>
+          <w:left w:val="nil"/>
+          <w:bottom w:val="nil"/>
+          <w:right w:val="nil"/>
+          <w:insideH w:val="nil"/>
+          <w:insideV w:val="nil"/>
+        </w:tblBorders>
+      </w:tblPr>
+      <w:tblGrid>
+        <w:gridCol w:w="4932"/>
+        <w:gridCol w:w="4933"/>
+      </w:tblGrid>
+      <w:tr>
+        <w:tc>
+          <w:tcPr>
+            <w:tcW w:type="dxa" w:w="4932"/>
+            <w:tcMar>
+              <w:top w:w="80" w:type="dxa"/>
+              <w:start w:w="120" w:type="dxa"/>
+              <w:bottom w:w="80" w:type="dxa"/>
+              <w:end w:w="120" w:type="dxa"/>
+            </w:tcMar>
+          </w:tcPr>
+          <w:p>
+            <w:r>
+              <w:rPr>
+                <w:rFonts w:ascii="Times New Roman" w:hAnsi="Times New Roman" w:eastAsia="Times New Roman"/>
+                <w:b/>
+                <w:sz w:val="21"/>
+              </w:rPr>
+              <w:t>{{ contract_city }}</w:t>
+            </w:r>
+          </w:p>
+        </w:tc>
+        <w:tc>
+          <w:tcPr>
+            <w:tcW w:type="dxa" w:w="4933"/>
+            <w:tcMar>
+              <w:top w:w="80" w:type="dxa"/>
+              <w:start w:w="120" w:type="dxa"/>
+              <w:bottom w:w="80" w:type="dxa"/>
+              <w:end w:w="120" w:type="dxa"/>
+            </w:tcMar>
+          </w:tcPr>
+          <w:p>
+            <w:pPr>
+              <w:jc w:val="right"/>
+            </w:pPr>
+            <w:r>
+              <w:rPr>
+                <w:rFonts w:ascii="Times New Roman" w:hAnsi="Times New Roman" w:eastAsia="Times New Roman"/>
+                <w:b/>
+                <w:sz w:val="21"/>
+              </w:rPr>
+              <w:t>{{ contract_date }} г.</w:t>
+            </w:r>
+          </w:p>
+        </w:tc>
+      </w:tr>
+    </w:tbl>
     <w:p>
       <w:pPr>
-        <w:spacing w:after="120" w:line="276" w:lineRule="auto"/>
+        <w:spacing w:before="0" w:after="60" w:line="259" w:lineRule="auto"/>
+        <w:ind w:firstLine="454"/>
         <w:jc w:val="both"/>
       </w:pPr>
       <w:r>
-        <w:t>{{ executor_full_name }}, осуществляющий деятельность под коммерческим обозначением {{ executor_brand_name }}, ИИН {{ executor_iin }}, именуемый в дальнейшем «Исполнитель», с одной стороны, и {{ client_full_name }}, ИИН {{ client_iin }}, телефон/WhatsApp: {{ client_phone }}, именуемый в дальнейшем «Клиент», с другой стороны, совместно именуемые «Стороны», заключили настоящий договор о нижеследующем.</w:t>
+        <w:rPr>
+          <w:rFonts w:ascii="Times New Roman" w:hAnsi="Times New Roman" w:eastAsia="Times New Roman"/>
+          <w:sz w:val="22"/>
+        </w:rPr>
+        <w:t>{{ executor_full_name }}, {{ executor_identifier_label }} {{ executor_identifier }}, в лице руководителя {{ executor_director_name }}, действующего на основании Устава, именуемое в дальнейшем «Исполнитель», с одной стороны, и гражданин(ка) {{ client_full_name }}, ИИН {{ client_iin }}, именуемый(ая) в дальнейшем «Клиент», с другой стороны, совместно именуемые «Стороны», заключили настоящий договор о нижеследующем.</w:t>
       </w:r>
     </w:p>
     <w:p>
       <w:pPr>
-        <w:spacing w:before="200" w:after="120"/>
+        <w:pStyle w:val="ZESection"/>
+        <w:keepNext/>
         <w:jc w:val="center"/>
       </w:pPr>
       <w:r>
         <w:rPr>
+          <w:rFonts w:ascii="Times New Roman" w:hAnsi="Times New Roman" w:eastAsia="Times New Roman"/>
           <w:b/>
+          <w:color w:val="17365D"/>
+          <w:sz w:val="21"/>
         </w:rPr>
         <w:t>1. ПРЕДМЕТ ДОГОВОРА</w:t>
       </w:r>
     </w:p>
     <w:p>
       <w:pPr>
-        <w:spacing w:after="120" w:line="276" w:lineRule="auto"/>
+        <w:spacing w:before="0" w:after="60" w:line="259" w:lineRule="auto"/>
+        <w:ind w:firstLine="454"/>
         <w:jc w:val="both"/>
       </w:pPr>
       <w:r>
         <w:rPr>
+          <w:rFonts w:ascii="Times New Roman" w:hAnsi="Times New Roman" w:eastAsia="Times New Roman"/>
           <w:b/>
+          <w:sz w:val="22"/>
         </w:rPr>
         <w:t xml:space="preserve">1.1. </w:t>
       </w:r>
       <w:r>
+        <w:rPr>
+          <w:rFonts w:ascii="Times New Roman" w:hAnsi="Times New Roman" w:eastAsia="Times New Roman"/>
+          <w:sz w:val="22"/>
+        </w:rPr>
         <w:t>{{ service_subject }}</w:t>
       </w:r>
     </w:p>
     <w:p>
       <w:pPr>
-        <w:spacing w:after="120" w:line="276" w:lineRule="auto"/>
+        <w:spacing w:before="0" w:after="60" w:line="259" w:lineRule="auto"/>
+        <w:ind w:firstLine="454"/>
         <w:jc w:val="both"/>
       </w:pPr>
       <w:r>
         <w:rPr>
+          <w:rFonts w:ascii="Times New Roman" w:hAnsi="Times New Roman" w:eastAsia="Times New Roman"/>
           <w:b/>
+          <w:sz w:val="22"/>
         </w:rPr>
         <w:t xml:space="preserve">1.2. </w:t>
       </w:r>
       <w:r>
+        <w:rPr>
+          <w:rFonts w:ascii="Times New Roman" w:hAnsi="Times New Roman" w:eastAsia="Times New Roman"/>
+          <w:sz w:val="22"/>
+        </w:rPr>
         <w:t>В состав услуг входят: {{ service_actions }}.</w:t>
       </w:r>
     </w:p>
     <w:p>
       <w:pPr>
-        <w:spacing w:after="120" w:line="276" w:lineRule="auto"/>
+        <w:spacing w:before="0" w:after="60" w:line="259" w:lineRule="auto"/>
+        <w:ind w:firstLine="454"/>
         <w:jc w:val="both"/>
       </w:pPr>
       <w:r>
         <w:rPr>
+          <w:rFonts w:ascii="Times New Roman" w:hAnsi="Times New Roman" w:eastAsia="Times New Roman"/>
           <w:b/>
+          <w:sz w:val="22"/>
         </w:rPr>
         <w:t xml:space="preserve">1.3. </w:t>
       </w:r>
       <w:r>
-        <w:t>Исполнитель оказывает консультационную, информационную и документальную поддержку. Настоящий договор не является договором адвокатской помощи; участие Исполнителя в судебном заседании, нотариальные расходы, государственная пошлина, услуги медиатора, адвоката или иного представителя оплачиваются отдельно, если Стороны письменно не согласовали иное.</w:t>
+        <w:rPr>
+          <w:rFonts w:ascii="Times New Roman" w:hAnsi="Times New Roman" w:eastAsia="Times New Roman"/>
+          <w:sz w:val="22"/>
+        </w:rPr>
+        <w:t>Ожидаемый и проверяемый результат оказания услуг: {{ result_definition }}.</w:t>
       </w:r>
     </w:p>
     <w:p>
       <w:pPr>
-        <w:spacing w:before="200" w:after="120"/>
+        <w:pStyle w:val="ZESection"/>
+        <w:keepNext/>
         <w:jc w:val="center"/>
       </w:pPr>
       <w:r>
         <w:rPr>
+          <w:rFonts w:ascii="Times New Roman" w:hAnsi="Times New Roman" w:eastAsia="Times New Roman"/>
           <w:b/>
+          <w:color w:val="17365D"/>
+          <w:sz w:val="21"/>
         </w:rPr>
-        <w:t>2. РЕЗУЛЬТАТ И ПОРЯДОК ОКАЗАНИЯ УСЛУГ</w:t>
+        <w:t>2. ПОРЯДОК И СРОКИ ОКАЗАНИЯ УСЛУГ</w:t>
       </w:r>
     </w:p>
     <w:p>
       <w:pPr>
-        <w:spacing w:after="120" w:line="276" w:lineRule="auto"/>
+        <w:spacing w:before="0" w:after="60" w:line="259" w:lineRule="auto"/>
+        <w:ind w:firstLine="454"/>
         <w:jc w:val="both"/>
       </w:pPr>
       <w:r>
         <w:rPr>
+          <w:rFonts w:ascii="Times New Roman" w:hAnsi="Times New Roman" w:eastAsia="Times New Roman"/>
           <w:b/>
+          <w:sz w:val="22"/>
         </w:rPr>
         <w:t xml:space="preserve">2.1. </w:t>
       </w:r>
       <w:r>
-        <w:t>Результатом услуг по настоящему договору признаётся {{ result_definition }}. Если договором предусмотрено несколько допустимых результатов, для признания услуг оказанными достаточно наступления одного из них при условии подтверждения официальным документом.</w:t>
+        <w:rPr>
+          <w:rFonts w:ascii="Times New Roman" w:hAnsi="Times New Roman" w:eastAsia="Times New Roman"/>
+          <w:sz w:val="22"/>
+        </w:rPr>
+        <w:t>Исполнитель приступает к оказанию услуг после получения от Клиента документов и сведений, необходимых для выполнения поручения, а при предусмотренной предоплате - также после её внесения.</w:t>
       </w:r>
     </w:p>
     <w:p>
       <w:pPr>
-        <w:spacing w:after="120" w:line="276" w:lineRule="auto"/>
+        <w:spacing w:before="0" w:after="60" w:line="259" w:lineRule="auto"/>
+        <w:ind w:firstLine="454"/>
         <w:jc w:val="both"/>
       </w:pPr>
       <w:r>
         <w:rPr>
+          <w:rFonts w:ascii="Times New Roman" w:hAnsi="Times New Roman" w:eastAsia="Times New Roman"/>
           <w:b/>
+          <w:sz w:val="22"/>
         </w:rPr>
         <w:t xml:space="preserve">2.2. </w:t>
       </w:r>
       <w:r>
+        <w:rPr>
+          <w:rFonts w:ascii="Times New Roman" w:hAnsi="Times New Roman" w:eastAsia="Times New Roman"/>
+          <w:sz w:val="22"/>
+        </w:rPr>
         <w:t>Срок оказания услуг: {{ work_period }}. Сроки рассмотрения обращений судом, нотариусом, ЧСИ, банком, взыскателем и государственными органами не зависят от Исполнителя и в срок оказания услуг не включаются.</w:t>
       </w:r>
     </w:p>
     <w:p>
       <w:pPr>
-        <w:spacing w:after="120" w:line="276" w:lineRule="auto"/>
+        <w:spacing w:before="0" w:after="60" w:line="259" w:lineRule="auto"/>
+        <w:ind w:firstLine="454"/>
         <w:jc w:val="both"/>
       </w:pPr>
       <w:r>
         <w:rPr>
+          <w:rFonts w:ascii="Times New Roman" w:hAnsi="Times New Roman" w:eastAsia="Times New Roman"/>
           <w:b/>
+          <w:sz w:val="22"/>
         </w:rPr>
         <w:t xml:space="preserve">2.3. </w:t>
       </w:r>
       <w:r>
+        <w:rPr>
+          <w:rFonts w:ascii="Times New Roman" w:hAnsi="Times New Roman" w:eastAsia="Times New Roman"/>
+          <w:sz w:val="22"/>
+        </w:rPr>
         <w:t>Клиент обязан незамедлительно передавать Исполнителю поступившие уведомления, постановления, судебные извещения, ответы государственных органов и организаций и иные документы, имеющие отношение к делу.</w:t>
       </w:r>
     </w:p>
     <w:p>
       <w:pPr>
-        <w:spacing w:before="200" w:after="120"/>
+        <w:pStyle w:val="ZESection"/>
+        <w:keepNext/>
         <w:jc w:val="center"/>
       </w:pPr>
       <w:r>
         <w:rPr>
+          <w:rFonts w:ascii="Times New Roman" w:hAnsi="Times New Roman" w:eastAsia="Times New Roman"/>
           <w:b/>
+          <w:color w:val="17365D"/>
+          <w:sz w:val="21"/>
         </w:rPr>
         <w:t>3. СТОИМОСТЬ УСЛУГ И ПОРЯДОК ОПЛАТЫ</w:t>
       </w:r>
     </w:p>
     <w:p>
       <w:pPr>
-        <w:spacing w:after="120" w:line="276" w:lineRule="auto"/>
+        <w:spacing w:before="0" w:after="60" w:line="259" w:lineRule="auto"/>
+        <w:ind w:firstLine="454"/>
         <w:jc w:val="both"/>
       </w:pPr>
       <w:r>
         <w:rPr>
+          <w:rFonts w:ascii="Times New Roman" w:hAnsi="Times New Roman" w:eastAsia="Times New Roman"/>
           <w:b/>
+          <w:sz w:val="22"/>
         </w:rPr>
         <w:t xml:space="preserve">3.1. </w:t>
       </w:r>
       <w:r>
+        <w:rPr>
+          <w:rFonts w:ascii="Times New Roman" w:hAnsi="Times New Roman" w:eastAsia="Times New Roman"/>
+          <w:sz w:val="22"/>
+        </w:rPr>
         <w:t>Общая стоимость услуг по настоящему договору составляет {{ amount_digits }} ({{ amount_words }}).</w:t>
       </w:r>
     </w:p>
     <w:p>
       <w:pPr>
-        <w:spacing w:after="120" w:line="276" w:lineRule="auto"/>
+        <w:spacing w:before="0" w:after="60" w:line="259" w:lineRule="auto"/>
+        <w:ind w:firstLine="454"/>
         <w:jc w:val="both"/>
       </w:pPr>
       <w:r>
         <w:rPr>
+          <w:rFonts w:ascii="Times New Roman" w:hAnsi="Times New Roman" w:eastAsia="Times New Roman"/>
           <w:b/>
+          <w:sz w:val="22"/>
         </w:rPr>
         <w:t xml:space="preserve">3.2. </w:t>
       </w:r>
       <w:r>
+        <w:rPr>
+          <w:rFonts w:ascii="Times New Roman" w:hAnsi="Times New Roman" w:eastAsia="Times New Roman"/>
+          <w:sz w:val="22"/>
+        </w:rPr>
         <w:t>{{ payment_terms }}</w:t>
       </w:r>
     </w:p>
     <w:p>
       <w:pPr>
-        <w:spacing w:after="120" w:line="276" w:lineRule="auto"/>
+        <w:spacing w:before="0" w:after="60" w:line="259" w:lineRule="auto"/>
+        <w:ind w:firstLine="454"/>
         <w:jc w:val="both"/>
       </w:pPr>
       <w:r>
         <w:rPr>
+          <w:rFonts w:ascii="Times New Roman" w:hAnsi="Times New Roman" w:eastAsia="Times New Roman"/>
           <w:b/>
+          <w:sz w:val="22"/>
         </w:rPr>
         <w:t xml:space="preserve">3.3. </w:t>
       </w:r>
       <w:r>
-        <w:t>Оплата производится наличными либо переводом на Kaspi/банковский счёт Исполнителя по номеру: {{ executor_phone }}, получатель: {{ executor_name }}. Факт оплаты подтверждается банковским чеком, квитанцией, распиской либо иным платёжным документом.</w:t>
+        <w:rPr>
+          <w:rFonts w:ascii="Times New Roman" w:hAnsi="Times New Roman" w:eastAsia="Times New Roman"/>
+          <w:sz w:val="22"/>
+        </w:rPr>
+        <w:t>Оплата производится {{ executor_payment_details }}. Факт оплаты подтверждается банковским чеком, квитанцией, распиской либо иным платёжным документом.</w:t>
       </w:r>
     </w:p>
     <w:p>
       <w:pPr>
-        <w:spacing w:after="120" w:line="276" w:lineRule="auto"/>
+        <w:spacing w:before="0" w:after="60" w:line="259" w:lineRule="auto"/>
+        <w:ind w:firstLine="454"/>
         <w:jc w:val="both"/>
       </w:pPr>
       <w:r>
         <w:rPr>
+          <w:rFonts w:ascii="Times New Roman" w:hAnsi="Times New Roman" w:eastAsia="Times New Roman"/>
           <w:b/>
+          <w:sz w:val="22"/>
         </w:rPr>
         <w:t xml:space="preserve">3.4. </w:t>
       </w:r>
       <w:r>
+        <w:rPr>
+          <w:rFonts w:ascii="Times New Roman" w:hAnsi="Times New Roman" w:eastAsia="Times New Roman"/>
+          <w:sz w:val="22"/>
+        </w:rPr>
         <w:t>{{ penalty_clause }}</w:t>
-      </w:r>
-    </w:p>
-    <w:p>
-      <w:pPr>
-        <w:spacing w:before="200" w:after="120"/>
-        <w:jc w:val="center"/>
-      </w:pPr>
-      <w:r>
-        <w:rPr>
-          <w:b/>
-        </w:rPr>
-        <w:t>4. ПРАВА И ОБЯЗАННОСТИ СТОРОН</w:t>
-      </w:r>
-    </w:p>
-    <w:p>
-      <w:pPr>
-        <w:spacing w:after="120" w:line="276" w:lineRule="auto"/>
-        <w:jc w:val="both"/>
-      </w:pPr>
-      <w:r>
-        <w:rPr>
-          <w:b/>
-        </w:rPr>
-        <w:t xml:space="preserve">4.1. </w:t>
-      </w:r>
-      <w:r>
-        <w:t>Исполнитель обязуется добросовестно подготовить документы, информировать Клиента о существенных действиях и передавать Клиенту полученные ответы и документы.</w:t>
-      </w:r>
-    </w:p>
-    <w:p>
-      <w:pPr>
-        <w:spacing w:after="120" w:line="276" w:lineRule="auto"/>
-        <w:jc w:val="both"/>
-      </w:pPr>
-      <w:r>
-        <w:rPr>
-          <w:b/>
-        </w:rPr>
-        <w:t xml:space="preserve">4.2. </w:t>
-      </w:r>
-      <w:r>
-        <w:t>Исполнитель вправе выбирать законный способ защиты интересов Клиента, запрашивать дополнительные документы и приостанавливать работу до их предоставления.</w:t>
-      </w:r>
-    </w:p>
-    <w:p>
-      <w:pPr>
-        <w:spacing w:after="120" w:line="276" w:lineRule="auto"/>
-        <w:jc w:val="both"/>
-      </w:pPr>
-      <w:r>
-        <w:rPr>
-          <w:b/>
-        </w:rPr>
-        <w:t xml:space="preserve">4.3. </w:t>
-      </w:r>
-      <w:r>
-        <w:t>Клиент обязуется предоставлять достоверные и полные сведения, своевременно подписывать подготовленные документы, оплачивать обязательные государственные и нотариальные расходы, лично являться в суд, к нотариусу или ЧСИ, если это требуется законом или органом, рассматривающим обращение.</w:t>
-      </w:r>
-    </w:p>
-    <w:p>
-      <w:pPr>
-        <w:spacing w:after="120" w:line="276" w:lineRule="auto"/>
-        <w:jc w:val="both"/>
-      </w:pPr>
-      <w:r>
-        <w:rPr>
-          <w:b/>
-        </w:rPr>
-        <w:t xml:space="preserve">4.4. </w:t>
-      </w:r>
-      <w:r>
-        <w:t>Клиент подтверждает, что сообщил Исполнителю обо всех известных исполнительных производствах, судебных актах, соглашениях, платежах, ранее поданных заявлениях и иных обстоятельствах, влияющих на оказание услуг.</w:t>
-      </w:r>
-    </w:p>
-    <w:p>
-      <w:pPr>
-        <w:spacing w:before="200" w:after="120"/>
-        <w:jc w:val="center"/>
-      </w:pPr>
-      <w:r>
-        <w:rPr>
-          <w:b/>
-        </w:rPr>
-        <w:t>5. ПРИЕМКА УСЛУГ</w:t>
-      </w:r>
-    </w:p>
-    <w:p>
-      <w:pPr>
-        <w:spacing w:after="120" w:line="276" w:lineRule="auto"/>
-        <w:jc w:val="both"/>
-      </w:pPr>
-      <w:r>
-        <w:rPr>
-          <w:b/>
-        </w:rPr>
-        <w:t xml:space="preserve">5.1. </w:t>
-      </w:r>
-      <w:r>
-        <w:t>После достижения предусмотренного договором результата Исполнитель направляет Клиенту итоговый документ или уведомление о результате посредством Telegram, WhatsApp или электронной почты. Если Клиент в течение 3 (трёх) календарных дней не направит мотивированные письменные возражения с указанием конкретных недостатков, услуги считаются оказанными и принятыми в полном объёме.</w:t>
-      </w:r>
-    </w:p>
-    <w:p>
-      <w:pPr>
-        <w:spacing w:after="120" w:line="276" w:lineRule="auto"/>
-        <w:jc w:val="both"/>
-      </w:pPr>
-      <w:r>
-        <w:rPr>
-          <w:b/>
-        </w:rPr>
-        <w:t xml:space="preserve">5.2. </w:t>
-      </w:r>
-      <w:r>
-        <w:t>Отказ Клиента от подписания акта при наличии доказательств выполнения работ и отсутствии мотивированных письменных возражений не отменяет факт оказания и приёмки услуг.</w:t>
-      </w:r>
-    </w:p>
-    <w:p>
-      <w:pPr>
-        <w:spacing w:before="200" w:after="120"/>
-        <w:jc w:val="center"/>
-      </w:pPr>
-      <w:r>
-        <w:rPr>
-          <w:b/>
-        </w:rPr>
-        <w:t>6. ОТВЕТСТВЕННОСТЬ И РАЗРЕШЕНИЕ СПОРОВ</w:t>
-      </w:r>
-    </w:p>
-    <w:p>
-      <w:pPr>
-        <w:spacing w:after="120" w:line="276" w:lineRule="auto"/>
-        <w:jc w:val="both"/>
-      </w:pPr>
-      <w:r>
-        <w:rPr>
-          <w:b/>
-        </w:rPr>
-        <w:t xml:space="preserve">6.1. </w:t>
-      </w:r>
-      <w:r>
-        <w:t>Стороны несут ответственность в соответствии с законодательством Республики Казахстан и настоящим договором.</w:t>
-      </w:r>
-    </w:p>
-    <w:p>
-      <w:pPr>
-        <w:spacing w:after="120" w:line="276" w:lineRule="auto"/>
-        <w:jc w:val="both"/>
-      </w:pPr>
-      <w:r>
-        <w:rPr>
-          <w:b/>
-        </w:rPr>
-        <w:t xml:space="preserve">6.2. </w:t>
-      </w:r>
-      <w:r>
-        <w:t>Исполнитель не отвечает за незаконные либо несвоевременные действия/бездействие нотариуса, ЧСИ, суда, взыскателя, банка и государственных органов, но обязуется подготовить и передать Клиенту документы и рекомендации, предусмотренные настоящим договором.</w:t>
-      </w:r>
-    </w:p>
-    <w:p>
-      <w:pPr>
-        <w:spacing w:after="120" w:line="276" w:lineRule="auto"/>
-        <w:jc w:val="both"/>
-      </w:pPr>
-      <w:r>
-        <w:rPr>
-          <w:b/>
-        </w:rPr>
-        <w:t xml:space="preserve">6.3. </w:t>
-      </w:r>
-      <w:r>
-        <w:t>Стороны признают юридическую силу переписки и документов, переданных через WhatsApp, Telegram, SMS, электронную почту и иные согласованные средства связи, если возможно достоверно определить отправителя, содержание и дату сообщения.</w:t>
-      </w:r>
-    </w:p>
-    <w:p>
-      <w:pPr>
-        <w:spacing w:after="120" w:line="276" w:lineRule="auto"/>
-        <w:jc w:val="both"/>
-      </w:pPr>
-      <w:r>
-        <w:rPr>
-          <w:b/>
-        </w:rPr>
-        <w:t xml:space="preserve">6.4. </w:t>
-      </w:r>
-      <w:r>
-        <w:t>До обращения в суд заинтересованная Сторона направляет письменную претензию. Срок ответа на претензию — 5 (пять) рабочих дней с момента её получения. При недостижении соглашения спор рассматривается в порядке, установленном законодательством Республики Казахстан.</w:t>
-      </w:r>
-    </w:p>
-    <w:p>
-      <w:pPr>
-        <w:spacing w:before="200" w:after="120"/>
-        <w:jc w:val="center"/>
-      </w:pPr>
-      <w:r>
-        <w:rPr>
-          <w:b/>
-        </w:rPr>
-        <w:t>7. ПЕРСОНАЛЬНЫЕ ДАННЫЕ И УВЕДОМЛЕНИЯ</w:t>
-      </w:r>
-    </w:p>
-    <w:p>
-      <w:pPr>
-        <w:spacing w:after="120" w:line="276" w:lineRule="auto"/>
-        <w:jc w:val="both"/>
-      </w:pPr>
-      <w:r>
-        <w:rPr>
-          <w:b/>
-        </w:rPr>
-        <w:t xml:space="preserve">7.1. </w:t>
-      </w:r>
-      <w:r>
-        <w:t>Подписывая настоящий договор, Клиент даёт согласие на сбор и обработку Исполнителем своих персональных данных в объёме, необходимом для исполнения настоящего договора, в соответствии с законодательством Республики Казахстан о персональных данных и их защите.</w:t>
-      </w:r>
-    </w:p>
-    <w:p>
-      <w:pPr>
-        <w:spacing w:after="120" w:line="276" w:lineRule="auto"/>
-        <w:jc w:val="both"/>
-      </w:pPr>
-      <w:r>
-        <w:rPr>
-          <w:b/>
-        </w:rPr>
-        <w:t xml:space="preserve">7.2. </w:t>
-      </w:r>
-      <w:r>
-        <w:t>Уведомления и сообщения по настоящему договору направляются по телефону, WhatsApp, Telegram или электронной почте, указанным Сторонами, и считаются полученными в день отправки.</w:t>
-      </w:r>
-    </w:p>
-    <w:p>
-      <w:pPr>
-        <w:spacing w:before="200" w:after="120"/>
-        <w:jc w:val="center"/>
-      </w:pPr>
-      <w:r>
-        <w:rPr>
-          <w:b/>
-        </w:rPr>
-        <w:t>8. ЗАКЛЮЧИТЕЛЬНЫЕ ПОЛОЖЕНИЯ</w:t>
-      </w:r>
-    </w:p>
-    <w:p>
-      <w:pPr>
-        <w:spacing w:after="120" w:line="276" w:lineRule="auto"/>
-        <w:jc w:val="both"/>
-      </w:pPr>
-      <w:r>
-        <w:rPr>
-          <w:b/>
-        </w:rPr>
-        <w:t xml:space="preserve">8.1. </w:t>
-      </w:r>
-      <w:r>
-        <w:t>Настоящий договор вступает в силу с даты его подписания и действует до полного исполнения Сторонами обязательств.</w:t>
-      </w:r>
-    </w:p>
-    <w:p>
-      <w:pPr>
-        <w:spacing w:after="120" w:line="276" w:lineRule="auto"/>
-        <w:jc w:val="both"/>
-      </w:pPr>
-      <w:r>
-        <w:rPr>
-          <w:b/>
-        </w:rPr>
-        <w:t xml:space="preserve">8.2. </w:t>
-      </w:r>
-      <w:r>
-        <w:t>Изменения и дополнения действительны при письменном согласовании Сторонами, включая согласование через WhatsApp, Telegram или электронную переписку.</w:t>
-      </w:r>
-    </w:p>
-    <w:p>
-      <w:pPr>
-        <w:spacing w:after="120" w:line="276" w:lineRule="auto"/>
-        <w:jc w:val="both"/>
-      </w:pPr>
-      <w:r>
-        <w:rPr>
-          <w:b/>
-        </w:rPr>
-        <w:t xml:space="preserve">8.3. </w:t>
-      </w:r>
-      <w:r>
-        <w:t>Договор составлен в двух экземплярах, имеющих одинаковую юридическую силу, по одному для каждой из Сторон, либо подписан посредством простой электронной подписи Клиента в соответствии с порядком, доведённым до сведения Клиента при подписании.</w:t>
       </w:r>
     </w:p>
     <w:p>
@@ -516,36 +388,480 @@
     </w:p>
     <w:p>
       <w:pPr>
-        <w:spacing w:before="200" w:after="120"/>
+        <w:pStyle w:val="ZESection"/>
+        <w:keepNext/>
         <w:jc w:val="center"/>
       </w:pPr>
       <w:r>
         <w:rPr>
+          <w:rFonts w:ascii="Times New Roman" w:hAnsi="Times New Roman" w:eastAsia="Times New Roman"/>
           <w:b/>
+          <w:color w:val="17365D"/>
+          <w:sz w:val="21"/>
+        </w:rPr>
+        <w:t>4. ПРАВА И ОБЯЗАННОСТИ СТОРОН</w:t>
+      </w:r>
+    </w:p>
+    <w:p>
+      <w:pPr>
+        <w:spacing w:before="0" w:after="60" w:line="259" w:lineRule="auto"/>
+        <w:ind w:firstLine="454"/>
+        <w:jc w:val="both"/>
+      </w:pPr>
+      <w:r>
+        <w:rPr>
+          <w:rFonts w:ascii="Times New Roman" w:hAnsi="Times New Roman" w:eastAsia="Times New Roman"/>
+          <w:b/>
+          <w:sz w:val="22"/>
+        </w:rPr>
+        <w:t xml:space="preserve">4.1. </w:t>
+      </w:r>
+      <w:r>
+        <w:rPr>
+          <w:rFonts w:ascii="Times New Roman" w:hAnsi="Times New Roman" w:eastAsia="Times New Roman"/>
+          <w:sz w:val="22"/>
+        </w:rPr>
+        <w:t>Исполнитель обязуется добросовестно подготовить документы, информировать Клиента о существенных действиях и передавать Клиенту полученные ответы и документы.</w:t>
+      </w:r>
+    </w:p>
+    <w:p>
+      <w:pPr>
+        <w:spacing w:before="0" w:after="60" w:line="259" w:lineRule="auto"/>
+        <w:ind w:firstLine="454"/>
+        <w:jc w:val="both"/>
+      </w:pPr>
+      <w:r>
+        <w:rPr>
+          <w:rFonts w:ascii="Times New Roman" w:hAnsi="Times New Roman" w:eastAsia="Times New Roman"/>
+          <w:b/>
+          <w:sz w:val="22"/>
+        </w:rPr>
+        <w:t xml:space="preserve">4.2. </w:t>
+      </w:r>
+      <w:r>
+        <w:rPr>
+          <w:rFonts w:ascii="Times New Roman" w:hAnsi="Times New Roman" w:eastAsia="Times New Roman"/>
+          <w:sz w:val="22"/>
+        </w:rPr>
+        <w:t>Исполнитель вправе выбирать законный способ защиты интересов Клиента, запрашивать дополнительные документы и приостанавливать работу до их предоставления.</w:t>
+      </w:r>
+    </w:p>
+    <w:p>
+      <w:pPr>
+        <w:spacing w:before="0" w:after="60" w:line="259" w:lineRule="auto"/>
+        <w:ind w:firstLine="454"/>
+        <w:jc w:val="both"/>
+      </w:pPr>
+      <w:r>
+        <w:rPr>
+          <w:rFonts w:ascii="Times New Roman" w:hAnsi="Times New Roman" w:eastAsia="Times New Roman"/>
+          <w:b/>
+          <w:sz w:val="22"/>
+        </w:rPr>
+        <w:t xml:space="preserve">4.3. </w:t>
+      </w:r>
+      <w:r>
+        <w:rPr>
+          <w:rFonts w:ascii="Times New Roman" w:hAnsi="Times New Roman" w:eastAsia="Times New Roman"/>
+          <w:sz w:val="22"/>
+        </w:rPr>
+        <w:t>Клиент обязуется предоставлять достоверные и полные сведения, своевременно подписывать подготовленные документы, оплачивать обязательные государственные и нотариальные расходы, лично являться в суд, к нотариусу или ЧСИ, если это требуется.</w:t>
+      </w:r>
+    </w:p>
+    <w:p>
+      <w:pPr>
+        <w:spacing w:before="0" w:after="60" w:line="259" w:lineRule="auto"/>
+        <w:ind w:firstLine="454"/>
+        <w:jc w:val="both"/>
+      </w:pPr>
+      <w:r>
+        <w:rPr>
+          <w:rFonts w:ascii="Times New Roman" w:hAnsi="Times New Roman" w:eastAsia="Times New Roman"/>
+          <w:b/>
+          <w:sz w:val="22"/>
+        </w:rPr>
+        <w:t xml:space="preserve">4.4. </w:t>
+      </w:r>
+      <w:r>
+        <w:rPr>
+          <w:rFonts w:ascii="Times New Roman" w:hAnsi="Times New Roman" w:eastAsia="Times New Roman"/>
+          <w:sz w:val="22"/>
+        </w:rPr>
+        <w:t>Клиент подтверждает, что сообщил Исполнителю обо всех известных исполнительных производствах, судебных актах, соглашениях, платежах, ранее поданных заявлениях и иных обстоятельствах, влияющих на оказание услуг.</w:t>
+      </w:r>
+    </w:p>
+    <w:p>
+      <w:pPr>
+        <w:pStyle w:val="ZESection"/>
+        <w:keepNext/>
+        <w:jc w:val="center"/>
+      </w:pPr>
+      <w:r>
+        <w:rPr>
+          <w:rFonts w:ascii="Times New Roman" w:hAnsi="Times New Roman" w:eastAsia="Times New Roman"/>
+          <w:b/>
+          <w:color w:val="17365D"/>
+          <w:sz w:val="21"/>
+        </w:rPr>
+        <w:t>5. ПРИЁМКА УСЛУГ</w:t>
+      </w:r>
+    </w:p>
+    <w:p>
+      <w:pPr>
+        <w:spacing w:before="0" w:after="60" w:line="259" w:lineRule="auto"/>
+        <w:ind w:firstLine="454"/>
+        <w:jc w:val="both"/>
+      </w:pPr>
+      <w:r>
+        <w:rPr>
+          <w:rFonts w:ascii="Times New Roman" w:hAnsi="Times New Roman" w:eastAsia="Times New Roman"/>
+          <w:b/>
+          <w:sz w:val="22"/>
+        </w:rPr>
+        <w:t xml:space="preserve">5.1. </w:t>
+      </w:r>
+      <w:r>
+        <w:rPr>
+          <w:rFonts w:ascii="Times New Roman" w:hAnsi="Times New Roman" w:eastAsia="Times New Roman"/>
+          <w:sz w:val="22"/>
+        </w:rPr>
+        <w:t>После достижения предусмотренного договором результата Исполнитель направляет Клиенту итоговый документ или уведомление о результате посредством Telegram, WhatsApp или электронной почты.</w:t>
+      </w:r>
+    </w:p>
+    <w:p>
+      <w:pPr>
+        <w:spacing w:before="0" w:after="60" w:line="259" w:lineRule="auto"/>
+        <w:ind w:firstLine="454"/>
+        <w:jc w:val="both"/>
+      </w:pPr>
+      <w:r>
+        <w:rPr>
+          <w:rFonts w:ascii="Times New Roman" w:hAnsi="Times New Roman" w:eastAsia="Times New Roman"/>
+          <w:b/>
+          <w:sz w:val="22"/>
+        </w:rPr>
+        <w:t xml:space="preserve">5.2. </w:t>
+      </w:r>
+      <w:r>
+        <w:rPr>
+          <w:rFonts w:ascii="Times New Roman" w:hAnsi="Times New Roman" w:eastAsia="Times New Roman"/>
+          <w:sz w:val="22"/>
+        </w:rPr>
+        <w:t>Если Клиент в течение 3 (трёх) календарных дней не направит мотивированные письменные возражения с указанием конкретных недостатков, услуги считаются оказанными и принятыми в полном объёме.</w:t>
+      </w:r>
+    </w:p>
+    <w:p>
+      <w:pPr>
+        <w:pStyle w:val="ZESection"/>
+        <w:keepNext/>
+        <w:jc w:val="center"/>
+      </w:pPr>
+      <w:r>
+        <w:rPr>
+          <w:rFonts w:ascii="Times New Roman" w:hAnsi="Times New Roman" w:eastAsia="Times New Roman"/>
+          <w:b/>
+          <w:color w:val="17365D"/>
+          <w:sz w:val="21"/>
+        </w:rPr>
+        <w:t>6. ОТВЕТСТВЕННОСТЬ И РАЗРЕШЕНИЕ СПОРОВ</w:t>
+      </w:r>
+    </w:p>
+    <w:p>
+      <w:pPr>
+        <w:spacing w:before="0" w:after="60" w:line="259" w:lineRule="auto"/>
+        <w:ind w:firstLine="454"/>
+        <w:jc w:val="both"/>
+      </w:pPr>
+      <w:r>
+        <w:rPr>
+          <w:rFonts w:ascii="Times New Roman" w:hAnsi="Times New Roman" w:eastAsia="Times New Roman"/>
+          <w:b/>
+          <w:sz w:val="22"/>
+        </w:rPr>
+        <w:t xml:space="preserve">6.1. </w:t>
+      </w:r>
+      <w:r>
+        <w:rPr>
+          <w:rFonts w:ascii="Times New Roman" w:hAnsi="Times New Roman" w:eastAsia="Times New Roman"/>
+          <w:sz w:val="22"/>
+        </w:rPr>
+        <w:t>Стороны несут ответственность в соответствии с законодательством Республики Казахстан и настоящим договором.</w:t>
+      </w:r>
+    </w:p>
+    <w:p>
+      <w:pPr>
+        <w:spacing w:before="0" w:after="60" w:line="259" w:lineRule="auto"/>
+        <w:ind w:firstLine="454"/>
+        <w:jc w:val="both"/>
+      </w:pPr>
+      <w:r>
+        <w:rPr>
+          <w:rFonts w:ascii="Times New Roman" w:hAnsi="Times New Roman" w:eastAsia="Times New Roman"/>
+          <w:b/>
+          <w:sz w:val="22"/>
+        </w:rPr>
+        <w:t xml:space="preserve">6.2. </w:t>
+      </w:r>
+      <w:r>
+        <w:rPr>
+          <w:rFonts w:ascii="Times New Roman" w:hAnsi="Times New Roman" w:eastAsia="Times New Roman"/>
+          <w:sz w:val="22"/>
+        </w:rPr>
+        <w:t>Исполнитель не отвечает за незаконные либо несвоевременные действия или бездействие нотариуса, ЧСИ, суда, взыскателя, банка и государственных органов, но обязуется подготовить и передать Клиенту предусмотренные договором документы.</w:t>
+      </w:r>
+    </w:p>
+    <w:p>
+      <w:pPr>
+        <w:spacing w:before="0" w:after="60" w:line="259" w:lineRule="auto"/>
+        <w:ind w:firstLine="454"/>
+        <w:jc w:val="both"/>
+      </w:pPr>
+      <w:r>
+        <w:rPr>
+          <w:rFonts w:ascii="Times New Roman" w:hAnsi="Times New Roman" w:eastAsia="Times New Roman"/>
+          <w:b/>
+          <w:sz w:val="22"/>
+        </w:rPr>
+        <w:t xml:space="preserve">6.3. </w:t>
+      </w:r>
+      <w:r>
+        <w:rPr>
+          <w:rFonts w:ascii="Times New Roman" w:hAnsi="Times New Roman" w:eastAsia="Times New Roman"/>
+          <w:sz w:val="22"/>
+        </w:rPr>
+        <w:t>Стороны признают юридическую силу переписки и документов, переданных через WhatsApp, Telegram, SMS, электронную почту и иные согласованные средства связи, если возможно достоверно определить отправителя, содержание и дату сообщения.</w:t>
+      </w:r>
+    </w:p>
+    <w:p>
+      <w:pPr>
+        <w:spacing w:before="0" w:after="60" w:line="259" w:lineRule="auto"/>
+        <w:ind w:firstLine="454"/>
+        <w:jc w:val="both"/>
+      </w:pPr>
+      <w:r>
+        <w:rPr>
+          <w:rFonts w:ascii="Times New Roman" w:hAnsi="Times New Roman" w:eastAsia="Times New Roman"/>
+          <w:b/>
+          <w:sz w:val="22"/>
+        </w:rPr>
+        <w:t xml:space="preserve">6.4. </w:t>
+      </w:r>
+      <w:r>
+        <w:rPr>
+          <w:rFonts w:ascii="Times New Roman" w:hAnsi="Times New Roman" w:eastAsia="Times New Roman"/>
+          <w:sz w:val="22"/>
+        </w:rPr>
+        <w:t>До обращения в суд заинтересованная Сторона направляет письменную претензию. Срок ответа - 5 (пять) рабочих дней с момента её получения. При недостижении соглашения спор рассматривается в установленном законом порядке.</w:t>
+      </w:r>
+    </w:p>
+    <w:p>
+      <w:pPr>
+        <w:pStyle w:val="ZESection"/>
+        <w:keepNext/>
+        <w:jc w:val="center"/>
+      </w:pPr>
+      <w:r>
+        <w:rPr>
+          <w:rFonts w:ascii="Times New Roman" w:hAnsi="Times New Roman" w:eastAsia="Times New Roman"/>
+          <w:b/>
+          <w:color w:val="17365D"/>
+          <w:sz w:val="21"/>
+        </w:rPr>
+        <w:t>7. ПЕРСОНАЛЬНЫЕ ДАННЫЕ И УВЕДОМЛЕНИЯ</w:t>
+      </w:r>
+    </w:p>
+    <w:p>
+      <w:pPr>
+        <w:spacing w:before="0" w:after="60" w:line="259" w:lineRule="auto"/>
+        <w:ind w:firstLine="454"/>
+        <w:jc w:val="both"/>
+      </w:pPr>
+      <w:r>
+        <w:rPr>
+          <w:rFonts w:ascii="Times New Roman" w:hAnsi="Times New Roman" w:eastAsia="Times New Roman"/>
+          <w:b/>
+          <w:sz w:val="22"/>
+        </w:rPr>
+        <w:t xml:space="preserve">7.1. </w:t>
+      </w:r>
+      <w:r>
+        <w:rPr>
+          <w:rFonts w:ascii="Times New Roman" w:hAnsi="Times New Roman" w:eastAsia="Times New Roman"/>
+          <w:sz w:val="22"/>
+        </w:rPr>
+        <w:t>Подписывая настоящий договор, Клиент даёт согласие на сбор и обработку Исполнителем своих персональных данных в объёме, необходимом для исполнения настоящего договора.</w:t>
+      </w:r>
+    </w:p>
+    <w:p>
+      <w:pPr>
+        <w:spacing w:before="0" w:after="60" w:line="259" w:lineRule="auto"/>
+        <w:ind w:firstLine="454"/>
+        <w:jc w:val="both"/>
+      </w:pPr>
+      <w:r>
+        <w:rPr>
+          <w:rFonts w:ascii="Times New Roman" w:hAnsi="Times New Roman" w:eastAsia="Times New Roman"/>
+          <w:b/>
+          <w:sz w:val="22"/>
+        </w:rPr>
+        <w:t xml:space="preserve">7.2. </w:t>
+      </w:r>
+      <w:r>
+        <w:rPr>
+          <w:rFonts w:ascii="Times New Roman" w:hAnsi="Times New Roman" w:eastAsia="Times New Roman"/>
+          <w:sz w:val="22"/>
+        </w:rPr>
+        <w:t>Уведомления направляются по телефону, WhatsApp, Telegram или электронной почте, указанным Сторонами, и считаются полученными в день отправки.</w:t>
+      </w:r>
+    </w:p>
+    <w:p>
+      <w:pPr>
+        <w:pStyle w:val="ZESection"/>
+        <w:keepNext/>
+        <w:jc w:val="center"/>
+      </w:pPr>
+      <w:r>
+        <w:rPr>
+          <w:rFonts w:ascii="Times New Roman" w:hAnsi="Times New Roman" w:eastAsia="Times New Roman"/>
+          <w:b/>
+          <w:color w:val="17365D"/>
+          <w:sz w:val="21"/>
+        </w:rPr>
+        <w:t>8. ЗАКЛЮЧИТЕЛЬНЫЕ ПОЛОЖЕНИЯ</w:t>
+      </w:r>
+    </w:p>
+    <w:p>
+      <w:pPr>
+        <w:spacing w:before="0" w:after="60" w:line="259" w:lineRule="auto"/>
+        <w:ind w:firstLine="454"/>
+        <w:jc w:val="both"/>
+      </w:pPr>
+      <w:r>
+        <w:rPr>
+          <w:rFonts w:ascii="Times New Roman" w:hAnsi="Times New Roman" w:eastAsia="Times New Roman"/>
+          <w:b/>
+          <w:sz w:val="22"/>
+        </w:rPr>
+        <w:t xml:space="preserve">8.1. </w:t>
+      </w:r>
+      <w:r>
+        <w:rPr>
+          <w:rFonts w:ascii="Times New Roman" w:hAnsi="Times New Roman" w:eastAsia="Times New Roman"/>
+          <w:sz w:val="22"/>
+        </w:rPr>
+        <w:t>Настоящий договор вступает в силу с даты его подписания и действует до полного исполнения Сторонами обязательств.</w:t>
+      </w:r>
+    </w:p>
+    <w:p>
+      <w:pPr>
+        <w:spacing w:before="0" w:after="60" w:line="259" w:lineRule="auto"/>
+        <w:ind w:firstLine="454"/>
+        <w:jc w:val="both"/>
+      </w:pPr>
+      <w:r>
+        <w:rPr>
+          <w:rFonts w:ascii="Times New Roman" w:hAnsi="Times New Roman" w:eastAsia="Times New Roman"/>
+          <w:b/>
+          <w:sz w:val="22"/>
+        </w:rPr>
+        <w:t xml:space="preserve">8.2. </w:t>
+      </w:r>
+      <w:r>
+        <w:rPr>
+          <w:rFonts w:ascii="Times New Roman" w:hAnsi="Times New Roman" w:eastAsia="Times New Roman"/>
+          <w:sz w:val="22"/>
+        </w:rPr>
+        <w:t>Изменения и дополнения действительны при письменном согласовании Сторонами, включая согласование через WhatsApp, Telegram или электронную переписку.</w:t>
+      </w:r>
+    </w:p>
+    <w:p>
+      <w:pPr>
+        <w:spacing w:before="0" w:after="60" w:line="259" w:lineRule="auto"/>
+        <w:ind w:firstLine="454"/>
+        <w:jc w:val="both"/>
+      </w:pPr>
+      <w:r>
+        <w:rPr>
+          <w:rFonts w:ascii="Times New Roman" w:hAnsi="Times New Roman" w:eastAsia="Times New Roman"/>
+          <w:b/>
+          <w:sz w:val="22"/>
+        </w:rPr>
+        <w:t xml:space="preserve">8.3. </w:t>
+      </w:r>
+      <w:r>
+        <w:rPr>
+          <w:rFonts w:ascii="Times New Roman" w:hAnsi="Times New Roman" w:eastAsia="Times New Roman"/>
+          <w:sz w:val="22"/>
+        </w:rPr>
+        <w:t>Договор составлен в двух экземплярах, имеющих одинаковую юридическую силу, либо подписан посредством простой электронной подписи Клиента.</w:t>
+      </w:r>
+    </w:p>
+    <w:p>
+      <w:r>
+        <w:br w:type="page"/>
+      </w:r>
+    </w:p>
+    <w:p>
+      <w:pPr>
+        <w:pStyle w:val="ZESection"/>
+        <w:keepNext/>
+        <w:jc w:val="center"/>
+      </w:pPr>
+      <w:r>
+        <w:rPr>
+          <w:rFonts w:ascii="Times New Roman" w:hAnsi="Times New Roman" w:eastAsia="Times New Roman"/>
+          <w:b/>
+          <w:color w:val="17365D"/>
+          <w:sz w:val="21"/>
         </w:rPr>
         <w:t>9. РЕКВИЗИТЫ И ПОДПИСИ СТОРОН</w:t>
       </w:r>
     </w:p>
     <w:tbl>
       <w:tblPr>
-        <w:tblW w:type="auto" w:w="0"/>
+        <w:tblW w:type="dxa" w:w="9865"/>
         <w:jc w:val="center"/>
-        <w:tblLayout w:type="autofit"/>
+        <w:tblLayout w:type="fixed"/>
         <w:tblLook w:firstColumn="1" w:firstRow="1" w:lastColumn="0" w:lastRow="0" w:noHBand="0" w:noVBand="1" w:val="04A0"/>
+        <w:tblInd w:w="0" w:type="dxa"/>
+        <w:tblBorders>
+          <w:top w:val="single" w:sz="6" w:space="0" w:color="B8C4D1"/>
+          <w:left w:val="single" w:sz="6" w:space="0" w:color="B8C4D1"/>
+          <w:bottom w:val="single" w:sz="6" w:space="0" w:color="B8C4D1"/>
+          <w:right w:val="single" w:sz="6" w:space="0" w:color="B8C4D1"/>
+          <w:insideH w:val="single" w:sz="6" w:space="0" w:color="B8C4D1"/>
+          <w:insideV w:val="single" w:sz="6" w:space="0" w:color="B8C4D1"/>
+        </w:tblBorders>
       </w:tblPr>
       <w:tblGrid>
-        <w:gridCol w:w="4819"/>
-        <w:gridCol w:w="4819"/>
+        <w:gridCol w:w="4932"/>
+        <w:gridCol w:w="4933"/>
       </w:tblGrid>
       <w:tr>
+        <w:trPr>
+          <w:tblHeader w:val="true"/>
+        </w:trPr>
         <w:tc>
           <w:tcPr>
-            <w:tcW w:type="dxa" w:w="4961"/>
+            <w:tcW w:type="dxa" w:w="4932"/>
+            <w:tcMar>
+              <w:top w:w="80" w:type="dxa"/>
+              <w:start w:w="120" w:type="dxa"/>
+              <w:bottom w:w="80" w:type="dxa"/>
+              <w:end w:w="120" w:type="dxa"/>
+            </w:tcMar>
+            <w:shd w:fill="EAF0F7"/>
           </w:tcPr>
           <w:p>
+            <w:pPr>
+              <w:jc w:val="center"/>
+            </w:pPr>
             <w:r>
               <w:rPr>
+                <w:rFonts w:ascii="Times New Roman" w:hAnsi="Times New Roman" w:eastAsia="Times New Roman"/>
                 <w:b/>
+                <w:color w:val="17365D"/>
+                <w:sz w:val="20"/>
               </w:rPr>
               <w:t>ИСПОЛНИТЕЛЬ</w:t>
             </w:r>
@@ -553,12 +869,25 @@
         </w:tc>
         <w:tc>
           <w:tcPr>
-            <w:tcW w:type="dxa" w:w="4961"/>
+            <w:tcW w:type="dxa" w:w="4933"/>
+            <w:tcMar>
+              <w:top w:w="80" w:type="dxa"/>
+              <w:start w:w="120" w:type="dxa"/>
+              <w:bottom w:w="80" w:type="dxa"/>
+              <w:end w:w="120" w:type="dxa"/>
+            </w:tcMar>
+            <w:shd w:fill="EAF0F7"/>
           </w:tcPr>
           <w:p>
+            <w:pPr>
+              <w:jc w:val="center"/>
+            </w:pPr>
             <w:r>
               <w:rPr>
+                <w:rFonts w:ascii="Times New Roman" w:hAnsi="Times New Roman" w:eastAsia="Times New Roman"/>
                 <w:b/>
+                <w:color w:val="17365D"/>
+                <w:sz w:val="20"/>
               </w:rPr>
               <w:t>КЛИЕНТ</w:t>
             </w:r>
@@ -568,108 +897,430 @@
       <w:tr>
         <w:tc>
           <w:tcPr>
-            <w:tcW w:type="dxa" w:w="4819"/>
+            <w:tcW w:type="dxa" w:w="4932"/>
+            <w:tcMar>
+              <w:top w:w="80" w:type="dxa"/>
+              <w:start w:w="120" w:type="dxa"/>
+              <w:bottom w:w="80" w:type="dxa"/>
+              <w:end w:w="120" w:type="dxa"/>
+            </w:tcMar>
+            <w:vAlign w:val="top"/>
           </w:tcPr>
           <w:p>
+            <w:pPr>
+              <w:keepLines/>
+              <w:spacing w:after="0" w:line="252" w:lineRule="auto"/>
+            </w:pPr>
             <w:r>
+              <w:rPr>
+                <w:rFonts w:ascii="Times New Roman" w:hAnsi="Times New Roman" w:eastAsia="Times New Roman"/>
+                <w:b/>
+                <w:sz w:val="19"/>
+              </w:rPr>
               <w:t>{{ executor_brand_name }}</w:t>
+            </w:r>
+            <w:r>
               <w:br/>
+            </w:r>
+            <w:r>
+              <w:rPr>
+                <w:rFonts w:ascii="Times New Roman" w:hAnsi="Times New Roman" w:eastAsia="Times New Roman"/>
+                <w:b w:val="0"/>
+                <w:sz w:val="19"/>
+              </w:rPr>
               <w:t>{{ executor_full_name }}</w:t>
+            </w:r>
+            <w:r>
               <w:br/>
-              <w:t>ИИН: {{ executor_iin }}</w:t>
+            </w:r>
+            <w:r>
+              <w:rPr>
+                <w:rFonts w:ascii="Times New Roman" w:hAnsi="Times New Roman" w:eastAsia="Times New Roman"/>
+                <w:b w:val="0"/>
+                <w:sz w:val="19"/>
+              </w:rPr>
+              <w:t>{{ executor_identifier_label }}: {{ executor_identifier }}</w:t>
+            </w:r>
+            <w:r>
               <w:br/>
+            </w:r>
+            <w:r>
+              <w:rPr>
+                <w:rFonts w:ascii="Times New Roman" w:hAnsi="Times New Roman" w:eastAsia="Times New Roman"/>
+                <w:b w:val="0"/>
+                <w:sz w:val="19"/>
+              </w:rPr>
+              <w:t>Руководитель: {{ executor_director_name }}</w:t>
+            </w:r>
+            <w:r>
+              <w:br/>
+            </w:r>
+            <w:r>
+              <w:rPr>
+                <w:rFonts w:ascii="Times New Roman" w:hAnsi="Times New Roman" w:eastAsia="Times New Roman"/>
+                <w:b w:val="0"/>
+                <w:sz w:val="19"/>
+              </w:rPr>
               <w:t>Адрес: {{ executor_address }}</w:t>
+            </w:r>
+            <w:r>
               <w:br/>
+            </w:r>
+            <w:r>
+              <w:rPr>
+                <w:rFonts w:ascii="Times New Roman" w:hAnsi="Times New Roman" w:eastAsia="Times New Roman"/>
+                <w:b w:val="0"/>
+                <w:sz w:val="19"/>
+              </w:rPr>
               <w:t>Тел./WhatsApp: {{ executor_phone }}</w:t>
-              <w:br/>
-              <w:t>Kaspi: {{ executor_phone }}</w:t>
             </w:r>
           </w:p>
         </w:tc>
         <w:tc>
           <w:tcPr>
-            <w:tcW w:type="dxa" w:w="4819"/>
+            <w:tcW w:type="dxa" w:w="4933"/>
+            <w:tcMar>
+              <w:top w:w="80" w:type="dxa"/>
+              <w:start w:w="120" w:type="dxa"/>
+              <w:bottom w:w="80" w:type="dxa"/>
+              <w:end w:w="120" w:type="dxa"/>
+            </w:tcMar>
+            <w:vAlign w:val="top"/>
           </w:tcPr>
           <w:p>
+            <w:pPr>
+              <w:keepLines/>
+              <w:spacing w:after="0" w:line="252" w:lineRule="auto"/>
+            </w:pPr>
             <w:r>
+              <w:rPr>
+                <w:rFonts w:ascii="Times New Roman" w:hAnsi="Times New Roman" w:eastAsia="Times New Roman"/>
+                <w:b/>
+                <w:sz w:val="19"/>
+              </w:rPr>
               <w:t>{{ client_full_name }}</w:t>
+            </w:r>
+            <w:r>
               <w:br/>
+            </w:r>
+            <w:r>
+              <w:rPr>
+                <w:rFonts w:ascii="Times New Roman" w:hAnsi="Times New Roman" w:eastAsia="Times New Roman"/>
+                <w:b w:val="0"/>
+                <w:sz w:val="19"/>
+              </w:rPr>
               <w:t>ИИН: {{ client_iin }}</w:t>
+            </w:r>
+            <w:r>
               <w:br/>
+            </w:r>
+            <w:r>
+              <w:rPr>
+                <w:rFonts w:ascii="Times New Roman" w:hAnsi="Times New Roman" w:eastAsia="Times New Roman"/>
+                <w:b w:val="0"/>
+                <w:sz w:val="19"/>
+              </w:rPr>
               <w:t>Телефон/WhatsApp: {{ client_phone }}</w:t>
+            </w:r>
+            <w:r>
               <w:br/>
+            </w:r>
+            <w:r>
+              <w:rPr>
+                <w:rFonts w:ascii="Times New Roman" w:hAnsi="Times New Roman" w:eastAsia="Times New Roman"/>
+                <w:b w:val="0"/>
+                <w:sz w:val="19"/>
+              </w:rPr>
               <w:t>Адрес: {{ client_address }}</w:t>
             </w:r>
           </w:p>
         </w:tc>
       </w:tr>
     </w:tbl>
-    <w:p/>
-    <w:p/>
-    <w:p/>
+    <w:p>
+      <w:pPr>
+        <w:spacing w:after="60"/>
+      </w:pPr>
+    </w:p>
     <w:tbl>
       <w:tblPr>
-        <w:tblW w:type="auto" w:w="0"/>
+        <w:tblW w:type="dxa" w:w="9865"/>
         <w:jc w:val="center"/>
+        <w:tblLayout w:type="fixed"/>
         <w:tblLook w:firstColumn="1" w:firstRow="1" w:lastColumn="0" w:lastRow="0" w:noHBand="0" w:noVBand="1" w:val="04A0"/>
+        <w:tblInd w:w="0" w:type="dxa"/>
+        <w:tblBorders>
+          <w:top w:val="single" w:sz="6" w:space="0" w:color="B8C4D1"/>
+          <w:left w:val="single" w:sz="6" w:space="0" w:color="B8C4D1"/>
+          <w:bottom w:val="single" w:sz="6" w:space="0" w:color="B8C4D1"/>
+          <w:right w:val="single" w:sz="6" w:space="0" w:color="B8C4D1"/>
+          <w:insideH w:val="single" w:sz="6" w:space="0" w:color="B8C4D1"/>
+          <w:insideV w:val="single" w:sz="6" w:space="0" w:color="B8C4D1"/>
+        </w:tblBorders>
       </w:tblPr>
       <w:tblGrid>
-        <w:gridCol w:w="4819"/>
-        <w:gridCol w:w="4819"/>
+        <w:gridCol w:w="4932"/>
+        <w:gridCol w:w="4933"/>
       </w:tblGrid>
       <w:tr>
         <w:tc>
           <w:tcPr>
-            <w:tcW w:type="dxa" w:w="4961"/>
+            <w:tcW w:type="dxa" w:w="4932"/>
+            <w:tcMar>
+              <w:top w:w="80" w:type="dxa"/>
+              <w:start w:w="120" w:type="dxa"/>
+              <w:bottom w:w="80" w:type="dxa"/>
+              <w:end w:w="120" w:type="dxa"/>
+            </w:tcMar>
+            <w:shd w:fill="EAF0F7"/>
           </w:tcPr>
           <w:p>
+            <w:pPr>
+              <w:jc w:val="center"/>
+            </w:pPr>
             <w:r>
               <w:rPr>
-                <w:sz w:val="22"/>
+                <w:rFonts w:ascii="Times New Roman" w:hAnsi="Times New Roman" w:eastAsia="Times New Roman"/>
+                <w:b/>
+                <w:color w:val="17365D"/>
+                <w:sz w:val="19"/>
               </w:rPr>
-              <w:t>Подпись: {{ executor_signature }}</w:t>
-              <w:br/>
-            </w:r>
-            <w:r>
-              <w:t>М.П.: {{ executor_stamp }}</w:t>
+              <w:t>ПОДПИСЬ И ПЕЧАТЬ ИСПОЛНИТЕЛЯ</w:t>
             </w:r>
           </w:p>
         </w:tc>
         <w:tc>
           <w:tcPr>
-            <w:tcW w:type="dxa" w:w="4961"/>
+            <w:tcW w:type="dxa" w:w="4933"/>
+            <w:tcMar>
+              <w:top w:w="80" w:type="dxa"/>
+              <w:start w:w="120" w:type="dxa"/>
+              <w:bottom w:w="80" w:type="dxa"/>
+              <w:end w:w="120" w:type="dxa"/>
+            </w:tcMar>
+            <w:shd w:fill="EAF0F7"/>
           </w:tcPr>
           <w:p>
+            <w:pPr>
+              <w:jc w:val="center"/>
+            </w:pPr>
             <w:r>
               <w:rPr>
-                <w:sz w:val="22"/>
+                <w:rFonts w:ascii="Times New Roman" w:hAnsi="Times New Roman" w:eastAsia="Times New Roman"/>
+                <w:b/>
+                <w:color w:val="17365D"/>
+                <w:sz w:val="19"/>
               </w:rPr>
-              <w:t>Подпись (простая электронная подпись): {{ client_signature }}</w:t>
+              <w:t>ПОДПИСЬ КЛИЕНТА</w:t>
+            </w:r>
+          </w:p>
+        </w:tc>
+      </w:tr>
+      <w:tr>
+        <w:tc>
+          <w:tcPr>
+            <w:tcW w:type="dxa" w:w="4932"/>
+            <w:tcMar>
+              <w:top w:w="140" w:type="dxa"/>
+              <w:start w:w="140" w:type="dxa"/>
+              <w:bottom w:w="140" w:type="dxa"/>
+              <w:end w:w="140" w:type="dxa"/>
+            </w:tcMar>
+            <w:vAlign w:val="center"/>
+          </w:tcPr>
+          <w:p>
+            <w:pPr>
+              <w:keepLines/>
+              <w:spacing w:after="60"/>
+              <w:jc w:val="left"/>
+            </w:pPr>
+            <w:r>
+              <w:rPr>
+                <w:rFonts w:ascii="Times New Roman" w:hAnsi="Times New Roman" w:eastAsia="Times New Roman"/>
+                <w:b/>
+                <w:sz w:val="19"/>
+              </w:rPr>
+              <w:t>Руководитель</w:t>
+            </w:r>
+          </w:p>
+          <w:tbl>
+            <w:tblPr>
+              <w:tblW w:type="dxa" w:w="4652"/>
+              <w:jc w:val="center"/>
+              <w:tblLayout w:type="fixed"/>
+              <w:tblLook w:firstColumn="1" w:firstRow="1" w:lastColumn="0" w:lastRow="0" w:noHBand="0" w:noVBand="1" w:val="04A0"/>
+              <w:tblInd w:w="0" w:type="dxa"/>
+              <w:tblBorders>
+                <w:top w:val="nil"/>
+                <w:left w:val="nil"/>
+                <w:bottom w:val="nil"/>
+                <w:right w:val="nil"/>
+                <w:insideH w:val="nil"/>
+                <w:insideV w:val="nil"/>
+              </w:tblBorders>
+            </w:tblPr>
+            <w:tblGrid>
+              <w:gridCol w:w="2326"/>
+              <w:gridCol w:w="2326"/>
+            </w:tblGrid>
+            <w:tr>
+              <w:tc>
+                <w:tcPr>
+                  <w:tcW w:type="dxa" w:w="2326"/>
+                  <w:tcMar>
+                    <w:top w:w="80" w:type="dxa"/>
+                    <w:start w:w="120" w:type="dxa"/>
+                    <w:bottom w:w="80" w:type="dxa"/>
+                    <w:end w:w="120" w:type="dxa"/>
+                  </w:tcMar>
+                </w:tcPr>
+                <w:p>
+                  <w:pPr>
+                    <w:spacing w:after="0"/>
+                    <w:jc w:val="center"/>
+                  </w:pPr>
+                  <w:r>
+                    <w:t>{{ executor_signature }}</w:t>
+                  </w:r>
+                </w:p>
+              </w:tc>
+              <w:tc>
+                <w:tcPr>
+                  <w:tcW w:type="dxa" w:w="2326"/>
+                  <w:tcMar>
+                    <w:top w:w="80" w:type="dxa"/>
+                    <w:start w:w="120" w:type="dxa"/>
+                    <w:bottom w:w="80" w:type="dxa"/>
+                    <w:end w:w="120" w:type="dxa"/>
+                  </w:tcMar>
+                </w:tcPr>
+                <w:p>
+                  <w:pPr>
+                    <w:spacing w:after="0"/>
+                    <w:jc w:val="center"/>
+                  </w:pPr>
+                  <w:r>
+                    <w:t>{{ executor_stamp }}</w:t>
+                  </w:r>
+                </w:p>
+              </w:tc>
+            </w:tr>
+          </w:tbl>
+          <w:p>
+            <w:pPr>
+              <w:keepLines/>
+            </w:pPr>
+          </w:p>
+          <w:p>
+            <w:pPr>
+              <w:keepLines/>
+              <w:spacing w:before="0" w:after="0"/>
+              <w:jc w:val="center"/>
+            </w:pPr>
+            <w:r>
+              <w:rPr>
+                <w:rFonts w:ascii="Times New Roman" w:hAnsi="Times New Roman" w:eastAsia="Times New Roman"/>
+                <w:sz w:val="19"/>
+              </w:rPr>
+              <w:t>________________ / {{ executor_signer_short_name }} /</w:t>
+            </w:r>
+          </w:p>
+        </w:tc>
+        <w:tc>
+          <w:tcPr>
+            <w:tcW w:type="dxa" w:w="4933"/>
+            <w:tcMar>
+              <w:top w:w="140" w:type="dxa"/>
+              <w:start w:w="140" w:type="dxa"/>
+              <w:bottom w:w="140" w:type="dxa"/>
+              <w:end w:w="140" w:type="dxa"/>
+            </w:tcMar>
+            <w:vAlign w:val="top"/>
+          </w:tcPr>
+          <w:p>
+            <w:pPr>
+              <w:keepLines/>
+              <w:spacing w:after="80"/>
+            </w:pPr>
+            <w:r>
+              <w:rPr>
+                <w:rFonts w:ascii="Times New Roman" w:hAnsi="Times New Roman" w:eastAsia="Times New Roman"/>
+                <w:b/>
+                <w:sz w:val="19"/>
+              </w:rPr>
+              <w:t>Подпись Клиента:</w:t>
+            </w:r>
+          </w:p>
+          <w:p>
+            <w:pPr>
+              <w:keepLines/>
+              <w:spacing w:before="0" w:after="0" w:line="240" w:lineRule="auto"/>
+            </w:pPr>
+            <w:r>
+              <w:rPr>
+                <w:rFonts w:ascii="Times New Roman" w:hAnsi="Times New Roman" w:eastAsia="Times New Roman"/>
+                <w:sz w:val="19"/>
+              </w:rPr>
+              <w:t>{{ client_signature }}</w:t>
+            </w:r>
+            <w:r>
+              <w:rPr>
+                <w:rFonts w:ascii="Times New Roman" w:hAnsi="Times New Roman" w:eastAsia="Times New Roman"/>
+                <w:sz w:val="19"/>
+              </w:rPr>
               <w:br/>
               <w:br/>
+            </w:r>
+          </w:p>
+          <w:p>
+            <w:pPr>
+              <w:keepLines/>
+              <w:spacing w:before="0" w:after="100"/>
+            </w:pPr>
+            <w:r>
+              <w:rPr>
+                <w:rFonts w:ascii="Times New Roman" w:hAnsi="Times New Roman" w:eastAsia="Times New Roman"/>
+                <w:sz w:val="19"/>
+              </w:rPr>
+              <w:t>________________ / {{ client_full_name }} /</w:t>
+            </w:r>
+          </w:p>
+          <w:p>
+            <w:pPr>
+              <w:keepLines/>
+              <w:spacing w:before="0" w:after="0"/>
+            </w:pPr>
+            <w:r>
+              <w:rPr>
+                <w:rFonts w:ascii="Times New Roman" w:hAnsi="Times New Roman" w:eastAsia="Times New Roman"/>
+                <w:sz w:val="19"/>
+              </w:rPr>
               <w:t>Дата подписания: {{ client_signature_date }}</w:t>
             </w:r>
           </w:p>
         </w:tc>
       </w:tr>
     </w:tbl>
-    <w:p/>
     <w:p>
       <w:pPr>
+        <w:spacing w:before="120" w:after="0"/>
         <w:jc w:val="center"/>
       </w:pPr>
       <w:r>
         <w:rPr>
+          <w:rFonts w:ascii="Times New Roman" w:hAnsi="Times New Roman" w:eastAsia="Times New Roman"/>
           <w:i/>
-          <w:sz w:val="18"/>
+          <w:color w:val="667085"/>
+          <w:sz w:val="17"/>
         </w:rPr>
-        <w:t>Простая электронная подпись Клиента фиксируется системой ZakonExpert Bot с указанием даты, времени, IP-адреса и хеша документа и не является усиленной квалифицированной электронной подписью (ЭЦП).</w:t>
+        <w:t>Простая электронная подпись Клиента фиксируется системой ZakonExpert Bot с указанием даты, времени, IP-адреса и хеша документа.</w:t>
       </w:r>
     </w:p>
     <w:sectPr>
-      <w:footerReference w:type="default" r:id="rId9"/>
+      <w:headerReference w:type="default" r:id="rId9"/>
+      <w:footerReference w:type="default" r:id="rId10"/>
       <w:pgSz w:w="11906" w:h="16838"/>
-      <w:pgMar w:top="1134" w:right="850" w:bottom="1134" w:left="1134" w:header="720" w:footer="720" w:gutter="0"/>
+      <w:pgMar w:top="1020" w:right="1020" w:bottom="1020" w:left="1020" w:header="397" w:footer="510" w:gutter="0"/>
       <w:cols w:space="720"/>
       <w:docGrid w:linePitch="360"/>
     </w:sectPr>
@@ -682,15 +1333,98 @@
   <w:p>
     <w:pPr>
       <w:pStyle w:val="Footer"/>
+      <w:spacing w:before="0"/>
       <w:jc w:val="center"/>
     </w:pPr>
     <w:r>
-      <w:fldChar w:fldCharType="begin"/>
-      <w:instrText xml:space="preserve">PAGE</w:instrText>
-      <w:fldChar w:fldCharType="end"/>
+      <w:rPr>
+        <w:rFonts w:ascii="Times New Roman" w:hAnsi="Times New Roman" w:eastAsia="Times New Roman"/>
+        <w:color w:val="667085"/>
+        <w:sz w:val="16"/>
+      </w:rPr>
+      <w:t>ТОО «ZakonExpert» | {{ executor_phone }} | zakonexpertt.kz</w:t>
     </w:r>
   </w:p>
 </w:ftr>
+</file>
+
+<file path=word/header1.xml><?xml version="1.0" encoding="utf-8"?>
+<w:hdr xmlns:m="http://schemas.openxmlformats.org/officeDocument/2006/math" xmlns:mc="http://schemas.openxmlformats.org/markup-compatibility/2006" xmlns:mo="http://schemas.microsoft.com/office/mac/office/2008/main" xmlns:mv="urn:schemas-microsoft-com:mac:vml" xmlns:o="urn:schemas-microsoft-com:office:office" xmlns:r="http://schemas.openxmlformats.org/officeDocument/2006/relationships" xmlns:v="urn:schemas-microsoft-com:vml" xmlns:w10="urn:schemas-microsoft-com:office:word" xmlns:w14="http://schemas.microsoft.com/office/word/2010/wordml" xmlns:w="http://schemas.openxmlformats.org/wordprocessingml/2006/main" xmlns:wne="http://schemas.microsoft.com/office/word/2006/wordml" xmlns:wp14="http://schemas.microsoft.com/office/word/2010/wordprocessingDrawing" xmlns:wp="http://schemas.openxmlformats.org/drawingml/2006/wordprocessingDrawing" xmlns:wpc="http://schemas.microsoft.com/office/word/2010/wordprocessingCanvas" xmlns:wpg="http://schemas.microsoft.com/office/word/2010/wordprocessingGroup" xmlns:wpi="http://schemas.microsoft.com/office/word/2010/wordprocessingInk" xmlns:wps="http://schemas.microsoft.com/office/word/2010/wordprocessingShape" mc:Ignorable="w14 wp14">
+  <w:p>
+    <w:pPr>
+      <w:pStyle w:val="Header"/>
+    </w:pPr>
+  </w:p>
+  <w:tbl>
+    <w:tblPr>
+      <w:tblW w:type="dxa" w:w="9865"/>
+      <w:jc w:val="center"/>
+      <w:tblLayout w:type="fixed"/>
+      <w:tblLook w:firstColumn="1" w:firstRow="1" w:lastColumn="0" w:lastRow="0" w:noHBand="0" w:noVBand="1" w:val="04A0"/>
+      <w:tblInd w:w="0" w:type="dxa"/>
+      <w:tblBorders>
+        <w:top w:val="nil"/>
+        <w:left w:val="nil"/>
+        <w:bottom w:val="nil"/>
+        <w:right w:val="nil"/>
+        <w:insideH w:val="nil"/>
+        <w:insideV w:val="nil"/>
+      </w:tblBorders>
+    </w:tblPr>
+    <w:tblGrid>
+      <w:gridCol w:w="4932"/>
+      <w:gridCol w:w="4933"/>
+    </w:tblGrid>
+    <w:tr>
+      <w:tc>
+        <w:tcPr>
+          <w:tcW w:type="dxa" w:w="4932"/>
+          <w:tcMar>
+            <w:top w:w="80" w:type="dxa"/>
+            <w:start w:w="120" w:type="dxa"/>
+            <w:bottom w:w="80" w:type="dxa"/>
+            <w:end w:w="120" w:type="dxa"/>
+          </w:tcMar>
+        </w:tcPr>
+        <w:p>
+          <w:r>
+            <w:rPr>
+              <w:rFonts w:ascii="Times New Roman" w:hAnsi="Times New Roman" w:eastAsia="Times New Roman"/>
+              <w:b/>
+              <w:color w:val="17365D"/>
+              <w:sz w:val="17"/>
+            </w:rPr>
+            <w:t>ZAKONEXPERT</w:t>
+          </w:r>
+        </w:p>
+      </w:tc>
+      <w:tc>
+        <w:tcPr>
+          <w:tcW w:type="dxa" w:w="4933"/>
+          <w:tcMar>
+            <w:top w:w="80" w:type="dxa"/>
+            <w:start w:w="120" w:type="dxa"/>
+            <w:bottom w:w="80" w:type="dxa"/>
+            <w:end w:w="120" w:type="dxa"/>
+          </w:tcMar>
+        </w:tcPr>
+        <w:p>
+          <w:pPr>
+            <w:jc w:val="right"/>
+          </w:pPr>
+          <w:r>
+            <w:rPr>
+              <w:rFonts w:ascii="Times New Roman" w:hAnsi="Times New Roman" w:eastAsia="Times New Roman"/>
+              <w:color w:val="667085"/>
+              <w:sz w:val="17"/>
+            </w:rPr>
+            <w:t>Договор оказания услуг № {{ contract_number }}</w:t>
+          </w:r>
+        </w:p>
+      </w:tc>
+    </w:tr>
+  </w:tbl>
+</w:hdr>
 </file>
 
 <file path=word/numbering.xml><?xml version="1.0" encoding="utf-8"?>
@@ -1056,9 +1790,12 @@
     <w:name w:val="Normal"/>
     <w:qFormat/>
     <w:rsid w:val="00FC693F"/>
+    <w:pPr>
+      <w:spacing w:before="0" w:after="60" w:line="259" w:lineRule="auto"/>
+    </w:pPr>
     <w:rPr>
       <w:rFonts w:ascii="Times New Roman" w:hAnsi="Times New Roman" w:eastAsia="Times New Roman"/>
-      <w:sz w:val="24"/>
+      <w:sz w:val="22"/>
     </w:rPr>
   </w:style>
   <w:style w:type="paragraph" w:styleId="Header">
@@ -12742,6 +13479,20 @@
         <w:shd w:val="clear" w:color="auto" w:fill="FBCAA2" w:themeFill="accent6" w:themeFillTint="7F"/>
       </w:tcPr>
     </w:tblStylePr>
+  </w:style>
+  <w:style w:type="paragraph" w:customStyle="1" w:styleId="ZESection">
+    <w:name w:val="ZE Section"/>
+    <w:basedOn w:val="Normal"/>
+    <w:pPr>
+      <w:keepNext/>
+      <w:spacing w:before="180" w:after="80"/>
+    </w:pPr>
+    <w:rPr>
+      <w:rFonts w:ascii="Times New Roman" w:hAnsi="Times New Roman"/>
+      <w:b/>
+      <w:color w:val="17365D"/>
+      <w:sz w:val="21"/>
+    </w:rPr>
   </w:style>
 </w:styles>
 </file>

</xml_diff>

<commit_message>
Compose realistic signature and seal block
</commit_message>
<xml_diff>
--- a/app/templates/contracts/master_v1.docx
+++ b/app/templates/contracts/master_v1.docx
@@ -1143,86 +1143,14 @@
               <w:t>Руководитель</w:t>
             </w:r>
           </w:p>
-          <w:tbl>
-            <w:tblPr>
-              <w:tblW w:type="dxa" w:w="4652"/>
-              <w:jc w:val="center"/>
-              <w:tblLayout w:type="fixed"/>
-              <w:tblLook w:firstColumn="1" w:firstRow="1" w:lastColumn="0" w:lastRow="0" w:noHBand="0" w:noVBand="1" w:val="04A0"/>
-              <w:tblInd w:w="0" w:type="dxa"/>
-              <w:tblBorders>
-                <w:top w:val="nil"/>
-                <w:left w:val="nil"/>
-                <w:bottom w:val="nil"/>
-                <w:right w:val="nil"/>
-                <w:insideH w:val="nil"/>
-                <w:insideV w:val="nil"/>
-              </w:tblBorders>
-            </w:tblPr>
-            <w:tblGrid>
-              <w:gridCol w:w="2326"/>
-              <w:gridCol w:w="2326"/>
-            </w:tblGrid>
-            <w:tr>
-              <w:tc>
-                <w:tcPr>
-                  <w:tcW w:type="dxa" w:w="2326"/>
-                  <w:tcMar>
-                    <w:top w:w="80" w:type="dxa"/>
-                    <w:start w:w="120" w:type="dxa"/>
-                    <w:bottom w:w="80" w:type="dxa"/>
-                    <w:end w:w="120" w:type="dxa"/>
-                  </w:tcMar>
-                </w:tcPr>
-                <w:p>
-                  <w:pPr>
-                    <w:spacing w:after="0"/>
-                    <w:jc w:val="center"/>
-                  </w:pPr>
-                  <w:r>
-                    <w:t>{{ executor_signature }}</w:t>
-                  </w:r>
-                </w:p>
-              </w:tc>
-              <w:tc>
-                <w:tcPr>
-                  <w:tcW w:type="dxa" w:w="2326"/>
-                  <w:tcMar>
-                    <w:top w:w="80" w:type="dxa"/>
-                    <w:start w:w="120" w:type="dxa"/>
-                    <w:bottom w:w="80" w:type="dxa"/>
-                    <w:end w:w="120" w:type="dxa"/>
-                  </w:tcMar>
-                </w:tcPr>
-                <w:p>
-                  <w:pPr>
-                    <w:spacing w:after="0"/>
-                    <w:jc w:val="center"/>
-                  </w:pPr>
-                  <w:r>
-                    <w:t>{{ executor_stamp }}</w:t>
-                  </w:r>
-                </w:p>
-              </w:tc>
-            </w:tr>
-          </w:tbl>
           <w:p>
             <w:pPr>
               <w:keepLines/>
-            </w:pPr>
-          </w:p>
-          <w:p>
-            <w:pPr>
-              <w:keepLines/>
-              <w:spacing w:before="0" w:after="0"/>
+              <w:spacing w:before="0" w:after="0" w:line="240" w:lineRule="auto"/>
               <w:jc w:val="center"/>
             </w:pPr>
             <w:r>
-              <w:rPr>
-                <w:rFonts w:ascii="Times New Roman" w:hAnsi="Times New Roman" w:eastAsia="Times New Roman"/>
-                <w:sz w:val="19"/>
-              </w:rPr>
-              <w:t>________________ / {{ executor_signer_short_name }} /</w:t>
+              <w:t>{{ executor_signature_block }}</w:t>
             </w:r>
           </w:p>
         </w:tc>

</xml_diff>

<commit_message>
Remove the "simple e-signature is recorded" footer note from the contract
Redundant boilerplate under the signature block; the actual audit data
(date, time, IP, document hash) is still captured by signing_service on
signing, just no longer restated as a line of text in the document itself.
</commit_message>
<xml_diff>
--- a/app/templates/contracts/master_v1.docx
+++ b/app/templates/contracts/master_v1.docx
@@ -1229,21 +1229,6 @@
         </w:tc>
       </w:tr>
     </w:tbl>
-    <w:p>
-      <w:pPr>
-        <w:spacing w:before="120" w:after="0"/>
-        <w:jc w:val="center"/>
-      </w:pPr>
-      <w:r>
-        <w:rPr>
-          <w:rFonts w:ascii="Times New Roman" w:hAnsi="Times New Roman" w:eastAsia="Times New Roman"/>
-          <w:i/>
-          <w:color w:val="667085"/>
-          <w:sz w:val="17"/>
-        </w:rPr>
-        <w:t>Простая электронная подпись Клиента фиксируется системой ZakonExpert Bot с указанием даты, времени, IP-адреса и хеша документа.</w:t>
-      </w:r>
-    </w:p>
     <w:sectPr>
       <w:headerReference w:type="default" r:id="rId9"/>
       <w:footerReference w:type="default" r:id="rId10"/>

</xml_diff>

<commit_message>
Render section headings/titles in black instead of navy
Body text was already black; section titles, the letterhead/footer
brand line and table headers were still navy. Per explicit feedback,
drop the accent color entirely so the whole document is plain black.
</commit_message>
<xml_diff>
--- a/app/templates/contracts/master_v1.docx
+++ b/app/templates/contracts/master_v1.docx
@@ -11,7 +11,7 @@
         <w:rPr>
           <w:rFonts w:ascii="Times New Roman" w:hAnsi="Times New Roman" w:eastAsia="Times New Roman"/>
           <w:b/>
-          <w:color w:val="17365D"/>
+          <w:color w:val="000000"/>
           <w:sz w:val="30"/>
         </w:rPr>
         <w:t>ДОГОВОР ОКАЗАНИЯ УСЛУГ</w:t>
@@ -123,7 +123,7 @@
         <w:rPr>
           <w:rFonts w:ascii="Times New Roman" w:hAnsi="Times New Roman" w:eastAsia="Times New Roman"/>
           <w:b/>
-          <w:color w:val="17365D"/>
+          <w:color w:val="000000"/>
           <w:sz w:val="21"/>
         </w:rPr>
         <w:t>1. ПРЕДМЕТ ДОГОВОРА</w:t>
@@ -205,7 +205,7 @@
         <w:rPr>
           <w:rFonts w:ascii="Times New Roman" w:hAnsi="Times New Roman" w:eastAsia="Times New Roman"/>
           <w:b/>
-          <w:color w:val="17365D"/>
+          <w:color w:val="000000"/>
           <w:sz w:val="21"/>
         </w:rPr>
         <w:t>2. ПОРЯДОК И СРОКИ ОКАЗАНИЯ УСЛУГ</w:t>
@@ -287,7 +287,7 @@
         <w:rPr>
           <w:rFonts w:ascii="Times New Roman" w:hAnsi="Times New Roman" w:eastAsia="Times New Roman"/>
           <w:b/>
-          <w:color w:val="17365D"/>
+          <w:color w:val="000000"/>
           <w:sz w:val="21"/>
         </w:rPr>
         <w:t>3. СТОИМОСТЬ УСЛУГ И ПОРЯДОК ОПЛАТЫ</w:t>
@@ -396,7 +396,7 @@
         <w:rPr>
           <w:rFonts w:ascii="Times New Roman" w:hAnsi="Times New Roman" w:eastAsia="Times New Roman"/>
           <w:b/>
-          <w:color w:val="17365D"/>
+          <w:color w:val="000000"/>
           <w:sz w:val="21"/>
         </w:rPr>
         <w:t>4. ПРАВА И ОБЯЗАННОСТИ СТОРОН</w:t>
@@ -500,7 +500,7 @@
         <w:rPr>
           <w:rFonts w:ascii="Times New Roman" w:hAnsi="Times New Roman" w:eastAsia="Times New Roman"/>
           <w:b/>
-          <w:color w:val="17365D"/>
+          <w:color w:val="000000"/>
           <w:sz w:val="21"/>
         </w:rPr>
         <w:t>5. ПРИЁМКА УСЛУГ</w:t>
@@ -560,7 +560,7 @@
         <w:rPr>
           <w:rFonts w:ascii="Times New Roman" w:hAnsi="Times New Roman" w:eastAsia="Times New Roman"/>
           <w:b/>
-          <w:color w:val="17365D"/>
+          <w:color w:val="000000"/>
           <w:sz w:val="21"/>
         </w:rPr>
         <w:t>6. ОТВЕТСТВЕННОСТЬ И РАЗРЕШЕНИЕ СПОРОВ</w:t>
@@ -664,7 +664,7 @@
         <w:rPr>
           <w:rFonts w:ascii="Times New Roman" w:hAnsi="Times New Roman" w:eastAsia="Times New Roman"/>
           <w:b/>
-          <w:color w:val="17365D"/>
+          <w:color w:val="000000"/>
           <w:sz w:val="21"/>
         </w:rPr>
         <w:t>7. ПЕРСОНАЛЬНЫЕ ДАННЫЕ И УВЕДОМЛЕНИЯ</w:t>
@@ -724,7 +724,7 @@
         <w:rPr>
           <w:rFonts w:ascii="Times New Roman" w:hAnsi="Times New Roman" w:eastAsia="Times New Roman"/>
           <w:b/>
-          <w:color w:val="17365D"/>
+          <w:color w:val="000000"/>
           <w:sz w:val="21"/>
         </w:rPr>
         <w:t>8. ЗАКЛЮЧИТЕЛЬНЫЕ ПОЛОЖЕНИЯ</w:t>
@@ -811,7 +811,7 @@
         <w:rPr>
           <w:rFonts w:ascii="Times New Roman" w:hAnsi="Times New Roman" w:eastAsia="Times New Roman"/>
           <w:b/>
-          <w:color w:val="17365D"/>
+          <w:color w:val="000000"/>
           <w:sz w:val="21"/>
         </w:rPr>
         <w:t>9. РЕКВИЗИТЫ И ПОДПИСИ СТОРОН</w:t>
@@ -860,7 +860,7 @@
               <w:rPr>
                 <w:rFonts w:ascii="Times New Roman" w:hAnsi="Times New Roman" w:eastAsia="Times New Roman"/>
                 <w:b/>
-                <w:color w:val="17365D"/>
+                <w:color w:val="000000"/>
                 <w:sz w:val="20"/>
               </w:rPr>
               <w:t>ИСПОЛНИТЕЛЬ</w:t>
@@ -886,7 +886,7 @@
               <w:rPr>
                 <w:rFonts w:ascii="Times New Roman" w:hAnsi="Times New Roman" w:eastAsia="Times New Roman"/>
                 <w:b/>
-                <w:color w:val="17365D"/>
+                <w:color w:val="000000"/>
                 <w:sz w:val="20"/>
               </w:rPr>
               <w:t>КЛИЕНТ</w:t>
@@ -1082,7 +1082,7 @@
               <w:rPr>
                 <w:rFonts w:ascii="Times New Roman" w:hAnsi="Times New Roman" w:eastAsia="Times New Roman"/>
                 <w:b/>
-                <w:color w:val="17365D"/>
+                <w:color w:val="000000"/>
                 <w:sz w:val="19"/>
               </w:rPr>
               <w:t>ПОДПИСЬ И ПЕЧАТЬ ИСПОЛНИТЕЛЯ</w:t>
@@ -1108,7 +1108,7 @@
               <w:rPr>
                 <w:rFonts w:ascii="Times New Roman" w:hAnsi="Times New Roman" w:eastAsia="Times New Roman"/>
                 <w:b/>
-                <w:color w:val="17365D"/>
+                <w:color w:val="000000"/>
                 <w:sz w:val="19"/>
               </w:rPr>
               <w:t>ПОДПИСЬ КЛИЕНТА</w:t>
@@ -1304,7 +1304,7 @@
             <w:rPr>
               <w:rFonts w:ascii="Times New Roman" w:hAnsi="Times New Roman" w:eastAsia="Times New Roman"/>
               <w:b/>
-              <w:color w:val="17365D"/>
+              <w:color w:val="000000"/>
               <w:sz w:val="17"/>
             </w:rPr>
             <w:t>ZAKONEXPERT</w:t>
@@ -13403,7 +13403,7 @@
     <w:rPr>
       <w:rFonts w:ascii="Times New Roman" w:hAnsi="Times New Roman"/>
       <w:b/>
-      <w:color w:val="17365D"/>
+      <w:color w:val="000000"/>
       <w:sz w:val="21"/>
     </w:rPr>
   </w:style>

</xml_diff>

<commit_message>
Fix mypy errors and stale IBAN assertion after PR #3 merge
- master_template_service.py: annotate font var (try/except type union),
  str()-wrap Path for Document.save()
- test_document_service.py: light-trust template intentionally omits the
  raw bank IBAN from the document body (see
  master_template_light_service._rewrite_payment_table) - update the
  assertion to match instead of asserting stale pre-PR behavior
</commit_message>
<xml_diff>
--- a/app/templates/contracts/master_v1.docx
+++ b/app/templates/contracts/master_v1.docx
@@ -4,70 +4,149 @@
   <w:body>
     <w:p>
       <w:pPr>
-        <w:spacing w:before="160" w:after="40"/>
+        <w:spacing w:before="80" w:after="0"/>
         <w:jc w:val="center"/>
       </w:pPr>
       <w:r>
         <w:rPr>
-          <w:rFonts w:ascii="Times New Roman" w:hAnsi="Times New Roman" w:eastAsia="Times New Roman"/>
+          <w:rFonts w:ascii="Arial" w:hAnsi="Arial" w:eastAsia="Arial"/>
           <w:b/>
-          <w:color w:val="000000"/>
-          <w:sz w:val="30"/>
+          <w:i w:val="0"/>
+          <w:color w:val="B58A3A"/>
+          <w:sz w:val="14"/>
+        </w:rPr>
+        <w:t>ИНДИВИДУАЛЬНЫЙ ДОГОВОР</w:t>
+      </w:r>
+    </w:p>
+    <w:p>
+      <w:pPr>
+        <w:spacing w:before="20" w:after="20"/>
+        <w:jc w:val="center"/>
+      </w:pPr>
+      <w:r>
+        <w:rPr>
+          <w:rFonts w:ascii="Arial" w:hAnsi="Arial" w:eastAsia="Arial"/>
+          <w:b/>
+          <w:i w:val="0"/>
+          <w:color w:val="102A43"/>
+          <w:sz w:val="32"/>
         </w:rPr>
         <w:t>ДОГОВОР ОКАЗАНИЯ УСЛУГ</w:t>
       </w:r>
     </w:p>
     <w:p>
       <w:pPr>
-        <w:spacing w:before="0" w:after="140"/>
+        <w:spacing w:after="80"/>
         <w:jc w:val="center"/>
       </w:pPr>
       <w:r>
         <w:rPr>
-          <w:rFonts w:ascii="Times New Roman" w:hAnsi="Times New Roman" w:eastAsia="Times New Roman"/>
-          <w:b/>
-          <w:sz w:val="23"/>
+          <w:rFonts w:ascii="Arial" w:hAnsi="Arial" w:eastAsia="Arial"/>
+          <w:b w:val="0"/>
+          <w:i w:val="0"/>
+          <w:color w:val="667085"/>
+          <w:sz w:val="16"/>
         </w:rPr>
-        <w:t>№ {{ contract_number }}</w:t>
+        <w:t>Консультационное и документальное сопровождение</w:t>
       </w:r>
     </w:p>
     <w:tbl>
       <w:tblPr>
-        <w:tblW w:type="dxa" w:w="9865"/>
+        <w:tblW w:type="dxa" w:w="10092"/>
         <w:jc w:val="center"/>
         <w:tblLayout w:type="fixed"/>
         <w:tblLook w:firstColumn="1" w:firstRow="1" w:lastColumn="0" w:lastRow="0" w:noHBand="0" w:noVBand="1" w:val="04A0"/>
-        <w:tblInd w:w="0" w:type="dxa"/>
         <w:tblBorders>
-          <w:top w:val="nil"/>
-          <w:left w:val="nil"/>
-          <w:bottom w:val="nil"/>
-          <w:right w:val="nil"/>
-          <w:insideH w:val="nil"/>
-          <w:insideV w:val="nil"/>
+          <w:top w:val="single" w:sz="5" w:color="D1D8E0" w:space="0"/>
+          <w:left w:val="single" w:sz="5" w:color="D1D8E0" w:space="0"/>
+          <w:bottom w:val="single" w:sz="5" w:color="D1D8E0" w:space="0"/>
+          <w:right w:val="single" w:sz="5" w:color="D1D8E0" w:space="0"/>
+          <w:insideH w:val="single" w:sz="5" w:color="D1D8E0" w:space="0"/>
+          <w:insideV w:val="single" w:sz="5" w:color="D1D8E0" w:space="0"/>
         </w:tblBorders>
       </w:tblPr>
       <w:tblGrid>
-        <w:gridCol w:w="4932"/>
-        <w:gridCol w:w="4933"/>
+        <w:gridCol w:w="3364"/>
+        <w:gridCol w:w="3364"/>
+        <w:gridCol w:w="3364"/>
       </w:tblGrid>
       <w:tr>
+        <w:trPr>
+          <w:cantSplit/>
+        </w:trPr>
         <w:tc>
           <w:tcPr>
-            <w:tcW w:type="dxa" w:w="4932"/>
+            <w:tcW w:type="dxa" w:w="3364"/>
             <w:tcMar>
-              <w:top w:w="80" w:type="dxa"/>
-              <w:start w:w="120" w:type="dxa"/>
-              <w:bottom w:w="80" w:type="dxa"/>
-              <w:end w:w="120" w:type="dxa"/>
+              <w:top w:w="70" w:type="dxa"/>
+              <w:start w:w="80" w:type="dxa"/>
+              <w:bottom w:w="70" w:type="dxa"/>
+              <w:end w:w="80" w:type="dxa"/>
             </w:tcMar>
+            <w:shd w:fill="F5F7FA"/>
           </w:tcPr>
           <w:p>
+            <w:pPr>
+              <w:keepLines/>
+              <w:jc w:val="center"/>
+            </w:pPr>
             <w:r>
               <w:rPr>
-                <w:rFonts w:ascii="Times New Roman" w:hAnsi="Times New Roman" w:eastAsia="Times New Roman"/>
+                <w:rFonts w:ascii="Arial" w:hAnsi="Arial" w:eastAsia="Arial"/>
                 <w:b/>
-                <w:sz w:val="21"/>
+                <w:i w:val="0"/>
+                <w:color w:val="B58A3A"/>
+                <w:sz w:val="12"/>
+              </w:rPr>
+              <w:t>НОМЕР ДОГОВОРА</w:t>
+              <w:br/>
+            </w:r>
+            <w:r>
+              <w:rPr>
+                <w:rFonts w:ascii="Arial" w:hAnsi="Arial" w:eastAsia="Arial"/>
+                <w:b/>
+                <w:i w:val="0"/>
+                <w:color w:val="102A43"/>
+                <w:sz w:val="17"/>
+              </w:rPr>
+              <w:t>№ {{ contract_number }}</w:t>
+            </w:r>
+          </w:p>
+        </w:tc>
+        <w:tc>
+          <w:tcPr>
+            <w:tcW w:type="dxa" w:w="3364"/>
+            <w:tcMar>
+              <w:top w:w="70" w:type="dxa"/>
+              <w:start w:w="80" w:type="dxa"/>
+              <w:bottom w:w="70" w:type="dxa"/>
+              <w:end w:w="80" w:type="dxa"/>
+            </w:tcMar>
+            <w:shd w:fill="F5F7FA"/>
+          </w:tcPr>
+          <w:p>
+            <w:pPr>
+              <w:keepLines/>
+              <w:jc w:val="center"/>
+            </w:pPr>
+            <w:r>
+              <w:rPr>
+                <w:rFonts w:ascii="Arial" w:hAnsi="Arial" w:eastAsia="Arial"/>
+                <w:b/>
+                <w:i w:val="0"/>
+                <w:color w:val="B58A3A"/>
+                <w:sz w:val="12"/>
+              </w:rPr>
+              <w:t>МЕСТО ЗАКЛЮЧЕНИЯ</w:t>
+              <w:br/>
+            </w:r>
+            <w:r>
+              <w:rPr>
+                <w:rFonts w:ascii="Arial" w:hAnsi="Arial" w:eastAsia="Arial"/>
+                <w:b/>
+                <w:i w:val="0"/>
+                <w:color w:val="102A43"/>
+                <w:sz w:val="17"/>
               </w:rPr>
               <w:t>{{ contract_city }}</w:t>
             </w:r>
@@ -75,23 +154,38 @@
         </w:tc>
         <w:tc>
           <w:tcPr>
-            <w:tcW w:type="dxa" w:w="4933"/>
+            <w:tcW w:type="dxa" w:w="3364"/>
             <w:tcMar>
-              <w:top w:w="80" w:type="dxa"/>
-              <w:start w:w="120" w:type="dxa"/>
-              <w:bottom w:w="80" w:type="dxa"/>
-              <w:end w:w="120" w:type="dxa"/>
+              <w:top w:w="70" w:type="dxa"/>
+              <w:start w:w="80" w:type="dxa"/>
+              <w:bottom w:w="70" w:type="dxa"/>
+              <w:end w:w="80" w:type="dxa"/>
             </w:tcMar>
+            <w:shd w:fill="F5F7FA"/>
           </w:tcPr>
           <w:p>
             <w:pPr>
-              <w:jc w:val="right"/>
+              <w:keepLines/>
+              <w:jc w:val="center"/>
             </w:pPr>
             <w:r>
               <w:rPr>
-                <w:rFonts w:ascii="Times New Roman" w:hAnsi="Times New Roman" w:eastAsia="Times New Roman"/>
+                <w:rFonts w:ascii="Arial" w:hAnsi="Arial" w:eastAsia="Arial"/>
                 <w:b/>
-                <w:sz w:val="21"/>
+                <w:i w:val="0"/>
+                <w:color w:val="B58A3A"/>
+                <w:sz w:val="12"/>
+              </w:rPr>
+              <w:t>ДАТА</w:t>
+              <w:br/>
+            </w:r>
+            <w:r>
+              <w:rPr>
+                <w:rFonts w:ascii="Arial" w:hAnsi="Arial" w:eastAsia="Arial"/>
+                <w:b/>
+                <w:i w:val="0"/>
+                <w:color w:val="102A43"/>
+                <w:sz w:val="17"/>
               </w:rPr>
               <w:t>{{ contract_date }} г.</w:t>
             </w:r>
@@ -99,284 +193,1278 @@
         </w:tc>
       </w:tr>
     </w:tbl>
+    <w:tbl>
+      <w:tblPr>
+        <w:tblW w:type="dxa" w:w="10092"/>
+        <w:jc w:val="center"/>
+        <w:tblLayout w:type="fixed"/>
+        <w:tblLook w:firstColumn="1" w:firstRow="1" w:lastColumn="0" w:lastRow="0" w:noHBand="0" w:noVBand="1" w:val="04A0"/>
+        <w:tblBorders>
+          <w:top w:val="single" w:sz="5" w:color="D1D8E0" w:space="0"/>
+          <w:left w:val="single" w:sz="5" w:color="D1D8E0" w:space="0"/>
+          <w:bottom w:val="single" w:sz="5" w:color="D1D8E0" w:space="0"/>
+          <w:right w:val="single" w:sz="5" w:color="D1D8E0" w:space="0"/>
+          <w:insideH w:val="single" w:sz="5" w:color="D1D8E0" w:space="0"/>
+          <w:insideV w:val="single" w:sz="5" w:color="D1D8E0" w:space="0"/>
+        </w:tblBorders>
+      </w:tblPr>
+      <w:tblGrid>
+        <w:gridCol w:w="5046"/>
+        <w:gridCol w:w="5046"/>
+      </w:tblGrid>
+      <w:tr>
+        <w:trPr>
+          <w:cantSplit/>
+        </w:trPr>
+        <w:tc>
+          <w:tcPr>
+            <w:tcW w:type="dxa" w:w="5046"/>
+            <w:tcMar>
+              <w:top w:w="75" w:type="dxa"/>
+              <w:start w:w="120" w:type="dxa"/>
+              <w:bottom w:w="75" w:type="dxa"/>
+              <w:end w:w="120" w:type="dxa"/>
+            </w:tcMar>
+            <w:shd w:fill="FFFFFF"/>
+            <w:vAlign w:val="center"/>
+          </w:tcPr>
+          <w:p>
+            <w:pPr>
+              <w:keepLines/>
+            </w:pPr>
+            <w:r>
+              <w:rPr>
+                <w:rFonts w:ascii="Arial" w:hAnsi="Arial" w:eastAsia="Arial"/>
+                <w:b/>
+                <w:i w:val="0"/>
+                <w:color w:val="B58A3A"/>
+                <w:sz w:val="12"/>
+              </w:rPr>
+              <w:t>ИСПОЛНИТЕЛЬ</w:t>
+              <w:br/>
+            </w:r>
+            <w:r>
+              <w:rPr>
+                <w:rFonts w:ascii="Arial" w:hAnsi="Arial" w:eastAsia="Arial"/>
+                <w:b/>
+                <w:i w:val="0"/>
+                <w:color w:val="102A43"/>
+                <w:sz w:val="17"/>
+              </w:rPr>
+              <w:t>{{ executor_brand_name }}</w:t>
+              <w:br/>
+            </w:r>
+            <w:r>
+              <w:rPr>
+                <w:rFonts w:ascii="Times New Roman" w:hAnsi="Times New Roman" w:eastAsia="Times New Roman"/>
+                <w:b w:val="0"/>
+                <w:i w:val="0"/>
+                <w:color w:val="667085"/>
+                <w:sz w:val="15"/>
+              </w:rPr>
+              <w:t>{{ executor_identifier_label }} {{ executor_identifier }} · {{ executor_director_name }}</w:t>
+            </w:r>
+          </w:p>
+        </w:tc>
+        <w:tc>
+          <w:tcPr>
+            <w:tcW w:type="dxa" w:w="5046"/>
+            <w:tcMar>
+              <w:top w:w="75" w:type="dxa"/>
+              <w:start w:w="120" w:type="dxa"/>
+              <w:bottom w:w="75" w:type="dxa"/>
+              <w:end w:w="120" w:type="dxa"/>
+            </w:tcMar>
+            <w:shd w:fill="FFFFFF"/>
+            <w:vAlign w:val="center"/>
+          </w:tcPr>
+          <w:p>
+            <w:pPr>
+              <w:keepLines/>
+            </w:pPr>
+            <w:r>
+              <w:rPr>
+                <w:rFonts w:ascii="Arial" w:hAnsi="Arial" w:eastAsia="Arial"/>
+                <w:b/>
+                <w:i w:val="0"/>
+                <w:color w:val="B58A3A"/>
+                <w:sz w:val="12"/>
+              </w:rPr>
+              <w:t>КЛИЕНТ</w:t>
+              <w:br/>
+            </w:r>
+            <w:r>
+              <w:rPr>
+                <w:rFonts w:ascii="Arial" w:hAnsi="Arial" w:eastAsia="Arial"/>
+                <w:b/>
+                <w:i w:val="0"/>
+                <w:color w:val="102A43"/>
+                <w:sz w:val="17"/>
+              </w:rPr>
+              <w:t>{{ client_full_name }}</w:t>
+              <w:br/>
+            </w:r>
+            <w:r>
+              <w:rPr>
+                <w:rFonts w:ascii="Times New Roman" w:hAnsi="Times New Roman" w:eastAsia="Times New Roman"/>
+                <w:b w:val="0"/>
+                <w:i w:val="0"/>
+                <w:color w:val="667085"/>
+                <w:sz w:val="15"/>
+              </w:rPr>
+              <w:t>ИИН {{ client_iin }} · {{ client_phone }}</w:t>
+            </w:r>
+          </w:p>
+        </w:tc>
+      </w:tr>
+    </w:tbl>
     <w:p>
       <w:pPr>
-        <w:spacing w:before="0" w:after="60" w:line="259" w:lineRule="auto"/>
-        <w:ind w:firstLine="454"/>
+        <w:spacing w:before="40" w:after="60"/>
         <w:jc w:val="both"/>
       </w:pPr>
       <w:r>
         <w:rPr>
           <w:rFonts w:ascii="Times New Roman" w:hAnsi="Times New Roman" w:eastAsia="Times New Roman"/>
-          <w:sz w:val="22"/>
+          <w:b w:val="0"/>
+          <w:i w:val="0"/>
+          <w:color w:val="171717"/>
+          <w:sz w:val="17"/>
         </w:rPr>
-        <w:t>{{ executor_full_name }}, {{ executor_identifier_label }} {{ executor_identifier }}, в лице руководителя {{ executor_director_name }}, действующего на основании Устава, именуемое в дальнейшем «Исполнитель», с одной стороны, и гражданин(ка) {{ client_full_name }}, ИИН {{ client_iin }}, именуемый(ая) в дальнейшем «Клиент», с другой стороны, совместно именуемые «Стороны», заключили настоящий договор о нижеследующем.</w:t>
+        <w:t>{{ executor_full_name }}, {{ executor_identifier_label }} {{ executor_identifier }}, в лице руководителя {{ executor_director_name }}, действующего на основании Устава, именуемое «Исполнитель», и {{ client_full_name }}, ИИН {{ client_iin }}, именуемый(ая) «Клиент», совместно — «Стороны», заключили настоящий договор на следующих условиях.</w:t>
       </w:r>
     </w:p>
+    <w:tbl>
+      <w:tblPr>
+        <w:tblW w:type="dxa" w:w="10091"/>
+        <w:jc w:val="center"/>
+        <w:tblLayout w:type="fixed"/>
+        <w:tblLook w:firstColumn="1" w:firstRow="1" w:lastColumn="0" w:lastRow="0" w:noHBand="0" w:noVBand="1" w:val="04A0"/>
+        <w:tblBorders>
+          <w:top w:val="nil" w:sz="0" w:color="FFFFFF" w:space="0"/>
+          <w:left w:val="nil" w:sz="0" w:color="FFFFFF" w:space="0"/>
+          <w:bottom w:val="nil" w:sz="0" w:color="FFFFFF" w:space="0"/>
+          <w:right w:val="nil" w:sz="0" w:color="FFFFFF" w:space="0"/>
+          <w:insideH w:val="nil" w:sz="0" w:color="FFFFFF" w:space="0"/>
+          <w:insideV w:val="nil" w:sz="0" w:color="FFFFFF" w:space="0"/>
+        </w:tblBorders>
+      </w:tblPr>
+      <w:tblGrid>
+        <w:gridCol w:w="1757"/>
+        <w:gridCol w:w="8334"/>
+      </w:tblGrid>
+      <w:tr>
+        <w:trPr>
+          <w:cantSplit/>
+        </w:trPr>
+        <w:tc>
+          <w:tcPr>
+            <w:tcW w:type="dxa" w:w="1757"/>
+            <w:tcMar>
+              <w:top w:w="55" w:type="dxa"/>
+              <w:start w:w="50" w:type="dxa"/>
+              <w:bottom w:w="55" w:type="dxa"/>
+              <w:end w:w="50" w:type="dxa"/>
+            </w:tcMar>
+            <w:shd w:fill="F3F6F9"/>
+          </w:tcPr>
+          <w:p>
+            <w:pPr>
+              <w:keepLines/>
+              <w:jc w:val="center"/>
+            </w:pPr>
+            <w:r>
+              <w:rPr>
+                <w:rFonts w:ascii="Arial" w:hAnsi="Arial" w:eastAsia="Arial"/>
+                <w:b/>
+                <w:i w:val="0"/>
+                <w:color w:val="20364F"/>
+                <w:sz w:val="14"/>
+              </w:rPr>
+              <w:t>ЧАСТЬ I</w:t>
+            </w:r>
+          </w:p>
+        </w:tc>
+        <w:tc>
+          <w:tcPr>
+            <w:tcW w:type="dxa" w:w="8334"/>
+            <w:tcMar>
+              <w:top w:w="55" w:type="dxa"/>
+              <w:start w:w="120" w:type="dxa"/>
+              <w:bottom w:w="55" w:type="dxa"/>
+              <w:end w:w="120" w:type="dxa"/>
+            </w:tcMar>
+            <w:shd w:fill="FBF7EE"/>
+          </w:tcPr>
+          <w:p>
+            <w:pPr>
+              <w:keepLines/>
+              <w:jc w:val="left"/>
+            </w:pPr>
+            <w:r>
+              <w:rPr>
+                <w:rFonts w:ascii="Arial" w:hAnsi="Arial" w:eastAsia="Arial"/>
+                <w:b/>
+                <w:i w:val="0"/>
+                <w:color w:val="102A43"/>
+                <w:sz w:val="17"/>
+              </w:rPr>
+              <w:t>ИНДИВИДУАЛЬНЫЕ УСЛОВИЯ</w:t>
+              <w:br/>
+            </w:r>
+            <w:r>
+              <w:rPr>
+                <w:rFonts w:ascii="Arial" w:hAnsi="Arial" w:eastAsia="Arial"/>
+                <w:b w:val="0"/>
+                <w:i w:val="0"/>
+                <w:color w:val="667085"/>
+                <w:sz w:val="13"/>
+              </w:rPr>
+              <w:t>Объём работы, результат, срок и стоимость</w:t>
+            </w:r>
+          </w:p>
+        </w:tc>
+      </w:tr>
+    </w:tbl>
     <w:p>
       <w:pPr>
-        <w:pStyle w:val="ZESection"/>
-        <w:keepNext/>
+        <w:spacing w:before="40" w:after="30"/>
+        <w:jc w:val="left"/>
+        <w:pBdr>
+          <w:bottom w:val="single" w:sz="8" w:space="2" w:color="B58A3A"/>
+        </w:pBdr>
+      </w:pPr>
+      <w:r>
+        <w:rPr>
+          <w:rFonts w:ascii="Arial" w:hAnsi="Arial" w:eastAsia="Arial"/>
+          <w:b/>
+          <w:i w:val="0"/>
+          <w:color w:val="102A43"/>
+          <w:sz w:val="16"/>
+        </w:rPr>
+        <w:t>КЛЮЧЕВЫЕ УСЛОВИЯ</w:t>
+      </w:r>
+      <w:r>
+        <w:rPr>
+          <w:rFonts w:ascii="Arial" w:hAnsi="Arial" w:eastAsia="Arial"/>
+          <w:b w:val="0"/>
+          <w:i w:val="0"/>
+          <w:color w:val="667085"/>
+          <w:sz w:val="14"/>
+        </w:rPr>
+        <w:t xml:space="preserve">  ·  что получает Клиент</w:t>
+      </w:r>
+    </w:p>
+    <w:tbl>
+      <w:tblPr>
+        <w:tblW w:type="dxa" w:w="10091"/>
         <w:jc w:val="center"/>
+        <w:tblLayout w:type="fixed"/>
+        <w:tblLook w:firstColumn="1" w:firstRow="1" w:lastColumn="0" w:lastRow="0" w:noHBand="0" w:noVBand="1" w:val="04A0"/>
+        <w:tblBorders>
+          <w:top w:val="single" w:sz="5" w:color="D1D8E0" w:space="0"/>
+          <w:left w:val="single" w:sz="5" w:color="D1D8E0" w:space="0"/>
+          <w:bottom w:val="single" w:sz="5" w:color="D1D8E0" w:space="0"/>
+          <w:right w:val="single" w:sz="5" w:color="D1D8E0" w:space="0"/>
+          <w:insideH w:val="single" w:sz="5" w:color="D1D8E0" w:space="0"/>
+          <w:insideV w:val="single" w:sz="5" w:color="D1D8E0" w:space="0"/>
+        </w:tblBorders>
+      </w:tblPr>
+      <w:tblGrid>
+        <w:gridCol w:w="624"/>
+        <w:gridCol w:w="2154"/>
+        <w:gridCol w:w="7313"/>
+      </w:tblGrid>
+      <w:tr>
+        <w:trPr>
+          <w:trHeight w:val="340" w:hRule="atLeast"/>
+          <w:cantSplit/>
+        </w:trPr>
+        <w:tc>
+          <w:tcPr>
+            <w:tcW w:type="dxa" w:w="624"/>
+            <w:tcMar>
+              <w:top w:w="62" w:type="dxa"/>
+              <w:start w:w="95" w:type="dxa"/>
+              <w:bottom w:w="62" w:type="dxa"/>
+              <w:end w:w="95" w:type="dxa"/>
+            </w:tcMar>
+            <w:shd w:fill="F3F6F9"/>
+            <w:vAlign w:val="center"/>
+          </w:tcPr>
+          <w:p>
+            <w:pPr>
+              <w:keepLines/>
+              <w:jc w:val="center"/>
+            </w:pPr>
+            <w:r>
+              <w:rPr>
+                <w:rFonts w:ascii="Arial" w:hAnsi="Arial" w:eastAsia="Arial"/>
+                <w:b/>
+                <w:i w:val="0"/>
+                <w:color w:val="20364F"/>
+                <w:sz w:val="13"/>
+              </w:rPr>
+              <w:t>01</w:t>
+            </w:r>
+          </w:p>
+        </w:tc>
+        <w:tc>
+          <w:tcPr>
+            <w:tcW w:type="dxa" w:w="2154"/>
+            <w:tcMar>
+              <w:top w:w="62" w:type="dxa"/>
+              <w:start w:w="95" w:type="dxa"/>
+              <w:bottom w:w="62" w:type="dxa"/>
+              <w:end w:w="95" w:type="dxa"/>
+            </w:tcMar>
+            <w:shd w:fill="FBF7EE"/>
+            <w:vAlign w:val="center"/>
+          </w:tcPr>
+          <w:p>
+            <w:pPr>
+              <w:keepLines/>
+            </w:pPr>
+            <w:r>
+              <w:rPr>
+                <w:rFonts w:ascii="Arial" w:hAnsi="Arial" w:eastAsia="Arial"/>
+                <w:b/>
+                <w:i w:val="0"/>
+                <w:color w:val="B58A3A"/>
+                <w:sz w:val="13"/>
+              </w:rPr>
+              <w:t>УСЛУГА</w:t>
+            </w:r>
+          </w:p>
+        </w:tc>
+        <w:tc>
+          <w:tcPr>
+            <w:tcW w:type="dxa" w:w="7313"/>
+            <w:tcMar>
+              <w:top w:w="62" w:type="dxa"/>
+              <w:start w:w="95" w:type="dxa"/>
+              <w:bottom w:w="62" w:type="dxa"/>
+              <w:end w:w="95" w:type="dxa"/>
+            </w:tcMar>
+            <w:shd w:fill="FFFFFF"/>
+            <w:vAlign w:val="center"/>
+          </w:tcPr>
+          <w:p>
+            <w:pPr>
+              <w:keepLines/>
+            </w:pPr>
+            <w:r>
+              <w:rPr>
+                <w:rFonts w:ascii="Times New Roman" w:hAnsi="Times New Roman" w:eastAsia="Times New Roman"/>
+                <w:b w:val="0"/>
+                <w:i w:val="0"/>
+                <w:color w:val="171717"/>
+                <w:sz w:val="16"/>
+              </w:rPr>
+              <w:t>{{ service_subject }}</w:t>
+            </w:r>
+          </w:p>
+        </w:tc>
+      </w:tr>
+      <w:tr>
+        <w:trPr>
+          <w:trHeight w:val="410" w:hRule="atLeast"/>
+          <w:cantSplit/>
+        </w:trPr>
+        <w:tc>
+          <w:tcPr>
+            <w:tcW w:type="dxa" w:w="624"/>
+            <w:tcMar>
+              <w:top w:w="62" w:type="dxa"/>
+              <w:start w:w="95" w:type="dxa"/>
+              <w:bottom w:w="62" w:type="dxa"/>
+              <w:end w:w="95" w:type="dxa"/>
+            </w:tcMar>
+            <w:shd w:fill="F0F4F8"/>
+            <w:vAlign w:val="center"/>
+          </w:tcPr>
+          <w:p>
+            <w:pPr>
+              <w:keepLines/>
+              <w:jc w:val="center"/>
+            </w:pPr>
+            <w:r>
+              <w:rPr>
+                <w:rFonts w:ascii="Arial" w:hAnsi="Arial" w:eastAsia="Arial"/>
+                <w:b/>
+                <w:i w:val="0"/>
+                <w:color w:val="102A43"/>
+                <w:sz w:val="13"/>
+              </w:rPr>
+              <w:t>02</w:t>
+            </w:r>
+          </w:p>
+        </w:tc>
+        <w:tc>
+          <w:tcPr>
+            <w:tcW w:type="dxa" w:w="2154"/>
+            <w:tcMar>
+              <w:top w:w="62" w:type="dxa"/>
+              <w:start w:w="95" w:type="dxa"/>
+              <w:bottom w:w="62" w:type="dxa"/>
+              <w:end w:w="95" w:type="dxa"/>
+            </w:tcMar>
+            <w:shd w:fill="FBF7EE"/>
+            <w:vAlign w:val="center"/>
+          </w:tcPr>
+          <w:p>
+            <w:pPr>
+              <w:keepLines/>
+            </w:pPr>
+            <w:r>
+              <w:rPr>
+                <w:rFonts w:ascii="Arial" w:hAnsi="Arial" w:eastAsia="Arial"/>
+                <w:b/>
+                <w:i w:val="0"/>
+                <w:color w:val="B58A3A"/>
+                <w:sz w:val="13"/>
+              </w:rPr>
+              <w:t>РЕЗУЛЬТАТ</w:t>
+            </w:r>
+          </w:p>
+        </w:tc>
+        <w:tc>
+          <w:tcPr>
+            <w:tcW w:type="dxa" w:w="7313"/>
+            <w:tcMar>
+              <w:top w:w="62" w:type="dxa"/>
+              <w:start w:w="95" w:type="dxa"/>
+              <w:bottom w:w="62" w:type="dxa"/>
+              <w:end w:w="95" w:type="dxa"/>
+            </w:tcMar>
+            <w:shd w:fill="FFFFFF"/>
+            <w:vAlign w:val="center"/>
+          </w:tcPr>
+          <w:p>
+            <w:pPr>
+              <w:keepLines/>
+            </w:pPr>
+            <w:r>
+              <w:rPr>
+                <w:rFonts w:ascii="Times New Roman" w:hAnsi="Times New Roman" w:eastAsia="Times New Roman"/>
+                <w:b w:val="0"/>
+                <w:i w:val="0"/>
+                <w:color w:val="171717"/>
+                <w:sz w:val="16"/>
+              </w:rPr>
+              <w:t>{{ result_definition }}</w:t>
+            </w:r>
+          </w:p>
+        </w:tc>
+      </w:tr>
+      <w:tr>
+        <w:trPr>
+          <w:trHeight w:val="340" w:hRule="atLeast"/>
+          <w:cantSplit/>
+        </w:trPr>
+        <w:tc>
+          <w:tcPr>
+            <w:tcW w:type="dxa" w:w="624"/>
+            <w:tcMar>
+              <w:top w:w="62" w:type="dxa"/>
+              <w:start w:w="95" w:type="dxa"/>
+              <w:bottom w:w="62" w:type="dxa"/>
+              <w:end w:w="95" w:type="dxa"/>
+            </w:tcMar>
+            <w:shd w:fill="F0F4F8"/>
+            <w:vAlign w:val="center"/>
+          </w:tcPr>
+          <w:p>
+            <w:pPr>
+              <w:keepLines/>
+              <w:jc w:val="center"/>
+            </w:pPr>
+            <w:r>
+              <w:rPr>
+                <w:rFonts w:ascii="Arial" w:hAnsi="Arial" w:eastAsia="Arial"/>
+                <w:b/>
+                <w:i w:val="0"/>
+                <w:color w:val="102A43"/>
+                <w:sz w:val="13"/>
+              </w:rPr>
+              <w:t>03</w:t>
+            </w:r>
+          </w:p>
+        </w:tc>
+        <w:tc>
+          <w:tcPr>
+            <w:tcW w:type="dxa" w:w="2154"/>
+            <w:tcMar>
+              <w:top w:w="62" w:type="dxa"/>
+              <w:start w:w="95" w:type="dxa"/>
+              <w:bottom w:w="62" w:type="dxa"/>
+              <w:end w:w="95" w:type="dxa"/>
+            </w:tcMar>
+            <w:shd w:fill="FBF7EE"/>
+            <w:vAlign w:val="center"/>
+          </w:tcPr>
+          <w:p>
+            <w:pPr>
+              <w:keepLines/>
+            </w:pPr>
+            <w:r>
+              <w:rPr>
+                <w:rFonts w:ascii="Arial" w:hAnsi="Arial" w:eastAsia="Arial"/>
+                <w:b/>
+                <w:i w:val="0"/>
+                <w:color w:val="B58A3A"/>
+                <w:sz w:val="13"/>
+              </w:rPr>
+              <w:t>СРОК</w:t>
+            </w:r>
+          </w:p>
+        </w:tc>
+        <w:tc>
+          <w:tcPr>
+            <w:tcW w:type="dxa" w:w="7313"/>
+            <w:tcMar>
+              <w:top w:w="62" w:type="dxa"/>
+              <w:start w:w="95" w:type="dxa"/>
+              <w:bottom w:w="62" w:type="dxa"/>
+              <w:end w:w="95" w:type="dxa"/>
+            </w:tcMar>
+            <w:shd w:fill="FFFFFF"/>
+            <w:vAlign w:val="center"/>
+          </w:tcPr>
+          <w:p>
+            <w:pPr>
+              <w:keepLines/>
+            </w:pPr>
+            <w:r>
+              <w:rPr>
+                <w:rFonts w:ascii="Times New Roman" w:hAnsi="Times New Roman" w:eastAsia="Times New Roman"/>
+                <w:b w:val="0"/>
+                <w:i w:val="0"/>
+                <w:color w:val="171717"/>
+                <w:sz w:val="16"/>
+              </w:rPr>
+              <w:t>{{ work_period }}</w:t>
+            </w:r>
+          </w:p>
+        </w:tc>
+      </w:tr>
+      <w:tr>
+        <w:trPr>
+          <w:trHeight w:val="340" w:hRule="atLeast"/>
+          <w:cantSplit/>
+        </w:trPr>
+        <w:tc>
+          <w:tcPr>
+            <w:tcW w:type="dxa" w:w="624"/>
+            <w:tcMar>
+              <w:top w:w="62" w:type="dxa"/>
+              <w:start w:w="95" w:type="dxa"/>
+              <w:bottom w:w="62" w:type="dxa"/>
+              <w:end w:w="95" w:type="dxa"/>
+            </w:tcMar>
+            <w:shd w:fill="F3F6F9"/>
+            <w:vAlign w:val="center"/>
+          </w:tcPr>
+          <w:p>
+            <w:pPr>
+              <w:keepLines/>
+              <w:jc w:val="center"/>
+            </w:pPr>
+            <w:r>
+              <w:rPr>
+                <w:rFonts w:ascii="Arial" w:hAnsi="Arial" w:eastAsia="Arial"/>
+                <w:b/>
+                <w:i w:val="0"/>
+                <w:color w:val="20364F"/>
+                <w:sz w:val="13"/>
+              </w:rPr>
+              <w:t>04</w:t>
+            </w:r>
+          </w:p>
+        </w:tc>
+        <w:tc>
+          <w:tcPr>
+            <w:tcW w:type="dxa" w:w="2154"/>
+            <w:tcMar>
+              <w:top w:w="62" w:type="dxa"/>
+              <w:start w:w="95" w:type="dxa"/>
+              <w:bottom w:w="62" w:type="dxa"/>
+              <w:end w:w="95" w:type="dxa"/>
+            </w:tcMar>
+            <w:shd w:fill="FBF7EE"/>
+            <w:vAlign w:val="center"/>
+          </w:tcPr>
+          <w:p>
+            <w:pPr>
+              <w:keepLines/>
+            </w:pPr>
+            <w:r>
+              <w:rPr>
+                <w:rFonts w:ascii="Arial" w:hAnsi="Arial" w:eastAsia="Arial"/>
+                <w:b/>
+                <w:i w:val="0"/>
+                <w:color w:val="B58A3A"/>
+                <w:sz w:val="13"/>
+              </w:rPr>
+              <w:t>СТОИМОСТЬ</w:t>
+            </w:r>
+          </w:p>
+        </w:tc>
+        <w:tc>
+          <w:tcPr>
+            <w:tcW w:type="dxa" w:w="7313"/>
+            <w:tcMar>
+              <w:top w:w="62" w:type="dxa"/>
+              <w:start w:w="95" w:type="dxa"/>
+              <w:bottom w:w="62" w:type="dxa"/>
+              <w:end w:w="95" w:type="dxa"/>
+            </w:tcMar>
+            <w:shd w:fill="FFFFFF"/>
+            <w:vAlign w:val="center"/>
+          </w:tcPr>
+          <w:p>
+            <w:pPr>
+              <w:keepLines/>
+            </w:pPr>
+            <w:r>
+              <w:rPr>
+                <w:rFonts w:ascii="Times New Roman" w:hAnsi="Times New Roman" w:eastAsia="Times New Roman"/>
+                <w:b/>
+                <w:i w:val="0"/>
+                <w:color w:val="102A43"/>
+                <w:sz w:val="16"/>
+              </w:rPr>
+              <w:t>{{ amount_digits }} ({{ amount_words }})</w:t>
+            </w:r>
+          </w:p>
+        </w:tc>
+      </w:tr>
+      <w:tr>
+        <w:trPr>
+          <w:trHeight w:val="340" w:hRule="atLeast"/>
+          <w:cantSplit/>
+        </w:trPr>
+        <w:tc>
+          <w:tcPr>
+            <w:tcW w:type="dxa" w:w="624"/>
+            <w:tcMar>
+              <w:top w:w="62" w:type="dxa"/>
+              <w:start w:w="95" w:type="dxa"/>
+              <w:bottom w:w="62" w:type="dxa"/>
+              <w:end w:w="95" w:type="dxa"/>
+            </w:tcMar>
+            <w:shd w:fill="F0F4F8"/>
+            <w:vAlign w:val="center"/>
+          </w:tcPr>
+          <w:p>
+            <w:pPr>
+              <w:keepLines/>
+              <w:jc w:val="center"/>
+            </w:pPr>
+            <w:r>
+              <w:rPr>
+                <w:rFonts w:ascii="Arial" w:hAnsi="Arial" w:eastAsia="Arial"/>
+                <w:b/>
+                <w:i w:val="0"/>
+                <w:color w:val="102A43"/>
+                <w:sz w:val="13"/>
+              </w:rPr>
+              <w:t>05</w:t>
+            </w:r>
+          </w:p>
+        </w:tc>
+        <w:tc>
+          <w:tcPr>
+            <w:tcW w:type="dxa" w:w="2154"/>
+            <w:tcMar>
+              <w:top w:w="62" w:type="dxa"/>
+              <w:start w:w="95" w:type="dxa"/>
+              <w:bottom w:w="62" w:type="dxa"/>
+              <w:end w:w="95" w:type="dxa"/>
+            </w:tcMar>
+            <w:shd w:fill="FBF7EE"/>
+            <w:vAlign w:val="center"/>
+          </w:tcPr>
+          <w:p>
+            <w:pPr>
+              <w:keepLines/>
+            </w:pPr>
+            <w:r>
+              <w:rPr>
+                <w:rFonts w:ascii="Arial" w:hAnsi="Arial" w:eastAsia="Arial"/>
+                <w:b/>
+                <w:i w:val="0"/>
+                <w:color w:val="B58A3A"/>
+                <w:sz w:val="13"/>
+              </w:rPr>
+              <w:t>ОПЛАТА</w:t>
+            </w:r>
+          </w:p>
+        </w:tc>
+        <w:tc>
+          <w:tcPr>
+            <w:tcW w:type="dxa" w:w="7313"/>
+            <w:tcMar>
+              <w:top w:w="62" w:type="dxa"/>
+              <w:start w:w="95" w:type="dxa"/>
+              <w:bottom w:w="62" w:type="dxa"/>
+              <w:end w:w="95" w:type="dxa"/>
+            </w:tcMar>
+            <w:shd w:fill="FFFFFF"/>
+            <w:vAlign w:val="center"/>
+          </w:tcPr>
+          <w:p>
+            <w:pPr>
+              <w:keepLines/>
+            </w:pPr>
+            <w:r>
+              <w:rPr>
+                <w:rFonts w:ascii="Times New Roman" w:hAnsi="Times New Roman" w:eastAsia="Times New Roman"/>
+                <w:b w:val="0"/>
+                <w:i w:val="0"/>
+                <w:color w:val="171717"/>
+                <w:sz w:val="16"/>
+              </w:rPr>
+              <w:t>{{ payment_terms }}</w:t>
+            </w:r>
+          </w:p>
+        </w:tc>
+      </w:tr>
+    </w:tbl>
+    <w:p>
+      <w:pPr>
+        <w:spacing w:before="20" w:after="40"/>
+        <w:jc w:val="right"/>
       </w:pPr>
       <w:r>
         <w:rPr>
           <w:rFonts w:ascii="Times New Roman" w:hAnsi="Times New Roman" w:eastAsia="Times New Roman"/>
-          <w:b/>
-          <w:color w:val="000000"/>
-          <w:sz w:val="21"/>
+          <w:b w:val="0"/>
+          <w:i/>
+          <w:color w:val="667085"/>
+          <w:sz w:val="13"/>
         </w:rPr>
-        <w:t>1. ПРЕДМЕТ ДОГОВОРА</w:t>
+        <w:t>Ключевые условия являются неотъемлемой частью договора.</w:t>
       </w:r>
     </w:p>
+    <w:tbl>
+      <w:tblPr>
+        <w:tblW w:type="dxa" w:w="10091"/>
+        <w:jc w:val="center"/>
+        <w:tblLayout w:type="fixed"/>
+        <w:tblLook w:firstColumn="1" w:firstRow="1" w:lastColumn="0" w:lastRow="0" w:noHBand="0" w:noVBand="1" w:val="04A0"/>
+        <w:tblBorders>
+          <w:top w:val="nil" w:sz="0" w:color="FFFFFF" w:space="0"/>
+          <w:left w:val="nil" w:sz="0" w:color="FFFFFF" w:space="0"/>
+          <w:bottom w:val="nil" w:sz="0" w:color="FFFFFF" w:space="0"/>
+          <w:right w:val="nil" w:sz="0" w:color="FFFFFF" w:space="0"/>
+          <w:insideH w:val="nil" w:sz="0" w:color="FFFFFF" w:space="0"/>
+          <w:insideV w:val="nil" w:sz="0" w:color="FFFFFF" w:space="0"/>
+        </w:tblBorders>
+      </w:tblPr>
+      <w:tblGrid>
+        <w:gridCol w:w="652"/>
+        <w:gridCol w:w="9439"/>
+      </w:tblGrid>
+      <w:tr>
+        <w:trPr>
+          <w:cantSplit/>
+        </w:trPr>
+        <w:tc>
+          <w:tcPr>
+            <w:tcW w:type="dxa" w:w="652"/>
+            <w:tcMar>
+              <w:top w:w="45" w:type="dxa"/>
+              <w:start w:w="80" w:type="dxa"/>
+              <w:bottom w:w="45" w:type="dxa"/>
+              <w:end w:w="80" w:type="dxa"/>
+            </w:tcMar>
+            <w:shd w:fill="F3F6F9"/>
+            <w:vAlign w:val="center"/>
+          </w:tcPr>
+          <w:p>
+            <w:pPr>
+              <w:keepLines/>
+              <w:jc w:val="center"/>
+            </w:pPr>
+            <w:r>
+              <w:rPr>
+                <w:rFonts w:ascii="Arial" w:hAnsi="Arial" w:eastAsia="Arial"/>
+                <w:b/>
+                <w:i w:val="0"/>
+                <w:color w:val="20364F"/>
+                <w:sz w:val="14"/>
+              </w:rPr>
+              <w:t>01</w:t>
+            </w:r>
+          </w:p>
+        </w:tc>
+        <w:tc>
+          <w:tcPr>
+            <w:tcW w:type="dxa" w:w="9439"/>
+            <w:tcMar>
+              <w:top w:w="45" w:type="dxa"/>
+              <w:start w:w="80" w:type="dxa"/>
+              <w:bottom w:w="45" w:type="dxa"/>
+              <w:end w:w="80" w:type="dxa"/>
+            </w:tcMar>
+          </w:tcPr>
+          <w:p>
+            <w:pPr>
+              <w:spacing w:before="0" w:after="0"/>
+              <w:keepLines/>
+              <w:pBdr>
+                <w:bottom w:val="single" w:sz="6" w:space="1" w:color="B58A3A"/>
+              </w:pBdr>
+            </w:pPr>
+            <w:r>
+              <w:rPr>
+                <w:rFonts w:ascii="Arial" w:hAnsi="Arial" w:eastAsia="Arial"/>
+                <w:b/>
+                <w:i w:val="0"/>
+                <w:color w:val="102A43"/>
+                <w:sz w:val="18"/>
+              </w:rPr>
+              <w:t>ПРЕДМЕТ И РЕЗУЛЬТАТ</w:t>
+            </w:r>
+          </w:p>
+        </w:tc>
+      </w:tr>
+    </w:tbl>
     <w:p>
       <w:pPr>
-        <w:spacing w:before="0" w:after="60" w:line="259" w:lineRule="auto"/>
-        <w:ind w:firstLine="454"/>
+        <w:spacing w:before="0" w:after="41" w:line="247" w:lineRule="auto"/>
+        <w:ind w:left="0" w:firstLine="0"/>
         <w:jc w:val="both"/>
       </w:pPr>
       <w:r>
         <w:rPr>
           <w:rFonts w:ascii="Times New Roman" w:hAnsi="Times New Roman" w:eastAsia="Times New Roman"/>
           <w:b/>
-          <w:sz w:val="22"/>
+          <w:i w:val="0"/>
+          <w:color w:val="102A43"/>
+          <w:sz w:val="18"/>
         </w:rPr>
         <w:t xml:space="preserve">1.1. </w:t>
       </w:r>
       <w:r>
         <w:rPr>
           <w:rFonts w:ascii="Times New Roman" w:hAnsi="Times New Roman" w:eastAsia="Times New Roman"/>
-          <w:sz w:val="22"/>
+          <w:b w:val="0"/>
+          <w:i w:val="0"/>
+          <w:color w:val="171717"/>
+          <w:sz w:val="18"/>
         </w:rPr>
         <w:t>{{ service_subject }}</w:t>
       </w:r>
     </w:p>
     <w:p>
       <w:pPr>
-        <w:spacing w:before="0" w:after="60" w:line="259" w:lineRule="auto"/>
-        <w:ind w:firstLine="454"/>
+        <w:spacing w:before="0" w:after="41" w:line="247" w:lineRule="auto"/>
+        <w:ind w:left="0" w:firstLine="0"/>
         <w:jc w:val="both"/>
       </w:pPr>
       <w:r>
         <w:rPr>
           <w:rFonts w:ascii="Times New Roman" w:hAnsi="Times New Roman" w:eastAsia="Times New Roman"/>
           <w:b/>
-          <w:sz w:val="22"/>
+          <w:i w:val="0"/>
+          <w:color w:val="102A43"/>
+          <w:sz w:val="18"/>
         </w:rPr>
         <w:t xml:space="preserve">1.2. </w:t>
       </w:r>
       <w:r>
         <w:rPr>
           <w:rFonts w:ascii="Times New Roman" w:hAnsi="Times New Roman" w:eastAsia="Times New Roman"/>
-          <w:sz w:val="22"/>
+          <w:b w:val="0"/>
+          <w:i w:val="0"/>
+          <w:color w:val="171717"/>
+          <w:sz w:val="18"/>
         </w:rPr>
         <w:t>В состав услуг входят: {{ service_actions }}.</w:t>
       </w:r>
     </w:p>
     <w:p>
       <w:pPr>
-        <w:spacing w:before="0" w:after="60" w:line="259" w:lineRule="auto"/>
-        <w:ind w:firstLine="454"/>
+        <w:spacing w:before="0" w:after="41" w:line="247" w:lineRule="auto"/>
+        <w:ind w:left="0" w:firstLine="0"/>
         <w:jc w:val="both"/>
       </w:pPr>
       <w:r>
         <w:rPr>
           <w:rFonts w:ascii="Times New Roman" w:hAnsi="Times New Roman" w:eastAsia="Times New Roman"/>
           <w:b/>
-          <w:sz w:val="22"/>
+          <w:i w:val="0"/>
+          <w:color w:val="102A43"/>
+          <w:sz w:val="18"/>
         </w:rPr>
         <w:t xml:space="preserve">1.3. </w:t>
       </w:r>
       <w:r>
         <w:rPr>
           <w:rFonts w:ascii="Times New Roman" w:hAnsi="Times New Roman" w:eastAsia="Times New Roman"/>
-          <w:sz w:val="22"/>
+          <w:b w:val="0"/>
+          <w:i w:val="0"/>
+          <w:color w:val="171717"/>
+          <w:sz w:val="18"/>
         </w:rPr>
-        <w:t>Ожидаемый и проверяемый результат оказания услуг: {{ result_definition }}.</w:t>
+        <w:t>Проверяемый результат оказания услуг: {{ result_definition }}. Исполнитель подтверждает выполненные действия документами, талонами, ответами органов, перепиской либо иными объективными материалами.</w:t>
       </w:r>
     </w:p>
+    <w:tbl>
+      <w:tblPr>
+        <w:tblW w:type="dxa" w:w="10091"/>
+        <w:jc w:val="center"/>
+        <w:tblLayout w:type="fixed"/>
+        <w:tblLook w:firstColumn="1" w:firstRow="1" w:lastColumn="0" w:lastRow="0" w:noHBand="0" w:noVBand="1" w:val="04A0"/>
+        <w:tblBorders>
+          <w:top w:val="nil" w:sz="0" w:color="FFFFFF" w:space="0"/>
+          <w:left w:val="nil" w:sz="0" w:color="FFFFFF" w:space="0"/>
+          <w:bottom w:val="nil" w:sz="0" w:color="FFFFFF" w:space="0"/>
+          <w:right w:val="nil" w:sz="0" w:color="FFFFFF" w:space="0"/>
+          <w:insideH w:val="nil" w:sz="0" w:color="FFFFFF" w:space="0"/>
+          <w:insideV w:val="nil" w:sz="0" w:color="FFFFFF" w:space="0"/>
+        </w:tblBorders>
+      </w:tblPr>
+      <w:tblGrid>
+        <w:gridCol w:w="652"/>
+        <w:gridCol w:w="9439"/>
+      </w:tblGrid>
+      <w:tr>
+        <w:trPr>
+          <w:cantSplit/>
+        </w:trPr>
+        <w:tc>
+          <w:tcPr>
+            <w:tcW w:type="dxa" w:w="652"/>
+            <w:tcMar>
+              <w:top w:w="45" w:type="dxa"/>
+              <w:start w:w="80" w:type="dxa"/>
+              <w:bottom w:w="45" w:type="dxa"/>
+              <w:end w:w="80" w:type="dxa"/>
+            </w:tcMar>
+            <w:shd w:fill="F3F6F9"/>
+            <w:vAlign w:val="center"/>
+          </w:tcPr>
+          <w:p>
+            <w:pPr>
+              <w:keepLines/>
+              <w:jc w:val="center"/>
+            </w:pPr>
+            <w:r>
+              <w:rPr>
+                <w:rFonts w:ascii="Arial" w:hAnsi="Arial" w:eastAsia="Arial"/>
+                <w:b/>
+                <w:i w:val="0"/>
+                <w:color w:val="20364F"/>
+                <w:sz w:val="14"/>
+              </w:rPr>
+              <w:t>02</w:t>
+            </w:r>
+          </w:p>
+        </w:tc>
+        <w:tc>
+          <w:tcPr>
+            <w:tcW w:type="dxa" w:w="9439"/>
+            <w:tcMar>
+              <w:top w:w="45" w:type="dxa"/>
+              <w:start w:w="80" w:type="dxa"/>
+              <w:bottom w:w="45" w:type="dxa"/>
+              <w:end w:w="80" w:type="dxa"/>
+            </w:tcMar>
+          </w:tcPr>
+          <w:p>
+            <w:pPr>
+              <w:spacing w:before="0" w:after="0"/>
+              <w:keepLines/>
+              <w:pBdr>
+                <w:bottom w:val="single" w:sz="6" w:space="1" w:color="B58A3A"/>
+              </w:pBdr>
+            </w:pPr>
+            <w:r>
+              <w:rPr>
+                <w:rFonts w:ascii="Arial" w:hAnsi="Arial" w:eastAsia="Arial"/>
+                <w:b/>
+                <w:i w:val="0"/>
+                <w:color w:val="102A43"/>
+                <w:sz w:val="18"/>
+              </w:rPr>
+              <w:t>ПОРЯДОК И СРОКИ</w:t>
+            </w:r>
+          </w:p>
+        </w:tc>
+      </w:tr>
+    </w:tbl>
     <w:p>
       <w:pPr>
-        <w:pStyle w:val="ZESection"/>
-        <w:keepNext/>
-        <w:jc w:val="center"/>
-      </w:pPr>
-      <w:r>
-        <w:rPr>
-          <w:rFonts w:ascii="Times New Roman" w:hAnsi="Times New Roman" w:eastAsia="Times New Roman"/>
-          <w:b/>
-          <w:color w:val="000000"/>
-          <w:sz w:val="21"/>
-        </w:rPr>
-        <w:t>2. ПОРЯДОК И СРОКИ ОКАЗАНИЯ УСЛУГ</w:t>
-      </w:r>
-    </w:p>
-    <w:p>
-      <w:pPr>
-        <w:spacing w:before="0" w:after="60" w:line="259" w:lineRule="auto"/>
-        <w:ind w:firstLine="454"/>
+        <w:spacing w:before="0" w:after="41" w:line="247" w:lineRule="auto"/>
+        <w:ind w:left="0" w:firstLine="0"/>
         <w:jc w:val="both"/>
       </w:pPr>
       <w:r>
         <w:rPr>
           <w:rFonts w:ascii="Times New Roman" w:hAnsi="Times New Roman" w:eastAsia="Times New Roman"/>
           <w:b/>
-          <w:sz w:val="22"/>
+          <w:i w:val="0"/>
+          <w:color w:val="102A43"/>
+          <w:sz w:val="18"/>
         </w:rPr>
         <w:t xml:space="preserve">2.1. </w:t>
       </w:r>
       <w:r>
         <w:rPr>
           <w:rFonts w:ascii="Times New Roman" w:hAnsi="Times New Roman" w:eastAsia="Times New Roman"/>
-          <w:sz w:val="22"/>
+          <w:b w:val="0"/>
+          <w:i w:val="0"/>
+          <w:color w:val="171717"/>
+          <w:sz w:val="18"/>
         </w:rPr>
-        <w:t>Исполнитель приступает к оказанию услуг после получения от Клиента документов и сведений, необходимых для выполнения поручения, а при предусмотренной предоплате - также после её внесения.</w:t>
+        <w:t>Исполнитель начинает работу после получения необходимых документов и сведений Клиента, а при предоплате — после её поступления.</w:t>
       </w:r>
     </w:p>
     <w:p>
       <w:pPr>
-        <w:spacing w:before="0" w:after="60" w:line="259" w:lineRule="auto"/>
-        <w:ind w:firstLine="454"/>
+        <w:spacing w:before="0" w:after="41" w:line="247" w:lineRule="auto"/>
+        <w:ind w:left="0" w:firstLine="0"/>
         <w:jc w:val="both"/>
       </w:pPr>
       <w:r>
         <w:rPr>
           <w:rFonts w:ascii="Times New Roman" w:hAnsi="Times New Roman" w:eastAsia="Times New Roman"/>
           <w:b/>
-          <w:sz w:val="22"/>
+          <w:i w:val="0"/>
+          <w:color w:val="102A43"/>
+          <w:sz w:val="18"/>
         </w:rPr>
         <w:t xml:space="preserve">2.2. </w:t>
       </w:r>
       <w:r>
         <w:rPr>
           <w:rFonts w:ascii="Times New Roman" w:hAnsi="Times New Roman" w:eastAsia="Times New Roman"/>
-          <w:sz w:val="22"/>
+          <w:b w:val="0"/>
+          <w:i w:val="0"/>
+          <w:color w:val="171717"/>
+          <w:sz w:val="18"/>
         </w:rPr>
-        <w:t>Срок оказания услуг: {{ work_period }}. Сроки рассмотрения обращений судом, нотариусом, ЧСИ, банком, взыскателем и государственными органами не зависят от Исполнителя и в срок оказания услуг не включаются.</w:t>
+        <w:t>Срок действий Исполнителя: {{ work_period }}. Время рассмотрения обращений судом, ЧСИ, нотариусом, банком, взыскателем и государственными органами не включается в этот срок; Исполнитель информирует Клиента о таких периодах ожидания.</w:t>
       </w:r>
     </w:p>
     <w:p>
       <w:pPr>
-        <w:spacing w:before="0" w:after="60" w:line="259" w:lineRule="auto"/>
-        <w:ind w:firstLine="454"/>
+        <w:spacing w:before="0" w:after="41" w:line="247" w:lineRule="auto"/>
+        <w:ind w:left="0" w:firstLine="0"/>
         <w:jc w:val="both"/>
       </w:pPr>
       <w:r>
         <w:rPr>
           <w:rFonts w:ascii="Times New Roman" w:hAnsi="Times New Roman" w:eastAsia="Times New Roman"/>
           <w:b/>
-          <w:sz w:val="22"/>
+          <w:i w:val="0"/>
+          <w:color w:val="102A43"/>
+          <w:sz w:val="18"/>
         </w:rPr>
         <w:t xml:space="preserve">2.3. </w:t>
       </w:r>
       <w:r>
         <w:rPr>
           <w:rFonts w:ascii="Times New Roman" w:hAnsi="Times New Roman" w:eastAsia="Times New Roman"/>
-          <w:sz w:val="22"/>
+          <w:b w:val="0"/>
+          <w:i w:val="0"/>
+          <w:color w:val="171717"/>
+          <w:sz w:val="18"/>
         </w:rPr>
-        <w:t>Клиент обязан незамедлительно передавать Исполнителю поступившие уведомления, постановления, судебные извещения, ответы государственных органов и организаций и иные документы, имеющие отношение к делу.</w:t>
+        <w:t>Клиент своевременно передаёт уведомления, постановления, судебные извещения и другие материалы по делу. Задержка предоставления необходимых данных соразмерно продлевает срок работы.</w:t>
       </w:r>
     </w:p>
+    <w:tbl>
+      <w:tblPr>
+        <w:tblW w:type="dxa" w:w="10091"/>
+        <w:jc w:val="center"/>
+        <w:tblLayout w:type="fixed"/>
+        <w:tblLook w:firstColumn="1" w:firstRow="1" w:lastColumn="0" w:lastRow="0" w:noHBand="0" w:noVBand="1" w:val="04A0"/>
+        <w:tblBorders>
+          <w:top w:val="nil" w:sz="0" w:color="FFFFFF" w:space="0"/>
+          <w:left w:val="nil" w:sz="0" w:color="FFFFFF" w:space="0"/>
+          <w:bottom w:val="nil" w:sz="0" w:color="FFFFFF" w:space="0"/>
+          <w:right w:val="nil" w:sz="0" w:color="FFFFFF" w:space="0"/>
+          <w:insideH w:val="nil" w:sz="0" w:color="FFFFFF" w:space="0"/>
+          <w:insideV w:val="nil" w:sz="0" w:color="FFFFFF" w:space="0"/>
+        </w:tblBorders>
+      </w:tblPr>
+      <w:tblGrid>
+        <w:gridCol w:w="652"/>
+        <w:gridCol w:w="9439"/>
+      </w:tblGrid>
+      <w:tr>
+        <w:trPr>
+          <w:cantSplit/>
+        </w:trPr>
+        <w:tc>
+          <w:tcPr>
+            <w:tcW w:type="dxa" w:w="652"/>
+            <w:tcMar>
+              <w:top w:w="45" w:type="dxa"/>
+              <w:start w:w="80" w:type="dxa"/>
+              <w:bottom w:w="45" w:type="dxa"/>
+              <w:end w:w="80" w:type="dxa"/>
+            </w:tcMar>
+            <w:shd w:fill="F3F6F9"/>
+            <w:vAlign w:val="center"/>
+          </w:tcPr>
+          <w:p>
+            <w:pPr>
+              <w:keepLines/>
+              <w:jc w:val="center"/>
+            </w:pPr>
+            <w:r>
+              <w:rPr>
+                <w:rFonts w:ascii="Arial" w:hAnsi="Arial" w:eastAsia="Arial"/>
+                <w:b/>
+                <w:i w:val="0"/>
+                <w:color w:val="20364F"/>
+                <w:sz w:val="14"/>
+              </w:rPr>
+              <w:t>03</w:t>
+            </w:r>
+          </w:p>
+        </w:tc>
+        <w:tc>
+          <w:tcPr>
+            <w:tcW w:type="dxa" w:w="9439"/>
+            <w:tcMar>
+              <w:top w:w="45" w:type="dxa"/>
+              <w:start w:w="80" w:type="dxa"/>
+              <w:bottom w:w="45" w:type="dxa"/>
+              <w:end w:w="80" w:type="dxa"/>
+            </w:tcMar>
+          </w:tcPr>
+          <w:p>
+            <w:pPr>
+              <w:spacing w:before="0" w:after="0"/>
+              <w:keepLines/>
+              <w:pBdr>
+                <w:bottom w:val="single" w:sz="6" w:space="1" w:color="B58A3A"/>
+              </w:pBdr>
+            </w:pPr>
+            <w:r>
+              <w:rPr>
+                <w:rFonts w:ascii="Arial" w:hAnsi="Arial" w:eastAsia="Arial"/>
+                <w:b/>
+                <w:i w:val="0"/>
+                <w:color w:val="102A43"/>
+                <w:sz w:val="18"/>
+              </w:rPr>
+              <w:t>СТОИМОСТЬ И ОПЛАТА</w:t>
+            </w:r>
+          </w:p>
+        </w:tc>
+      </w:tr>
+    </w:tbl>
     <w:p>
       <w:pPr>
-        <w:pStyle w:val="ZESection"/>
-        <w:keepNext/>
-        <w:jc w:val="center"/>
-      </w:pPr>
-      <w:r>
-        <w:rPr>
-          <w:rFonts w:ascii="Times New Roman" w:hAnsi="Times New Roman" w:eastAsia="Times New Roman"/>
-          <w:b/>
-          <w:color w:val="000000"/>
-          <w:sz w:val="21"/>
-        </w:rPr>
-        <w:t>3. СТОИМОСТЬ УСЛУГ И ПОРЯДОК ОПЛАТЫ</w:t>
-      </w:r>
-    </w:p>
-    <w:p>
-      <w:pPr>
-        <w:spacing w:before="0" w:after="60" w:line="259" w:lineRule="auto"/>
-        <w:ind w:firstLine="454"/>
+        <w:spacing w:before="0" w:after="41" w:line="247" w:lineRule="auto"/>
+        <w:ind w:left="0" w:firstLine="0"/>
         <w:jc w:val="both"/>
       </w:pPr>
       <w:r>
         <w:rPr>
           <w:rFonts w:ascii="Times New Roman" w:hAnsi="Times New Roman" w:eastAsia="Times New Roman"/>
           <w:b/>
-          <w:sz w:val="22"/>
+          <w:i w:val="0"/>
+          <w:color w:val="102A43"/>
+          <w:sz w:val="18"/>
         </w:rPr>
         <w:t xml:space="preserve">3.1. </w:t>
       </w:r>
       <w:r>
         <w:rPr>
           <w:rFonts w:ascii="Times New Roman" w:hAnsi="Times New Roman" w:eastAsia="Times New Roman"/>
-          <w:sz w:val="22"/>
+          <w:b w:val="0"/>
+          <w:i w:val="0"/>
+          <w:color w:val="171717"/>
+          <w:sz w:val="18"/>
         </w:rPr>
-        <w:t>Общая стоимость услуг по настоящему договору составляет {{ amount_digits }} ({{ amount_words }}).</w:t>
+        <w:t>Стоимость услуг составляет {{ amount_digits }} ({{ amount_words }}). Увеличение согласованной стоимости без письменного согласия Клиента не допускается.</w:t>
       </w:r>
     </w:p>
     <w:p>
       <w:pPr>
-        <w:spacing w:before="0" w:after="60" w:line="259" w:lineRule="auto"/>
-        <w:ind w:firstLine="454"/>
+        <w:spacing w:before="0" w:after="41" w:line="247" w:lineRule="auto"/>
+        <w:ind w:left="0" w:firstLine="0"/>
         <w:jc w:val="both"/>
       </w:pPr>
       <w:r>
         <w:rPr>
           <w:rFonts w:ascii="Times New Roman" w:hAnsi="Times New Roman" w:eastAsia="Times New Roman"/>
           <w:b/>
-          <w:sz w:val="22"/>
+          <w:i w:val="0"/>
+          <w:color w:val="102A43"/>
+          <w:sz w:val="18"/>
         </w:rPr>
         <w:t xml:space="preserve">3.2. </w:t>
       </w:r>
       <w:r>
         <w:rPr>
           <w:rFonts w:ascii="Times New Roman" w:hAnsi="Times New Roman" w:eastAsia="Times New Roman"/>
-          <w:sz w:val="22"/>
+          <w:b w:val="0"/>
+          <w:i w:val="0"/>
+          <w:color w:val="171717"/>
+          <w:sz w:val="18"/>
         </w:rPr>
         <w:t>{{ payment_terms }}</w:t>
       </w:r>
     </w:p>
     <w:p>
       <w:pPr>
-        <w:spacing w:before="0" w:after="60" w:line="259" w:lineRule="auto"/>
-        <w:ind w:firstLine="454"/>
+        <w:spacing w:before="0" w:after="41" w:line="247" w:lineRule="auto"/>
+        <w:ind w:left="0" w:firstLine="0"/>
         <w:jc w:val="both"/>
       </w:pPr>
       <w:r>
         <w:rPr>
           <w:rFonts w:ascii="Times New Roman" w:hAnsi="Times New Roman" w:eastAsia="Times New Roman"/>
           <w:b/>
-          <w:sz w:val="22"/>
+          <w:i w:val="0"/>
+          <w:color w:val="102A43"/>
+          <w:sz w:val="18"/>
         </w:rPr>
         <w:t xml:space="preserve">3.3. </w:t>
       </w:r>
       <w:r>
         <w:rPr>
           <w:rFonts w:ascii="Times New Roman" w:hAnsi="Times New Roman" w:eastAsia="Times New Roman"/>
-          <w:sz w:val="22"/>
+          <w:b w:val="0"/>
+          <w:i w:val="0"/>
+          <w:color w:val="171717"/>
+          <w:sz w:val="18"/>
         </w:rPr>
-        <w:t>Оплата производится {{ executor_payment_details }}. Факт оплаты подтверждается банковским чеком, квитанцией, распиской либо иным платёжным документом.</w:t>
+        <w:t>Оплата производится по счёту или платёжной ссылке, письменно подтверждённой Исполнителем. Факт оплаты подтверждается банковским чеком, квитанцией либо иным платёжным документом.</w:t>
       </w:r>
     </w:p>
     <w:p>
       <w:pPr>
-        <w:spacing w:before="0" w:after="60" w:line="259" w:lineRule="auto"/>
-        <w:ind w:firstLine="454"/>
+        <w:spacing w:before="0" w:after="41" w:line="247" w:lineRule="auto"/>
+        <w:ind w:left="0" w:firstLine="0"/>
         <w:jc w:val="both"/>
       </w:pPr>
       <w:r>
         <w:rPr>
           <w:rFonts w:ascii="Times New Roman" w:hAnsi="Times New Roman" w:eastAsia="Times New Roman"/>
           <w:b/>
-          <w:sz w:val="22"/>
+          <w:i w:val="0"/>
+          <w:color w:val="102A43"/>
+          <w:sz w:val="18"/>
         </w:rPr>
         <w:t xml:space="preserve">3.4. </w:t>
       </w:r>
       <w:r>
         <w:rPr>
           <w:rFonts w:ascii="Times New Roman" w:hAnsi="Times New Roman" w:eastAsia="Times New Roman"/>
-          <w:sz w:val="22"/>
+          <w:b w:val="0"/>
+          <w:i w:val="0"/>
+          <w:color w:val="171717"/>
+          <w:sz w:val="18"/>
         </w:rPr>
         <w:t>{{ penalty_clause }}</w:t>
       </w:r>
@@ -386,414 +1474,975 @@
         <w:br w:type="page"/>
       </w:r>
     </w:p>
+    <w:tbl>
+      <w:tblPr>
+        <w:tblW w:type="dxa" w:w="10091"/>
+        <w:jc w:val="center"/>
+        <w:tblLayout w:type="fixed"/>
+        <w:tblLook w:firstColumn="1" w:firstRow="1" w:lastColumn="0" w:lastRow="0" w:noHBand="0" w:noVBand="1" w:val="04A0"/>
+        <w:tblBorders>
+          <w:top w:val="nil" w:sz="0" w:color="FFFFFF" w:space="0"/>
+          <w:left w:val="nil" w:sz="0" w:color="FFFFFF" w:space="0"/>
+          <w:bottom w:val="nil" w:sz="0" w:color="FFFFFF" w:space="0"/>
+          <w:right w:val="nil" w:sz="0" w:color="FFFFFF" w:space="0"/>
+          <w:insideH w:val="nil" w:sz="0" w:color="FFFFFF" w:space="0"/>
+          <w:insideV w:val="nil" w:sz="0" w:color="FFFFFF" w:space="0"/>
+        </w:tblBorders>
+      </w:tblPr>
+      <w:tblGrid>
+        <w:gridCol w:w="1757"/>
+        <w:gridCol w:w="8334"/>
+      </w:tblGrid>
+      <w:tr>
+        <w:trPr>
+          <w:cantSplit/>
+        </w:trPr>
+        <w:tc>
+          <w:tcPr>
+            <w:tcW w:type="dxa" w:w="1757"/>
+            <w:tcMar>
+              <w:top w:w="55" w:type="dxa"/>
+              <w:start w:w="50" w:type="dxa"/>
+              <w:bottom w:w="55" w:type="dxa"/>
+              <w:end w:w="50" w:type="dxa"/>
+            </w:tcMar>
+            <w:shd w:fill="F3F6F9"/>
+          </w:tcPr>
+          <w:p>
+            <w:pPr>
+              <w:keepLines/>
+              <w:jc w:val="center"/>
+            </w:pPr>
+            <w:r>
+              <w:rPr>
+                <w:rFonts w:ascii="Arial" w:hAnsi="Arial" w:eastAsia="Arial"/>
+                <w:b/>
+                <w:i w:val="0"/>
+                <w:color w:val="20364F"/>
+                <w:sz w:val="14"/>
+              </w:rPr>
+              <w:t>ЧАСТЬ II</w:t>
+            </w:r>
+          </w:p>
+        </w:tc>
+        <w:tc>
+          <w:tcPr>
+            <w:tcW w:type="dxa" w:w="8334"/>
+            <w:tcMar>
+              <w:top w:w="55" w:type="dxa"/>
+              <w:start w:w="120" w:type="dxa"/>
+              <w:bottom w:w="55" w:type="dxa"/>
+              <w:end w:w="120" w:type="dxa"/>
+            </w:tcMar>
+            <w:shd w:fill="FBF7EE"/>
+          </w:tcPr>
+          <w:p>
+            <w:pPr>
+              <w:keepLines/>
+              <w:jc w:val="left"/>
+            </w:pPr>
+            <w:r>
+              <w:rPr>
+                <w:rFonts w:ascii="Arial" w:hAnsi="Arial" w:eastAsia="Arial"/>
+                <w:b/>
+                <w:i w:val="0"/>
+                <w:color w:val="102A43"/>
+                <w:sz w:val="17"/>
+              </w:rPr>
+              <w:t>ПРАВИЛА РАБОТЫ И ГАРАНТИИ</w:t>
+              <w:br/>
+            </w:r>
+            <w:r>
+              <w:rPr>
+                <w:rFonts w:ascii="Arial" w:hAnsi="Arial" w:eastAsia="Arial"/>
+                <w:b w:val="0"/>
+                <w:i w:val="0"/>
+                <w:color w:val="667085"/>
+                <w:sz w:val="13"/>
+              </w:rPr>
+              <w:t>Права, обязанности, приёмка и электронное взаимодействие</w:t>
+            </w:r>
+          </w:p>
+        </w:tc>
+      </w:tr>
+    </w:tbl>
+    <w:tbl>
+      <w:tblPr>
+        <w:tblW w:type="dxa" w:w="10091"/>
+        <w:jc w:val="center"/>
+        <w:tblLayout w:type="fixed"/>
+        <w:tblLook w:firstColumn="1" w:firstRow="1" w:lastColumn="0" w:lastRow="0" w:noHBand="0" w:noVBand="1" w:val="04A0"/>
+        <w:tblBorders>
+          <w:top w:val="nil" w:sz="0" w:color="FFFFFF" w:space="0"/>
+          <w:left w:val="nil" w:sz="0" w:color="FFFFFF" w:space="0"/>
+          <w:bottom w:val="nil" w:sz="0" w:color="FFFFFF" w:space="0"/>
+          <w:right w:val="nil" w:sz="0" w:color="FFFFFF" w:space="0"/>
+          <w:insideH w:val="nil" w:sz="0" w:color="FFFFFF" w:space="0"/>
+          <w:insideV w:val="nil" w:sz="0" w:color="FFFFFF" w:space="0"/>
+        </w:tblBorders>
+      </w:tblPr>
+      <w:tblGrid>
+        <w:gridCol w:w="652"/>
+        <w:gridCol w:w="9439"/>
+      </w:tblGrid>
+      <w:tr>
+        <w:trPr>
+          <w:cantSplit/>
+        </w:trPr>
+        <w:tc>
+          <w:tcPr>
+            <w:tcW w:type="dxa" w:w="652"/>
+            <w:tcMar>
+              <w:top w:w="45" w:type="dxa"/>
+              <w:start w:w="80" w:type="dxa"/>
+              <w:bottom w:w="45" w:type="dxa"/>
+              <w:end w:w="80" w:type="dxa"/>
+            </w:tcMar>
+            <w:shd w:fill="F3F6F9"/>
+            <w:vAlign w:val="center"/>
+          </w:tcPr>
+          <w:p>
+            <w:pPr>
+              <w:keepLines/>
+              <w:jc w:val="center"/>
+            </w:pPr>
+            <w:r>
+              <w:rPr>
+                <w:rFonts w:ascii="Arial" w:hAnsi="Arial" w:eastAsia="Arial"/>
+                <w:b/>
+                <w:i w:val="0"/>
+                <w:color w:val="20364F"/>
+                <w:sz w:val="14"/>
+              </w:rPr>
+              <w:t>04</w:t>
+            </w:r>
+          </w:p>
+        </w:tc>
+        <w:tc>
+          <w:tcPr>
+            <w:tcW w:type="dxa" w:w="9439"/>
+            <w:tcMar>
+              <w:top w:w="45" w:type="dxa"/>
+              <w:start w:w="80" w:type="dxa"/>
+              <w:bottom w:w="45" w:type="dxa"/>
+              <w:end w:w="80" w:type="dxa"/>
+            </w:tcMar>
+          </w:tcPr>
+          <w:p>
+            <w:pPr>
+              <w:spacing w:before="0" w:after="0"/>
+              <w:keepLines/>
+              <w:pBdr>
+                <w:bottom w:val="single" w:sz="6" w:space="1" w:color="B58A3A"/>
+              </w:pBdr>
+            </w:pPr>
+            <w:r>
+              <w:rPr>
+                <w:rFonts w:ascii="Arial" w:hAnsi="Arial" w:eastAsia="Arial"/>
+                <w:b/>
+                <w:i w:val="0"/>
+                <w:color w:val="102A43"/>
+                <w:sz w:val="18"/>
+              </w:rPr>
+              <w:t>ОБЯЗАННОСТИ ИСПОЛНИТЕЛЯ</w:t>
+            </w:r>
+          </w:p>
+        </w:tc>
+      </w:tr>
+    </w:tbl>
     <w:p>
       <w:pPr>
-        <w:pStyle w:val="ZESection"/>
-        <w:keepNext/>
-        <w:jc w:val="center"/>
-      </w:pPr>
-      <w:r>
-        <w:rPr>
-          <w:rFonts w:ascii="Times New Roman" w:hAnsi="Times New Roman" w:eastAsia="Times New Roman"/>
-          <w:b/>
-          <w:color w:val="000000"/>
-          <w:sz w:val="21"/>
-        </w:rPr>
-        <w:t>4. ПРАВА И ОБЯЗАННОСТИ СТОРОН</w:t>
-      </w:r>
-    </w:p>
-    <w:p>
-      <w:pPr>
-        <w:spacing w:before="0" w:after="60" w:line="259" w:lineRule="auto"/>
-        <w:ind w:firstLine="454"/>
+        <w:spacing w:before="0" w:after="41" w:line="247" w:lineRule="auto"/>
+        <w:ind w:left="0" w:firstLine="0"/>
         <w:jc w:val="both"/>
       </w:pPr>
       <w:r>
         <w:rPr>
           <w:rFonts w:ascii="Times New Roman" w:hAnsi="Times New Roman" w:eastAsia="Times New Roman"/>
           <w:b/>
-          <w:sz w:val="22"/>
+          <w:i w:val="0"/>
+          <w:color w:val="102A43"/>
+          <w:sz w:val="18"/>
         </w:rPr>
         <w:t xml:space="preserve">4.1. </w:t>
       </w:r>
       <w:r>
         <w:rPr>
           <w:rFonts w:ascii="Times New Roman" w:hAnsi="Times New Roman" w:eastAsia="Times New Roman"/>
-          <w:sz w:val="22"/>
+          <w:b w:val="0"/>
+          <w:i w:val="0"/>
+          <w:color w:val="171717"/>
+          <w:sz w:val="18"/>
         </w:rPr>
-        <w:t>Исполнитель обязуется добросовестно подготовить документы, информировать Клиента о существенных действиях и передавать Клиенту полученные ответы и документы.</w:t>
+        <w:t>Исполнитель обязуется добросовестно анализировать материалы, готовить согласованные документы, соблюдать применимые сроки своих действий и информировать Клиента о существенных этапах.</w:t>
       </w:r>
     </w:p>
     <w:p>
       <w:pPr>
-        <w:spacing w:before="0" w:after="60" w:line="259" w:lineRule="auto"/>
-        <w:ind w:firstLine="454"/>
+        <w:spacing w:before="0" w:after="41" w:line="247" w:lineRule="auto"/>
+        <w:ind w:left="0" w:firstLine="0"/>
         <w:jc w:val="both"/>
       </w:pPr>
       <w:r>
         <w:rPr>
           <w:rFonts w:ascii="Times New Roman" w:hAnsi="Times New Roman" w:eastAsia="Times New Roman"/>
           <w:b/>
-          <w:sz w:val="22"/>
+          <w:i w:val="0"/>
+          <w:color w:val="102A43"/>
+          <w:sz w:val="18"/>
         </w:rPr>
         <w:t xml:space="preserve">4.2. </w:t>
       </w:r>
       <w:r>
         <w:rPr>
           <w:rFonts w:ascii="Times New Roman" w:hAnsi="Times New Roman" w:eastAsia="Times New Roman"/>
-          <w:sz w:val="22"/>
+          <w:b w:val="0"/>
+          <w:i w:val="0"/>
+          <w:color w:val="171717"/>
+          <w:sz w:val="18"/>
         </w:rPr>
-        <w:t>Исполнитель вправе выбирать законный способ защиты интересов Клиента, запрашивать дополнительные документы и приостанавливать работу до их предоставления.</w:t>
+        <w:t>По запросу Клиента Исполнитель предоставляет копии подготовленных и направленных документов, полученных ответов и подтверждений подачи.</w:t>
       </w:r>
     </w:p>
     <w:p>
       <w:pPr>
-        <w:spacing w:before="0" w:after="60" w:line="259" w:lineRule="auto"/>
-        <w:ind w:firstLine="454"/>
+        <w:spacing w:before="0" w:after="41" w:line="247" w:lineRule="auto"/>
+        <w:ind w:left="0" w:firstLine="0"/>
         <w:jc w:val="both"/>
       </w:pPr>
       <w:r>
         <w:rPr>
           <w:rFonts w:ascii="Times New Roman" w:hAnsi="Times New Roman" w:eastAsia="Times New Roman"/>
           <w:b/>
-          <w:sz w:val="22"/>
+          <w:i w:val="0"/>
+          <w:color w:val="102A43"/>
+          <w:sz w:val="18"/>
         </w:rPr>
         <w:t xml:space="preserve">4.3. </w:t>
       </w:r>
       <w:r>
         <w:rPr>
           <w:rFonts w:ascii="Times New Roman" w:hAnsi="Times New Roman" w:eastAsia="Times New Roman"/>
-          <w:sz w:val="22"/>
+          <w:b w:val="0"/>
+          <w:i w:val="0"/>
+          <w:color w:val="171717"/>
+          <w:sz w:val="18"/>
         </w:rPr>
-        <w:t>Клиент обязуется предоставлять достоверные и полные сведения, своевременно подписывать подготовленные документы, оплачивать обязательные государственные и нотариальные расходы, лично являться в суд, к нотариусу или ЧСИ, если это требуется.</w:t>
+        <w:t>Исполнитель выбирает законные способы сопровождения в пределах предмета договора и вправе запросить дополнительные сведения, необходимые для качественного выполнения поручения.</w:t>
       </w:r>
     </w:p>
     <w:p>
       <w:pPr>
-        <w:spacing w:before="0" w:after="60" w:line="259" w:lineRule="auto"/>
-        <w:ind w:firstLine="454"/>
+        <w:spacing w:before="0" w:after="41" w:line="247" w:lineRule="auto"/>
+        <w:ind w:left="0" w:firstLine="0"/>
         <w:jc w:val="both"/>
       </w:pPr>
       <w:r>
         <w:rPr>
           <w:rFonts w:ascii="Times New Roman" w:hAnsi="Times New Roman" w:eastAsia="Times New Roman"/>
           <w:b/>
-          <w:sz w:val="22"/>
+          <w:i w:val="0"/>
+          <w:color w:val="102A43"/>
+          <w:sz w:val="18"/>
         </w:rPr>
         <w:t xml:space="preserve">4.4. </w:t>
       </w:r>
       <w:r>
         <w:rPr>
           <w:rFonts w:ascii="Times New Roman" w:hAnsi="Times New Roman" w:eastAsia="Times New Roman"/>
-          <w:sz w:val="22"/>
+          <w:b w:val="0"/>
+          <w:i w:val="0"/>
+          <w:color w:val="171717"/>
+          <w:sz w:val="18"/>
         </w:rPr>
-        <w:t>Клиент подтверждает, что сообщил Исполнителю обо всех известных исполнительных производствах, судебных актах, соглашениях, платежах, ранее поданных заявлениях и иных обстоятельствах, влияющих на оказание услуг.</w:t>
+        <w:t>Решение суда, ЧСИ, нотариуса, банка, взыскателя или государственного органа принимается соответствующим лицом самостоятельно. Исполнитель отвечает за качество и своевременность собственных действий в согласованном объёме.</w:t>
       </w:r>
     </w:p>
+    <w:tbl>
+      <w:tblPr>
+        <w:tblW w:type="dxa" w:w="10091"/>
+        <w:jc w:val="center"/>
+        <w:tblLayout w:type="fixed"/>
+        <w:tblLook w:firstColumn="1" w:firstRow="1" w:lastColumn="0" w:lastRow="0" w:noHBand="0" w:noVBand="1" w:val="04A0"/>
+        <w:tblBorders>
+          <w:top w:val="nil" w:sz="0" w:color="FFFFFF" w:space="0"/>
+          <w:left w:val="nil" w:sz="0" w:color="FFFFFF" w:space="0"/>
+          <w:bottom w:val="nil" w:sz="0" w:color="FFFFFF" w:space="0"/>
+          <w:right w:val="nil" w:sz="0" w:color="FFFFFF" w:space="0"/>
+          <w:insideH w:val="nil" w:sz="0" w:color="FFFFFF" w:space="0"/>
+          <w:insideV w:val="nil" w:sz="0" w:color="FFFFFF" w:space="0"/>
+        </w:tblBorders>
+      </w:tblPr>
+      <w:tblGrid>
+        <w:gridCol w:w="652"/>
+        <w:gridCol w:w="9439"/>
+      </w:tblGrid>
+      <w:tr>
+        <w:trPr>
+          <w:cantSplit/>
+        </w:trPr>
+        <w:tc>
+          <w:tcPr>
+            <w:tcW w:type="dxa" w:w="652"/>
+            <w:tcMar>
+              <w:top w:w="45" w:type="dxa"/>
+              <w:start w:w="80" w:type="dxa"/>
+              <w:bottom w:w="45" w:type="dxa"/>
+              <w:end w:w="80" w:type="dxa"/>
+            </w:tcMar>
+            <w:shd w:fill="F3F6F9"/>
+            <w:vAlign w:val="center"/>
+          </w:tcPr>
+          <w:p>
+            <w:pPr>
+              <w:keepLines/>
+              <w:jc w:val="center"/>
+            </w:pPr>
+            <w:r>
+              <w:rPr>
+                <w:rFonts w:ascii="Arial" w:hAnsi="Arial" w:eastAsia="Arial"/>
+                <w:b/>
+                <w:i w:val="0"/>
+                <w:color w:val="20364F"/>
+                <w:sz w:val="14"/>
+              </w:rPr>
+              <w:t>05</w:t>
+            </w:r>
+          </w:p>
+        </w:tc>
+        <w:tc>
+          <w:tcPr>
+            <w:tcW w:type="dxa" w:w="9439"/>
+            <w:tcMar>
+              <w:top w:w="45" w:type="dxa"/>
+              <w:start w:w="80" w:type="dxa"/>
+              <w:bottom w:w="45" w:type="dxa"/>
+              <w:end w:w="80" w:type="dxa"/>
+            </w:tcMar>
+          </w:tcPr>
+          <w:p>
+            <w:pPr>
+              <w:spacing w:before="0" w:after="0"/>
+              <w:keepLines/>
+              <w:pBdr>
+                <w:bottom w:val="single" w:sz="6" w:space="1" w:color="B58A3A"/>
+              </w:pBdr>
+            </w:pPr>
+            <w:r>
+              <w:rPr>
+                <w:rFonts w:ascii="Arial" w:hAnsi="Arial" w:eastAsia="Arial"/>
+                <w:b/>
+                <w:i w:val="0"/>
+                <w:color w:val="102A43"/>
+                <w:sz w:val="18"/>
+              </w:rPr>
+              <w:t>ОБЯЗАННОСТИ КЛИЕНТА И ПРИЁМКА</w:t>
+            </w:r>
+          </w:p>
+        </w:tc>
+      </w:tr>
+    </w:tbl>
     <w:p>
       <w:pPr>
-        <w:pStyle w:val="ZESection"/>
-        <w:keepNext/>
-        <w:jc w:val="center"/>
-      </w:pPr>
-      <w:r>
-        <w:rPr>
-          <w:rFonts w:ascii="Times New Roman" w:hAnsi="Times New Roman" w:eastAsia="Times New Roman"/>
-          <w:b/>
-          <w:color w:val="000000"/>
-          <w:sz w:val="21"/>
-        </w:rPr>
-        <w:t>5. ПРИЁМКА УСЛУГ</w:t>
-      </w:r>
-    </w:p>
-    <w:p>
-      <w:pPr>
-        <w:spacing w:before="0" w:after="60" w:line="259" w:lineRule="auto"/>
-        <w:ind w:firstLine="454"/>
+        <w:spacing w:before="0" w:after="41" w:line="247" w:lineRule="auto"/>
+        <w:ind w:left="0" w:firstLine="0"/>
         <w:jc w:val="both"/>
       </w:pPr>
       <w:r>
         <w:rPr>
           <w:rFonts w:ascii="Times New Roman" w:hAnsi="Times New Roman" w:eastAsia="Times New Roman"/>
           <w:b/>
-          <w:sz w:val="22"/>
+          <w:i w:val="0"/>
+          <w:color w:val="102A43"/>
+          <w:sz w:val="18"/>
         </w:rPr>
         <w:t xml:space="preserve">5.1. </w:t>
       </w:r>
       <w:r>
         <w:rPr>
           <w:rFonts w:ascii="Times New Roman" w:hAnsi="Times New Roman" w:eastAsia="Times New Roman"/>
-          <w:sz w:val="22"/>
+          <w:b w:val="0"/>
+          <w:i w:val="0"/>
+          <w:color w:val="171717"/>
+          <w:sz w:val="18"/>
         </w:rPr>
-        <w:t>После достижения предусмотренного договором результата Исполнитель направляет Клиенту итоговый документ или уведомление о результате посредством Telegram, WhatsApp или электронной почты.</w:t>
+        <w:t>Клиент предоставляет полные и достоверные сведения, сообщает о платежах, соглашениях, судебных актах и иных обстоятельствах, влияющих на дело, и своевременно подписывает документы, когда требуется его личная подпись или ЭЦП.</w:t>
       </w:r>
     </w:p>
     <w:p>
       <w:pPr>
-        <w:spacing w:before="0" w:after="60" w:line="259" w:lineRule="auto"/>
-        <w:ind w:firstLine="454"/>
+        <w:spacing w:before="0" w:after="41" w:line="247" w:lineRule="auto"/>
+        <w:ind w:left="0" w:firstLine="0"/>
         <w:jc w:val="both"/>
       </w:pPr>
       <w:r>
         <w:rPr>
           <w:rFonts w:ascii="Times New Roman" w:hAnsi="Times New Roman" w:eastAsia="Times New Roman"/>
           <w:b/>
-          <w:sz w:val="22"/>
+          <w:i w:val="0"/>
+          <w:color w:val="102A43"/>
+          <w:sz w:val="18"/>
         </w:rPr>
         <w:t xml:space="preserve">5.2. </w:t>
       </w:r>
       <w:r>
         <w:rPr>
           <w:rFonts w:ascii="Times New Roman" w:hAnsi="Times New Roman" w:eastAsia="Times New Roman"/>
-          <w:sz w:val="22"/>
+          <w:b w:val="0"/>
+          <w:i w:val="0"/>
+          <w:color w:val="171717"/>
+          <w:sz w:val="18"/>
         </w:rPr>
-        <w:t>Если Клиент в течение 3 (трёх) календарных дней не направит мотивированные письменные возражения с указанием конкретных недостатков, услуги считаются оказанными и принятыми в полном объёме.</w:t>
+        <w:t>Исполнитель направляет Клиенту результат и подтверждающие материалы. Клиент вправе в течение 5 рабочих дней направить конкретные мотивированные замечания. При их отсутствии соответствующий объём услуг считается принятым.</w:t>
       </w:r>
     </w:p>
     <w:p>
       <w:pPr>
-        <w:pStyle w:val="ZESection"/>
-        <w:keepNext/>
-        <w:jc w:val="center"/>
-      </w:pPr>
-      <w:r>
-        <w:rPr>
-          <w:rFonts w:ascii="Times New Roman" w:hAnsi="Times New Roman" w:eastAsia="Times New Roman"/>
-          <w:b/>
-          <w:color w:val="000000"/>
-          <w:sz w:val="21"/>
-        </w:rPr>
-        <w:t>6. ОТВЕТСТВЕННОСТЬ И РАЗРЕШЕНИЕ СПОРОВ</w:t>
-      </w:r>
-    </w:p>
-    <w:p>
-      <w:pPr>
-        <w:spacing w:before="0" w:after="60" w:line="259" w:lineRule="auto"/>
-        <w:ind w:firstLine="454"/>
+        <w:spacing w:before="0" w:after="41" w:line="247" w:lineRule="auto"/>
+        <w:ind w:left="0" w:firstLine="0"/>
         <w:jc w:val="both"/>
       </w:pPr>
       <w:r>
         <w:rPr>
           <w:rFonts w:ascii="Times New Roman" w:hAnsi="Times New Roman" w:eastAsia="Times New Roman"/>
           <w:b/>
-          <w:sz w:val="22"/>
+          <w:i w:val="0"/>
+          <w:color w:val="102A43"/>
+          <w:sz w:val="18"/>
+        </w:rPr>
+        <w:t xml:space="preserve">5.3. </w:t>
+      </w:r>
+      <w:r>
+        <w:rPr>
+          <w:rFonts w:ascii="Times New Roman" w:hAnsi="Times New Roman" w:eastAsia="Times New Roman"/>
+          <w:b w:val="0"/>
+          <w:i w:val="0"/>
+          <w:color w:val="171717"/>
+          <w:sz w:val="18"/>
+        </w:rPr>
+        <w:t>Подтверждённые недостатки подготовленных Исполнителем документов устраняются без дополнительной оплаты в разумный срок.</w:t>
+      </w:r>
+    </w:p>
+    <w:tbl>
+      <w:tblPr>
+        <w:tblW w:type="dxa" w:w="10091"/>
+        <w:jc w:val="center"/>
+        <w:tblLayout w:type="fixed"/>
+        <w:tblLook w:firstColumn="1" w:firstRow="1" w:lastColumn="0" w:lastRow="0" w:noHBand="0" w:noVBand="1" w:val="04A0"/>
+        <w:tblBorders>
+          <w:top w:val="nil" w:sz="0" w:color="FFFFFF" w:space="0"/>
+          <w:left w:val="nil" w:sz="0" w:color="FFFFFF" w:space="0"/>
+          <w:bottom w:val="nil" w:sz="0" w:color="FFFFFF" w:space="0"/>
+          <w:right w:val="nil" w:sz="0" w:color="FFFFFF" w:space="0"/>
+          <w:insideH w:val="nil" w:sz="0" w:color="FFFFFF" w:space="0"/>
+          <w:insideV w:val="nil" w:sz="0" w:color="FFFFFF" w:space="0"/>
+        </w:tblBorders>
+      </w:tblPr>
+      <w:tblGrid>
+        <w:gridCol w:w="652"/>
+        <w:gridCol w:w="9439"/>
+      </w:tblGrid>
+      <w:tr>
+        <w:trPr>
+          <w:cantSplit/>
+        </w:trPr>
+        <w:tc>
+          <w:tcPr>
+            <w:tcW w:type="dxa" w:w="652"/>
+            <w:tcMar>
+              <w:top w:w="45" w:type="dxa"/>
+              <w:start w:w="80" w:type="dxa"/>
+              <w:bottom w:w="45" w:type="dxa"/>
+              <w:end w:w="80" w:type="dxa"/>
+            </w:tcMar>
+            <w:shd w:fill="F3F6F9"/>
+            <w:vAlign w:val="center"/>
+          </w:tcPr>
+          <w:p>
+            <w:pPr>
+              <w:keepLines/>
+              <w:jc w:val="center"/>
+            </w:pPr>
+            <w:r>
+              <w:rPr>
+                <w:rFonts w:ascii="Arial" w:hAnsi="Arial" w:eastAsia="Arial"/>
+                <w:b/>
+                <w:i w:val="0"/>
+                <w:color w:val="20364F"/>
+                <w:sz w:val="14"/>
+              </w:rPr>
+              <w:t>06</w:t>
+            </w:r>
+          </w:p>
+        </w:tc>
+        <w:tc>
+          <w:tcPr>
+            <w:tcW w:type="dxa" w:w="9439"/>
+            <w:tcMar>
+              <w:top w:w="45" w:type="dxa"/>
+              <w:start w:w="80" w:type="dxa"/>
+              <w:bottom w:w="45" w:type="dxa"/>
+              <w:end w:w="80" w:type="dxa"/>
+            </w:tcMar>
+          </w:tcPr>
+          <w:p>
+            <w:pPr>
+              <w:spacing w:before="0" w:after="0"/>
+              <w:keepLines/>
+              <w:pBdr>
+                <w:bottom w:val="single" w:sz="6" w:space="1" w:color="B58A3A"/>
+              </w:pBdr>
+            </w:pPr>
+            <w:r>
+              <w:rPr>
+                <w:rFonts w:ascii="Arial" w:hAnsi="Arial" w:eastAsia="Arial"/>
+                <w:b/>
+                <w:i w:val="0"/>
+                <w:color w:val="102A43"/>
+                <w:sz w:val="18"/>
+              </w:rPr>
+              <w:t>ПРЕКРАЩЕНИЕ, РАСХОДЫ И ОТВЕТСТВЕННОСТЬ</w:t>
+            </w:r>
+          </w:p>
+        </w:tc>
+      </w:tr>
+    </w:tbl>
+    <w:p>
+      <w:pPr>
+        <w:spacing w:before="0" w:after="41" w:line="247" w:lineRule="auto"/>
+        <w:ind w:left="0" w:firstLine="0"/>
+        <w:jc w:val="both"/>
+      </w:pPr>
+      <w:r>
+        <w:rPr>
+          <w:rFonts w:ascii="Times New Roman" w:hAnsi="Times New Roman" w:eastAsia="Times New Roman"/>
+          <w:b/>
+          <w:i w:val="0"/>
+          <w:color w:val="102A43"/>
+          <w:sz w:val="18"/>
         </w:rPr>
         <w:t xml:space="preserve">6.1. </w:t>
       </w:r>
       <w:r>
         <w:rPr>
           <w:rFonts w:ascii="Times New Roman" w:hAnsi="Times New Roman" w:eastAsia="Times New Roman"/>
-          <w:sz w:val="22"/>
+          <w:b w:val="0"/>
+          <w:i w:val="0"/>
+          <w:color w:val="171717"/>
+          <w:sz w:val="18"/>
         </w:rPr>
-        <w:t>Стороны несут ответственность в соответствии с законодательством Республики Казахстан и настоящим договором.</w:t>
+        <w:t>Клиент вправе отказаться от договора. Стороны производят расчёт исходя из фактически выполненных согласованных действий и документально подтверждённых расходов; неиспользованный остаток оплаты возвращается после сверки.</w:t>
       </w:r>
     </w:p>
     <w:p>
       <w:pPr>
-        <w:spacing w:before="0" w:after="60" w:line="259" w:lineRule="auto"/>
-        <w:ind w:firstLine="454"/>
+        <w:spacing w:before="0" w:after="41" w:line="247" w:lineRule="auto"/>
+        <w:ind w:left="0" w:firstLine="0"/>
         <w:jc w:val="both"/>
       </w:pPr>
       <w:r>
         <w:rPr>
           <w:rFonts w:ascii="Times New Roman" w:hAnsi="Times New Roman" w:eastAsia="Times New Roman"/>
           <w:b/>
-          <w:sz w:val="22"/>
+          <w:i w:val="0"/>
+          <w:color w:val="102A43"/>
+          <w:sz w:val="18"/>
         </w:rPr>
         <w:t xml:space="preserve">6.2. </w:t>
       </w:r>
       <w:r>
         <w:rPr>
           <w:rFonts w:ascii="Times New Roman" w:hAnsi="Times New Roman" w:eastAsia="Times New Roman"/>
-          <w:sz w:val="22"/>
+          <w:b w:val="0"/>
+          <w:i w:val="0"/>
+          <w:color w:val="171717"/>
+          <w:sz w:val="18"/>
         </w:rPr>
-        <w:t>Исполнитель не отвечает за незаконные либо несвоевременные действия или бездействие нотариуса, ЧСИ, суда, взыскателя, банка и государственных органов, но обязуется подготовить и передать Клиенту предусмотренные договором документы.</w:t>
+        <w:t>Обязательные платежи третьим лицам — государственная пошлина, нотариальные, почтовые и иные согласованные расходы — оплачиваются отдельно только после предварительного уведомления Клиента, если иное прямо не включено в стоимость.</w:t>
       </w:r>
     </w:p>
     <w:p>
       <w:pPr>
-        <w:spacing w:before="0" w:after="60" w:line="259" w:lineRule="auto"/>
-        <w:ind w:firstLine="454"/>
+        <w:spacing w:before="0" w:after="41" w:line="247" w:lineRule="auto"/>
+        <w:ind w:left="0" w:firstLine="0"/>
         <w:jc w:val="both"/>
       </w:pPr>
       <w:r>
         <w:rPr>
           <w:rFonts w:ascii="Times New Roman" w:hAnsi="Times New Roman" w:eastAsia="Times New Roman"/>
           <w:b/>
-          <w:sz w:val="22"/>
+          <w:i w:val="0"/>
+          <w:color w:val="102A43"/>
+          <w:sz w:val="18"/>
         </w:rPr>
         <w:t xml:space="preserve">6.3. </w:t>
       </w:r>
       <w:r>
         <w:rPr>
           <w:rFonts w:ascii="Times New Roman" w:hAnsi="Times New Roman" w:eastAsia="Times New Roman"/>
-          <w:sz w:val="22"/>
+          <w:b w:val="0"/>
+          <w:i w:val="0"/>
+          <w:color w:val="171717"/>
+          <w:sz w:val="18"/>
         </w:rPr>
-        <w:t>Стороны признают юридическую силу переписки и документов, переданных через WhatsApp, Telegram, SMS, электронную почту и иные согласованные средства связи, если возможно достоверно определить отправителя, содержание и дату сообщения.</w:t>
+        <w:t>Исполнитель вправе приостановить работу, если без документов или действий Клиента продолжение объективно невозможно, предварительно сообщив, что требуется и как это влияет на срок.</w:t>
       </w:r>
     </w:p>
     <w:p>
       <w:pPr>
-        <w:spacing w:before="0" w:after="60" w:line="259" w:lineRule="auto"/>
-        <w:ind w:firstLine="454"/>
+        <w:spacing w:before="0" w:after="41" w:line="247" w:lineRule="auto"/>
+        <w:ind w:left="0" w:firstLine="0"/>
         <w:jc w:val="both"/>
       </w:pPr>
       <w:r>
         <w:rPr>
           <w:rFonts w:ascii="Times New Roman" w:hAnsi="Times New Roman" w:eastAsia="Times New Roman"/>
           <w:b/>
-          <w:sz w:val="22"/>
+          <w:i w:val="0"/>
+          <w:color w:val="102A43"/>
+          <w:sz w:val="18"/>
         </w:rPr>
         <w:t xml:space="preserve">6.4. </w:t>
       </w:r>
       <w:r>
         <w:rPr>
           <w:rFonts w:ascii="Times New Roman" w:hAnsi="Times New Roman" w:eastAsia="Times New Roman"/>
-          <w:sz w:val="22"/>
+          <w:b w:val="0"/>
+          <w:i w:val="0"/>
+          <w:color w:val="171717"/>
+          <w:sz w:val="18"/>
         </w:rPr>
-        <w:t>До обращения в суд заинтересованная Сторона направляет письменную претензию. Срок ответа - 5 (пять) рабочих дней с момента её получения. При недостижении соглашения спор рассматривается в установленном законом порядке.</w:t>
+        <w:t>Исполнитель вправе прекратить договор при требовании незаконных действий, заведомо недостоверных сведениях или существенном повторном нарушении обязанностей Клиентом после письменного предупреждения и предоставления разумного срока для устранения нарушения.</w:t>
       </w:r>
     </w:p>
+    <w:tbl>
+      <w:tblPr>
+        <w:tblW w:type="dxa" w:w="10091"/>
+        <w:jc w:val="center"/>
+        <w:tblLayout w:type="fixed"/>
+        <w:tblLook w:firstColumn="1" w:firstRow="1" w:lastColumn="0" w:lastRow="0" w:noHBand="0" w:noVBand="1" w:val="04A0"/>
+        <w:tblBorders>
+          <w:top w:val="nil" w:sz="0" w:color="FFFFFF" w:space="0"/>
+          <w:left w:val="nil" w:sz="0" w:color="FFFFFF" w:space="0"/>
+          <w:bottom w:val="nil" w:sz="0" w:color="FFFFFF" w:space="0"/>
+          <w:right w:val="nil" w:sz="0" w:color="FFFFFF" w:space="0"/>
+          <w:insideH w:val="nil" w:sz="0" w:color="FFFFFF" w:space="0"/>
+          <w:insideV w:val="nil" w:sz="0" w:color="FFFFFF" w:space="0"/>
+        </w:tblBorders>
+      </w:tblPr>
+      <w:tblGrid>
+        <w:gridCol w:w="652"/>
+        <w:gridCol w:w="9439"/>
+      </w:tblGrid>
+      <w:tr>
+        <w:trPr>
+          <w:cantSplit/>
+        </w:trPr>
+        <w:tc>
+          <w:tcPr>
+            <w:tcW w:type="dxa" w:w="652"/>
+            <w:tcMar>
+              <w:top w:w="45" w:type="dxa"/>
+              <w:start w:w="80" w:type="dxa"/>
+              <w:bottom w:w="45" w:type="dxa"/>
+              <w:end w:w="80" w:type="dxa"/>
+            </w:tcMar>
+            <w:shd w:fill="F3F6F9"/>
+            <w:vAlign w:val="center"/>
+          </w:tcPr>
+          <w:p>
+            <w:pPr>
+              <w:keepLines/>
+              <w:jc w:val="center"/>
+            </w:pPr>
+            <w:r>
+              <w:rPr>
+                <w:rFonts w:ascii="Arial" w:hAnsi="Arial" w:eastAsia="Arial"/>
+                <w:b/>
+                <w:i w:val="0"/>
+                <w:color w:val="20364F"/>
+                <w:sz w:val="14"/>
+              </w:rPr>
+              <w:t>07</w:t>
+            </w:r>
+          </w:p>
+        </w:tc>
+        <w:tc>
+          <w:tcPr>
+            <w:tcW w:type="dxa" w:w="9439"/>
+            <w:tcMar>
+              <w:top w:w="45" w:type="dxa"/>
+              <w:start w:w="80" w:type="dxa"/>
+              <w:bottom w:w="45" w:type="dxa"/>
+              <w:end w:w="80" w:type="dxa"/>
+            </w:tcMar>
+          </w:tcPr>
+          <w:p>
+            <w:pPr>
+              <w:spacing w:before="0" w:after="0"/>
+              <w:keepLines/>
+              <w:pBdr>
+                <w:bottom w:val="single" w:sz="6" w:space="1" w:color="B58A3A"/>
+              </w:pBdr>
+            </w:pPr>
+            <w:r>
+              <w:rPr>
+                <w:rFonts w:ascii="Arial" w:hAnsi="Arial" w:eastAsia="Arial"/>
+                <w:b/>
+                <w:i w:val="0"/>
+                <w:color w:val="102A43"/>
+                <w:sz w:val="18"/>
+              </w:rPr>
+              <w:t>ПЕРСОНАЛЬНЫЕ ДАННЫЕ И ЭЛЕКТРОННОЕ ВЗАИМОДЕЙСТВИЕ</w:t>
+            </w:r>
+          </w:p>
+        </w:tc>
+      </w:tr>
+    </w:tbl>
     <w:p>
       <w:pPr>
-        <w:pStyle w:val="ZESection"/>
-        <w:keepNext/>
-        <w:jc w:val="center"/>
-      </w:pPr>
-      <w:r>
-        <w:rPr>
-          <w:rFonts w:ascii="Times New Roman" w:hAnsi="Times New Roman" w:eastAsia="Times New Roman"/>
-          <w:b/>
-          <w:color w:val="000000"/>
-          <w:sz w:val="21"/>
-        </w:rPr>
-        <w:t>7. ПЕРСОНАЛЬНЫЕ ДАННЫЕ И УВЕДОМЛЕНИЯ</w:t>
-      </w:r>
-    </w:p>
-    <w:p>
-      <w:pPr>
-        <w:spacing w:before="0" w:after="60" w:line="259" w:lineRule="auto"/>
-        <w:ind w:firstLine="454"/>
+        <w:spacing w:before="0" w:after="41" w:line="247" w:lineRule="auto"/>
+        <w:ind w:left="0" w:firstLine="0"/>
         <w:jc w:val="both"/>
       </w:pPr>
       <w:r>
         <w:rPr>
           <w:rFonts w:ascii="Times New Roman" w:hAnsi="Times New Roman" w:eastAsia="Times New Roman"/>
           <w:b/>
-          <w:sz w:val="22"/>
+          <w:i w:val="0"/>
+          <w:color w:val="102A43"/>
+          <w:sz w:val="18"/>
         </w:rPr>
         <w:t xml:space="preserve">7.1. </w:t>
       </w:r>
       <w:r>
         <w:rPr>
           <w:rFonts w:ascii="Times New Roman" w:hAnsi="Times New Roman" w:eastAsia="Times New Roman"/>
-          <w:sz w:val="22"/>
+          <w:b w:val="0"/>
+          <w:i w:val="0"/>
+          <w:color w:val="171717"/>
+          <w:sz w:val="18"/>
         </w:rPr>
-        <w:t>Подписывая настоящий договор, Клиент даёт согласие на сбор и обработку Исполнителем своих персональных данных в объёме, необходимом для исполнения настоящего договора.</w:t>
+        <w:t>Клиент даёт согласие на сбор, обработку и хранение персональных данных в объёме, необходимом для исполнения договора, подготовки и направления документов, связи и хранения доказательств выполненной работы.</w:t>
       </w:r>
     </w:p>
     <w:p>
       <w:pPr>
-        <w:spacing w:before="0" w:after="60" w:line="259" w:lineRule="auto"/>
-        <w:ind w:firstLine="454"/>
+        <w:spacing w:before="0" w:after="41" w:line="247" w:lineRule="auto"/>
+        <w:ind w:left="0" w:firstLine="0"/>
         <w:jc w:val="both"/>
       </w:pPr>
       <w:r>
         <w:rPr>
           <w:rFonts w:ascii="Times New Roman" w:hAnsi="Times New Roman" w:eastAsia="Times New Roman"/>
           <w:b/>
-          <w:sz w:val="22"/>
+          <w:i w:val="0"/>
+          <w:color w:val="102A43"/>
+          <w:sz w:val="18"/>
         </w:rPr>
         <w:t xml:space="preserve">7.2. </w:t>
       </w:r>
       <w:r>
         <w:rPr>
           <w:rFonts w:ascii="Times New Roman" w:hAnsi="Times New Roman" w:eastAsia="Times New Roman"/>
-          <w:sz w:val="22"/>
+          <w:b w:val="0"/>
+          <w:i w:val="0"/>
+          <w:color w:val="171717"/>
+          <w:sz w:val="18"/>
         </w:rPr>
-        <w:t>Уведомления направляются по телефону, WhatsApp, Telegram или электронной почте, указанным Сторонами, и считаются полученными в день отправки.</w:t>
+        <w:t>Исполнитель принимает разумные меры защиты персональных данных и не передаёт их третьим лицам, кроме случаев, необходимых для исполнения поручения или предусмотренных законом.</w:t>
       </w:r>
     </w:p>
     <w:p>
       <w:pPr>
-        <w:pStyle w:val="ZESection"/>
-        <w:keepNext/>
-        <w:jc w:val="center"/>
-      </w:pPr>
-      <w:r>
-        <w:rPr>
-          <w:rFonts w:ascii="Times New Roman" w:hAnsi="Times New Roman" w:eastAsia="Times New Roman"/>
-          <w:b/>
-          <w:color w:val="000000"/>
-          <w:sz w:val="21"/>
-        </w:rPr>
-        <w:t>8. ЗАКЛЮЧИТЕЛЬНЫЕ ПОЛОЖЕНИЯ</w:t>
-      </w:r>
-    </w:p>
-    <w:p>
-      <w:pPr>
-        <w:spacing w:before="0" w:after="60" w:line="259" w:lineRule="auto"/>
-        <w:ind w:firstLine="454"/>
+        <w:spacing w:before="0" w:after="41" w:line="247" w:lineRule="auto"/>
+        <w:ind w:left="0" w:firstLine="0"/>
         <w:jc w:val="both"/>
       </w:pPr>
       <w:r>
         <w:rPr>
           <w:rFonts w:ascii="Times New Roman" w:hAnsi="Times New Roman" w:eastAsia="Times New Roman"/>
           <w:b/>
-          <w:sz w:val="22"/>
+          <w:i w:val="0"/>
+          <w:color w:val="102A43"/>
+          <w:sz w:val="18"/>
+        </w:rPr>
+        <w:t xml:space="preserve">7.3. </w:t>
+      </w:r>
+      <w:r>
+        <w:rPr>
+          <w:rFonts w:ascii="Times New Roman" w:hAnsi="Times New Roman" w:eastAsia="Times New Roman"/>
+          <w:b w:val="0"/>
+          <w:i w:val="0"/>
+          <w:color w:val="171717"/>
+          <w:sz w:val="18"/>
+        </w:rPr>
+        <w:t>Переписка, скан-копии и сообщения, позволяющие определить отправителя, содержание и дату, могут использоваться как доказательство согласований и уведомлений. Документ с ЭЦП применяется в случаях, установленных законодательством Республики Казахстан.</w:t>
+      </w:r>
+    </w:p>
+    <w:tbl>
+      <w:tblPr>
+        <w:tblW w:type="dxa" w:w="10091"/>
+        <w:jc w:val="center"/>
+        <w:tblLayout w:type="fixed"/>
+        <w:tblLook w:firstColumn="1" w:firstRow="1" w:lastColumn="0" w:lastRow="0" w:noHBand="0" w:noVBand="1" w:val="04A0"/>
+        <w:tblBorders>
+          <w:top w:val="nil" w:sz="0" w:color="FFFFFF" w:space="0"/>
+          <w:left w:val="nil" w:sz="0" w:color="FFFFFF" w:space="0"/>
+          <w:bottom w:val="nil" w:sz="0" w:color="FFFFFF" w:space="0"/>
+          <w:right w:val="nil" w:sz="0" w:color="FFFFFF" w:space="0"/>
+          <w:insideH w:val="nil" w:sz="0" w:color="FFFFFF" w:space="0"/>
+          <w:insideV w:val="nil" w:sz="0" w:color="FFFFFF" w:space="0"/>
+        </w:tblBorders>
+      </w:tblPr>
+      <w:tblGrid>
+        <w:gridCol w:w="652"/>
+        <w:gridCol w:w="9439"/>
+      </w:tblGrid>
+      <w:tr>
+        <w:trPr>
+          <w:cantSplit/>
+        </w:trPr>
+        <w:tc>
+          <w:tcPr>
+            <w:tcW w:type="dxa" w:w="652"/>
+            <w:tcMar>
+              <w:top w:w="45" w:type="dxa"/>
+              <w:start w:w="80" w:type="dxa"/>
+              <w:bottom w:w="45" w:type="dxa"/>
+              <w:end w:w="80" w:type="dxa"/>
+            </w:tcMar>
+            <w:shd w:fill="F3F6F9"/>
+            <w:vAlign w:val="center"/>
+          </w:tcPr>
+          <w:p>
+            <w:pPr>
+              <w:keepLines/>
+              <w:jc w:val="center"/>
+            </w:pPr>
+            <w:r>
+              <w:rPr>
+                <w:rFonts w:ascii="Arial" w:hAnsi="Arial" w:eastAsia="Arial"/>
+                <w:b/>
+                <w:i w:val="0"/>
+                <w:color w:val="20364F"/>
+                <w:sz w:val="14"/>
+              </w:rPr>
+              <w:t>08</w:t>
+            </w:r>
+          </w:p>
+        </w:tc>
+        <w:tc>
+          <w:tcPr>
+            <w:tcW w:type="dxa" w:w="9439"/>
+            <w:tcMar>
+              <w:top w:w="45" w:type="dxa"/>
+              <w:start w:w="80" w:type="dxa"/>
+              <w:bottom w:w="45" w:type="dxa"/>
+              <w:end w:w="80" w:type="dxa"/>
+            </w:tcMar>
+          </w:tcPr>
+          <w:p>
+            <w:pPr>
+              <w:spacing w:before="0" w:after="0"/>
+              <w:keepLines/>
+              <w:pBdr>
+                <w:bottom w:val="single" w:sz="6" w:space="1" w:color="B58A3A"/>
+              </w:pBdr>
+            </w:pPr>
+            <w:r>
+              <w:rPr>
+                <w:rFonts w:ascii="Arial" w:hAnsi="Arial" w:eastAsia="Arial"/>
+                <w:b/>
+                <w:i w:val="0"/>
+                <w:color w:val="102A43"/>
+                <w:sz w:val="18"/>
+              </w:rPr>
+              <w:t>ЗАКЛЮЧИТЕЛЬНЫЕ ПОЛОЖЕНИЯ</w:t>
+            </w:r>
+          </w:p>
+        </w:tc>
+      </w:tr>
+    </w:tbl>
+    <w:p>
+      <w:pPr>
+        <w:spacing w:before="0" w:after="41" w:line="247" w:lineRule="auto"/>
+        <w:ind w:left="0" w:firstLine="0"/>
+        <w:jc w:val="both"/>
+      </w:pPr>
+      <w:r>
+        <w:rPr>
+          <w:rFonts w:ascii="Times New Roman" w:hAnsi="Times New Roman" w:eastAsia="Times New Roman"/>
+          <w:b/>
+          <w:i w:val="0"/>
+          <w:color w:val="102A43"/>
+          <w:sz w:val="18"/>
         </w:rPr>
         <w:t xml:space="preserve">8.1. </w:t>
       </w:r>
       <w:r>
         <w:rPr>
           <w:rFonts w:ascii="Times New Roman" w:hAnsi="Times New Roman" w:eastAsia="Times New Roman"/>
-          <w:sz w:val="22"/>
+          <w:b w:val="0"/>
+          <w:i w:val="0"/>
+          <w:color w:val="171717"/>
+          <w:sz w:val="18"/>
         </w:rPr>
-        <w:t>Настоящий договор вступает в силу с даты его подписания и действует до полного исполнения Сторонами обязательств.</w:t>
+        <w:t>Договор вступает в силу с даты подписания на бумаге, ЭЦП либо простой электронной подписью через персональную страницу ZakonExpert с явным подтверждением согласия и действует до полного исполнения обязательств.</w:t>
       </w:r>
     </w:p>
     <w:p>
       <w:pPr>
-        <w:spacing w:before="0" w:after="60" w:line="259" w:lineRule="auto"/>
-        <w:ind w:firstLine="454"/>
+        <w:spacing w:before="0" w:after="41" w:line="247" w:lineRule="auto"/>
+        <w:ind w:left="0" w:firstLine="0"/>
         <w:jc w:val="both"/>
       </w:pPr>
       <w:r>
         <w:rPr>
           <w:rFonts w:ascii="Times New Roman" w:hAnsi="Times New Roman" w:eastAsia="Times New Roman"/>
           <w:b/>
-          <w:sz w:val="22"/>
+          <w:i w:val="0"/>
+          <w:color w:val="102A43"/>
+          <w:sz w:val="18"/>
         </w:rPr>
         <w:t xml:space="preserve">8.2. </w:t>
       </w:r>
       <w:r>
         <w:rPr>
           <w:rFonts w:ascii="Times New Roman" w:hAnsi="Times New Roman" w:eastAsia="Times New Roman"/>
-          <w:sz w:val="22"/>
+          <w:b w:val="0"/>
+          <w:i w:val="0"/>
+          <w:color w:val="171717"/>
+          <w:sz w:val="18"/>
         </w:rPr>
-        <w:t>Изменения и дополнения действительны при письменном согласовании Сторонами, включая согласование через WhatsApp, Telegram или электронную переписку.</w:t>
+        <w:t>Изменения действительны при письменном согласовании, включая электронную переписку, позволяющую определить Стороны и содержание изменения.</w:t>
       </w:r>
     </w:p>
     <w:p>
       <w:pPr>
-        <w:spacing w:before="0" w:after="60" w:line="259" w:lineRule="auto"/>
-        <w:ind w:firstLine="454"/>
+        <w:spacing w:before="0" w:after="41" w:line="247" w:lineRule="auto"/>
+        <w:ind w:left="0" w:firstLine="0"/>
         <w:jc w:val="both"/>
       </w:pPr>
       <w:r>
         <w:rPr>
           <w:rFonts w:ascii="Times New Roman" w:hAnsi="Times New Roman" w:eastAsia="Times New Roman"/>
           <w:b/>
-          <w:sz w:val="22"/>
+          <w:i w:val="0"/>
+          <w:color w:val="102A43"/>
+          <w:sz w:val="18"/>
         </w:rPr>
         <w:t xml:space="preserve">8.3. </w:t>
       </w:r>
       <w:r>
         <w:rPr>
           <w:rFonts w:ascii="Times New Roman" w:hAnsi="Times New Roman" w:eastAsia="Times New Roman"/>
-          <w:sz w:val="22"/>
+          <w:b w:val="0"/>
+          <w:i w:val="0"/>
+          <w:color w:val="171717"/>
+          <w:sz w:val="18"/>
         </w:rPr>
-        <w:t>Договор составлен в двух экземплярах, имеющих одинаковую юридическую силу, либо подписан посредством простой электронной подписи Клиента.</w:t>
+        <w:t>Недействительность одного положения не влечёт недействительность остальных положений договора. Каждая Сторона вправе сохранить и получить свою копию договора.</w:t>
       </w:r>
     </w:p>
     <w:p>
@@ -801,121 +2450,210 @@
         <w:br w:type="page"/>
       </w:r>
     </w:p>
-    <w:p>
-      <w:pPr>
-        <w:pStyle w:val="ZESection"/>
-        <w:keepNext/>
-        <w:jc w:val="center"/>
-      </w:pPr>
-      <w:r>
-        <w:rPr>
-          <w:rFonts w:ascii="Times New Roman" w:hAnsi="Times New Roman" w:eastAsia="Times New Roman"/>
-          <w:b/>
-          <w:color w:val="000000"/>
-          <w:sz w:val="21"/>
-        </w:rPr>
-        <w:t>9. РЕКВИЗИТЫ И ПОДПИСИ СТОРОН</w:t>
-      </w:r>
-    </w:p>
     <w:tbl>
       <w:tblPr>
-        <w:tblW w:type="dxa" w:w="9865"/>
+        <w:tblW w:type="dxa" w:w="10092"/>
         <w:jc w:val="center"/>
         <w:tblLayout w:type="fixed"/>
         <w:tblLook w:firstColumn="1" w:firstRow="1" w:lastColumn="0" w:lastRow="0" w:noHBand="0" w:noVBand="1" w:val="04A0"/>
-        <w:tblInd w:w="0" w:type="dxa"/>
         <w:tblBorders>
-          <w:top w:val="single" w:sz="6" w:space="0" w:color="B8C4D1"/>
-          <w:left w:val="single" w:sz="6" w:space="0" w:color="B8C4D1"/>
-          <w:bottom w:val="single" w:sz="6" w:space="0" w:color="B8C4D1"/>
-          <w:right w:val="single" w:sz="6" w:space="0" w:color="B8C4D1"/>
-          <w:insideH w:val="single" w:sz="6" w:space="0" w:color="B8C4D1"/>
-          <w:insideV w:val="single" w:sz="6" w:space="0" w:color="B8C4D1"/>
+          <w:top w:val="single" w:sz="5" w:color="D1D8E0" w:space="0"/>
+          <w:left w:val="single" w:sz="5" w:color="D1D8E0" w:space="0"/>
+          <w:bottom w:val="single" w:sz="5" w:color="D1D8E0" w:space="0"/>
+          <w:right w:val="single" w:sz="5" w:color="D1D8E0" w:space="0"/>
+          <w:insideH w:val="single" w:sz="5" w:color="D1D8E0" w:space="0"/>
+          <w:insideV w:val="single" w:sz="5" w:color="D1D8E0" w:space="0"/>
         </w:tblBorders>
       </w:tblPr>
       <w:tblGrid>
-        <w:gridCol w:w="4932"/>
-        <w:gridCol w:w="4933"/>
+        <w:gridCol w:w="3364"/>
+        <w:gridCol w:w="3364"/>
+        <w:gridCol w:w="3364"/>
       </w:tblGrid>
       <w:tr>
         <w:trPr>
-          <w:tblHeader w:val="true"/>
+          <w:cantSplit/>
         </w:trPr>
         <w:tc>
           <w:tcPr>
-            <w:tcW w:type="dxa" w:w="4932"/>
+            <w:tcW w:type="dxa" w:w="3364"/>
             <w:tcMar>
-              <w:top w:w="80" w:type="dxa"/>
-              <w:start w:w="120" w:type="dxa"/>
-              <w:bottom w:w="80" w:type="dxa"/>
-              <w:end w:w="120" w:type="dxa"/>
+              <w:top w:w="85" w:type="dxa"/>
+              <w:start w:w="115" w:type="dxa"/>
+              <w:bottom w:w="85" w:type="dxa"/>
+              <w:end w:w="115" w:type="dxa"/>
             </w:tcMar>
-            <w:shd w:fill="EAF0F7"/>
+            <w:shd w:fill="F3F6F9"/>
+            <w:vAlign w:val="center"/>
           </w:tcPr>
           <w:p>
             <w:pPr>
+              <w:keepLines/>
               <w:jc w:val="center"/>
             </w:pPr>
             <w:r>
               <w:rPr>
-                <w:rFonts w:ascii="Times New Roman" w:hAnsi="Times New Roman" w:eastAsia="Times New Roman"/>
+                <w:rFonts w:ascii="Arial" w:hAnsi="Arial" w:eastAsia="Arial"/>
                 <w:b/>
-                <w:color w:val="000000"/>
+                <w:i w:val="0"/>
+                <w:color w:val="20364F"/>
+                <w:sz w:val="13"/>
+              </w:rPr>
+              <w:t>ЧАСТЬ III</w:t>
+              <w:br/>
+            </w:r>
+            <w:r>
+              <w:rPr>
+                <w:rFonts w:ascii="Arial" w:hAnsi="Arial" w:eastAsia="Arial"/>
+                <w:b/>
+                <w:i w:val="0"/>
+                <w:color w:val="20364F"/>
                 <w:sz w:val="20"/>
               </w:rPr>
-              <w:t>ИСПОЛНИТЕЛЬ</w:t>
+              <w:t>09</w:t>
             </w:r>
           </w:p>
         </w:tc>
         <w:tc>
           <w:tcPr>
-            <w:tcW w:type="dxa" w:w="4933"/>
+            <w:tcW w:type="dxa" w:w="3364"/>
             <w:tcMar>
-              <w:top w:w="80" w:type="dxa"/>
-              <w:start w:w="120" w:type="dxa"/>
-              <w:bottom w:w="80" w:type="dxa"/>
-              <w:end w:w="120" w:type="dxa"/>
+              <w:top w:w="85" w:type="dxa"/>
+              <w:start w:w="115" w:type="dxa"/>
+              <w:bottom w:w="85" w:type="dxa"/>
+              <w:end w:w="115" w:type="dxa"/>
             </w:tcMar>
-            <w:shd w:fill="EAF0F7"/>
+            <w:shd w:fill="FBF7EE"/>
+            <w:vAlign w:val="center"/>
           </w:tcPr>
           <w:p>
             <w:pPr>
-              <w:jc w:val="center"/>
+              <w:keepLines/>
             </w:pPr>
             <w:r>
               <w:rPr>
-                <w:rFonts w:ascii="Times New Roman" w:hAnsi="Times New Roman" w:eastAsia="Times New Roman"/>
+                <w:rFonts w:ascii="Arial" w:hAnsi="Arial" w:eastAsia="Arial"/>
                 <w:b/>
-                <w:color w:val="000000"/>
-                <w:sz w:val="20"/>
+                <w:i w:val="0"/>
+                <w:color w:val="102A43"/>
+                <w:sz w:val="17"/>
               </w:rPr>
-              <w:t>КЛИЕНТ</w:t>
+              <w:t>РЕКВИЗИТЫ, ОПЛАТА И ПОДПИСИ</w:t>
+              <w:br/>
+            </w:r>
+            <w:r>
+              <w:rPr>
+                <w:rFonts w:ascii="Arial" w:hAnsi="Arial" w:eastAsia="Arial"/>
+                <w:b w:val="0"/>
+                <w:i w:val="0"/>
+                <w:color w:val="667085"/>
+                <w:sz w:val="13"/>
+              </w:rPr>
+              <w:t>Идентификация сторон и способы оплаты</w:t>
+            </w:r>
+          </w:p>
+        </w:tc>
+        <w:tc>
+          <w:tcPr>
+            <w:tcW w:type="dxa" w:w="3364"/>
+            <w:tcMar>
+              <w:top w:w="85" w:type="dxa"/>
+              <w:start w:w="115" w:type="dxa"/>
+              <w:bottom w:w="85" w:type="dxa"/>
+              <w:end w:w="115" w:type="dxa"/>
+            </w:tcMar>
+            <w:shd w:fill="F5F7FA"/>
+            <w:vAlign w:val="center"/>
+          </w:tcPr>
+          <w:p>
+            <w:pPr>
+              <w:keepLines/>
+              <w:jc w:val="right"/>
+            </w:pPr>
+            <w:r>
+              <w:rPr>
+                <w:rFonts w:ascii="Arial" w:hAnsi="Arial" w:eastAsia="Arial"/>
+                <w:b/>
+                <w:i w:val="0"/>
+                <w:color w:val="102A43"/>
+                <w:sz w:val="14"/>
+              </w:rPr>
+              <w:t>ДОГОВОР № {{ contract_number }}</w:t>
+              <w:br/>
+            </w:r>
+            <w:r>
+              <w:rPr>
+                <w:rFonts w:ascii="Arial" w:hAnsi="Arial" w:eastAsia="Arial"/>
+                <w:b w:val="0"/>
+                <w:i w:val="0"/>
+                <w:color w:val="667085"/>
+                <w:sz w:val="12"/>
+              </w:rPr>
+              <w:t>{{ contract_date }} · ZAKONEXPERT</w:t>
             </w:r>
           </w:p>
         </w:tc>
       </w:tr>
+    </w:tbl>
+    <w:tbl>
+      <w:tblPr>
+        <w:tblW w:type="dxa" w:w="10092"/>
+        <w:jc w:val="center"/>
+        <w:tblLayout w:type="fixed"/>
+        <w:tblLook w:firstColumn="1" w:firstRow="1" w:lastColumn="0" w:lastRow="0" w:noHBand="0" w:noVBand="1" w:val="04A0"/>
+        <w:tblBorders>
+          <w:top w:val="single" w:sz="6" w:color="D1D8E0" w:space="0"/>
+          <w:left w:val="single" w:sz="6" w:color="D1D8E0" w:space="0"/>
+          <w:bottom w:val="single" w:sz="6" w:color="D1D8E0" w:space="0"/>
+          <w:right w:val="single" w:sz="6" w:color="D1D8E0" w:space="0"/>
+          <w:insideH w:val="single" w:sz="6" w:color="D1D8E0" w:space="0"/>
+          <w:insideV w:val="single" w:sz="6" w:color="D1D8E0" w:space="0"/>
+        </w:tblBorders>
+      </w:tblPr>
+      <w:tblGrid>
+        <w:gridCol w:w="5046"/>
+        <w:gridCol w:w="5046"/>
+      </w:tblGrid>
       <w:tr>
+        <w:trPr>
+          <w:trHeight w:val="1050" w:hRule="atLeast"/>
+          <w:cantSplit/>
+        </w:trPr>
         <w:tc>
           <w:tcPr>
-            <w:tcW w:type="dxa" w:w="4932"/>
+            <w:tcW w:type="dxa" w:w="5046"/>
             <w:tcMar>
-              <w:top w:w="80" w:type="dxa"/>
-              <w:start w:w="120" w:type="dxa"/>
-              <w:bottom w:w="80" w:type="dxa"/>
-              <w:end w:w="120" w:type="dxa"/>
+              <w:top w:w="100" w:type="dxa"/>
+              <w:start w:w="140" w:type="dxa"/>
+              <w:bottom w:w="100" w:type="dxa"/>
+              <w:end w:w="140" w:type="dxa"/>
             </w:tcMar>
+            <w:shd w:fill="F5F7FA"/>
             <w:vAlign w:val="top"/>
           </w:tcPr>
           <w:p>
             <w:pPr>
               <w:keepLines/>
-              <w:spacing w:after="0" w:line="252" w:lineRule="auto"/>
+              <w:spacing w:after="40"/>
             </w:pPr>
+            <w:r>
+              <w:rPr>
+                <w:rFonts w:ascii="Arial" w:hAnsi="Arial" w:eastAsia="Arial"/>
+                <w:b/>
+                <w:i w:val="0"/>
+                <w:color w:val="B58A3A"/>
+                <w:sz w:val="13"/>
+              </w:rPr>
+              <w:t>ИСПОЛНИТЕЛЬ</w:t>
+              <w:br/>
+            </w:r>
             <w:r>
               <w:rPr>
                 <w:rFonts w:ascii="Times New Roman" w:hAnsi="Times New Roman" w:eastAsia="Times New Roman"/>
                 <w:b/>
-                <w:sz w:val="19"/>
+                <w:i w:val="0"/>
+                <w:color w:val="102A43"/>
+                <w:sz w:val="16"/>
               </w:rPr>
               <w:t>{{ executor_brand_name }}</w:t>
             </w:r>
@@ -926,7 +2664,9 @@
               <w:rPr>
                 <w:rFonts w:ascii="Times New Roman" w:hAnsi="Times New Roman" w:eastAsia="Times New Roman"/>
                 <w:b w:val="0"/>
-                <w:sz w:val="19"/>
+                <w:i w:val="0"/>
+                <w:color w:val="171717"/>
+                <w:sz w:val="16"/>
               </w:rPr>
               <w:t>{{ executor_full_name }}</w:t>
             </w:r>
@@ -937,7 +2677,9 @@
               <w:rPr>
                 <w:rFonts w:ascii="Times New Roman" w:hAnsi="Times New Roman" w:eastAsia="Times New Roman"/>
                 <w:b w:val="0"/>
-                <w:sz w:val="19"/>
+                <w:i w:val="0"/>
+                <w:color w:val="171717"/>
+                <w:sz w:val="16"/>
               </w:rPr>
               <w:t>{{ executor_identifier_label }}: {{ executor_identifier }}</w:t>
             </w:r>
@@ -948,7 +2690,9 @@
               <w:rPr>
                 <w:rFonts w:ascii="Times New Roman" w:hAnsi="Times New Roman" w:eastAsia="Times New Roman"/>
                 <w:b w:val="0"/>
-                <w:sz w:val="19"/>
+                <w:i w:val="0"/>
+                <w:color w:val="171717"/>
+                <w:sz w:val="16"/>
               </w:rPr>
               <w:t>Руководитель: {{ executor_director_name }}</w:t>
             </w:r>
@@ -959,9 +2703,11 @@
               <w:rPr>
                 <w:rFonts w:ascii="Times New Roman" w:hAnsi="Times New Roman" w:eastAsia="Times New Roman"/>
                 <w:b w:val="0"/>
-                <w:sz w:val="19"/>
+                <w:i w:val="0"/>
+                <w:color w:val="171717"/>
+                <w:sz w:val="16"/>
               </w:rPr>
-              <w:t>Адрес: {{ executor_address }}</w:t>
+              <w:t>Юридический адрес: {{ executor_address }}</w:t>
             </w:r>
             <w:r>
               <w:br/>
@@ -970,33 +2716,62 @@
               <w:rPr>
                 <w:rFonts w:ascii="Times New Roman" w:hAnsi="Times New Roman" w:eastAsia="Times New Roman"/>
                 <w:b w:val="0"/>
-                <w:sz w:val="19"/>
+                <w:i w:val="0"/>
+                <w:color w:val="171717"/>
+                <w:sz w:val="16"/>
               </w:rPr>
               <w:t>Тел./WhatsApp: {{ executor_phone }}</w:t>
+            </w:r>
+            <w:r>
+              <w:br/>
+            </w:r>
+            <w:r>
+              <w:rPr>
+                <w:rFonts w:ascii="Times New Roman" w:hAnsi="Times New Roman" w:eastAsia="Times New Roman"/>
+                <w:b w:val="0"/>
+                <w:i w:val="0"/>
+                <w:color w:val="171717"/>
+                <w:sz w:val="16"/>
+              </w:rPr>
+              <w:t>Сайт: {{ executor_website }}</w:t>
             </w:r>
           </w:p>
         </w:tc>
         <w:tc>
           <w:tcPr>
-            <w:tcW w:type="dxa" w:w="4933"/>
+            <w:tcW w:type="dxa" w:w="5046"/>
             <w:tcMar>
-              <w:top w:w="80" w:type="dxa"/>
-              <w:start w:w="120" w:type="dxa"/>
-              <w:bottom w:w="80" w:type="dxa"/>
-              <w:end w:w="120" w:type="dxa"/>
+              <w:top w:w="100" w:type="dxa"/>
+              <w:start w:w="140" w:type="dxa"/>
+              <w:bottom w:w="100" w:type="dxa"/>
+              <w:end w:w="140" w:type="dxa"/>
             </w:tcMar>
+            <w:shd w:fill="F5F7FA"/>
             <w:vAlign w:val="top"/>
           </w:tcPr>
           <w:p>
             <w:pPr>
               <w:keepLines/>
-              <w:spacing w:after="0" w:line="252" w:lineRule="auto"/>
+              <w:spacing w:after="40"/>
             </w:pPr>
+            <w:r>
+              <w:rPr>
+                <w:rFonts w:ascii="Arial" w:hAnsi="Arial" w:eastAsia="Arial"/>
+                <w:b/>
+                <w:i w:val="0"/>
+                <w:color w:val="B58A3A"/>
+                <w:sz w:val="13"/>
+              </w:rPr>
+              <w:t>КЛИЕНТ</w:t>
+              <w:br/>
+            </w:r>
             <w:r>
               <w:rPr>
                 <w:rFonts w:ascii="Times New Roman" w:hAnsi="Times New Roman" w:eastAsia="Times New Roman"/>
                 <w:b/>
-                <w:sz w:val="19"/>
+                <w:i w:val="0"/>
+                <w:color w:val="102A43"/>
+                <w:sz w:val="16"/>
               </w:rPr>
               <w:t>{{ client_full_name }}</w:t>
             </w:r>
@@ -1007,7 +2782,9 @@
               <w:rPr>
                 <w:rFonts w:ascii="Times New Roman" w:hAnsi="Times New Roman" w:eastAsia="Times New Roman"/>
                 <w:b w:val="0"/>
-                <w:sz w:val="19"/>
+                <w:i w:val="0"/>
+                <w:color w:val="171717"/>
+                <w:sz w:val="16"/>
               </w:rPr>
               <w:t>ИИН: {{ client_iin }}</w:t>
             </w:r>
@@ -1018,9 +2795,11 @@
               <w:rPr>
                 <w:rFonts w:ascii="Times New Roman" w:hAnsi="Times New Roman" w:eastAsia="Times New Roman"/>
                 <w:b w:val="0"/>
-                <w:sz w:val="19"/>
+                <w:i w:val="0"/>
+                <w:color w:val="171717"/>
+                <w:sz w:val="16"/>
               </w:rPr>
-              <w:t>Телефон/WhatsApp: {{ client_phone }}</w:t>
+              <w:t>Тел./WhatsApp: {{ client_phone }}</w:t>
             </w:r>
             <w:r>
               <w:br/>
@@ -1029,7 +2808,9 @@
               <w:rPr>
                 <w:rFonts w:ascii="Times New Roman" w:hAnsi="Times New Roman" w:eastAsia="Times New Roman"/>
                 <w:b w:val="0"/>
-                <w:sz w:val="19"/>
+                <w:i w:val="0"/>
+                <w:color w:val="171717"/>
+                <w:sz w:val="16"/>
               </w:rPr>
               <w:t>Адрес: {{ client_address }}</w:t>
             </w:r>
@@ -1039,40 +2820,516 @@
     </w:tbl>
     <w:p>
       <w:pPr>
-        <w:spacing w:after="60"/>
+        <w:spacing w:before="80" w:after="30"/>
+        <w:pBdr>
+          <w:bottom w:val="single" w:sz="8" w:space="2" w:color="B58A3A"/>
+        </w:pBdr>
       </w:pPr>
+      <w:r>
+        <w:rPr>
+          <w:rFonts w:ascii="Arial" w:hAnsi="Arial" w:eastAsia="Arial"/>
+          <w:b/>
+          <w:i w:val="0"/>
+          <w:color w:val="102A43"/>
+          <w:sz w:val="16"/>
+        </w:rPr>
+        <w:t>ПОРЯДОК ОПЛАТЫ</w:t>
+      </w:r>
+      <w:r>
+        <w:rPr>
+          <w:rFonts w:ascii="Arial" w:hAnsi="Arial" w:eastAsia="Arial"/>
+          <w:b w:val="0"/>
+          <w:i w:val="0"/>
+          <w:color w:val="667085"/>
+          <w:sz w:val="14"/>
+        </w:rPr>
+        <w:t xml:space="preserve">  ·  сверяйте перед оплатой</w:t>
+      </w:r>
     </w:p>
     <w:tbl>
       <w:tblPr>
-        <w:tblW w:type="dxa" w:w="9865"/>
+        <w:tblW w:type="dxa" w:w="10092"/>
         <w:jc w:val="center"/>
         <w:tblLayout w:type="fixed"/>
         <w:tblLook w:firstColumn="1" w:firstRow="1" w:lastColumn="0" w:lastRow="0" w:noHBand="0" w:noVBand="1" w:val="04A0"/>
-        <w:tblInd w:w="0" w:type="dxa"/>
         <w:tblBorders>
-          <w:top w:val="single" w:sz="6" w:space="0" w:color="B8C4D1"/>
-          <w:left w:val="single" w:sz="6" w:space="0" w:color="B8C4D1"/>
-          <w:bottom w:val="single" w:sz="6" w:space="0" w:color="B8C4D1"/>
-          <w:right w:val="single" w:sz="6" w:space="0" w:color="B8C4D1"/>
-          <w:insideH w:val="single" w:sz="6" w:space="0" w:color="B8C4D1"/>
-          <w:insideV w:val="single" w:sz="6" w:space="0" w:color="B8C4D1"/>
+          <w:top w:val="single" w:sz="5" w:color="D1D8E0" w:space="0"/>
+          <w:left w:val="single" w:sz="5" w:color="D1D8E0" w:space="0"/>
+          <w:bottom w:val="single" w:sz="5" w:color="D1D8E0" w:space="0"/>
+          <w:right w:val="single" w:sz="5" w:color="D1D8E0" w:space="0"/>
+          <w:insideH w:val="single" w:sz="5" w:color="D1D8E0" w:space="0"/>
+          <w:insideV w:val="single" w:sz="5" w:color="D1D8E0" w:space="0"/>
         </w:tblBorders>
       </w:tblPr>
       <w:tblGrid>
-        <w:gridCol w:w="4932"/>
-        <w:gridCol w:w="4933"/>
+        <w:gridCol w:w="5046"/>
+        <w:gridCol w:w="5046"/>
+      </w:tblGrid>
+      <w:tr>
+        <w:trPr>
+          <w:trHeight w:val="450" w:hRule="atLeast"/>
+          <w:cantSplit/>
+        </w:trPr>
+        <w:tc>
+          <w:tcPr>
+            <w:tcW w:type="dxa" w:w="5046"/>
+            <w:tcMar>
+              <w:top w:w="75" w:type="dxa"/>
+              <w:start w:w="115" w:type="dxa"/>
+              <w:bottom w:w="75" w:type="dxa"/>
+              <w:end w:w="115" w:type="dxa"/>
+            </w:tcMar>
+            <w:shd w:fill="FBF8F1"/>
+            <w:vAlign w:val="center"/>
+          </w:tcPr>
+          <w:p>
+            <w:pPr>
+              <w:keepLines/>
+              <w:spacing w:after="0"/>
+            </w:pPr>
+            <w:r>
+              <w:rPr>
+                <w:rFonts w:ascii="Arial" w:hAnsi="Arial" w:eastAsia="Arial"/>
+                <w:b/>
+                <w:i w:val="0"/>
+                <w:color w:val="B78A43"/>
+                <w:sz w:val="12"/>
+              </w:rPr>
+              <w:t>ОСНОВНОЙ СПОСОБ</w:t>
+            </w:r>
+            <w:r>
+              <w:rPr>
+                <w:rFonts w:ascii="Times New Roman" w:hAnsi="Times New Roman" w:eastAsia="Times New Roman"/>
+                <w:b/>
+                <w:i w:val="0"/>
+                <w:color w:val="102A43"/>
+                <w:sz w:val="16"/>
+              </w:rPr>
+            </w:r>
+          </w:p>
+        </w:tc>
+        <w:tc>
+          <w:tcPr>
+            <w:tcW w:type="dxa" w:w="5046"/>
+            <w:tcMar>
+              <w:top w:w="75" w:type="dxa"/>
+              <w:start w:w="115" w:type="dxa"/>
+              <w:bottom w:w="75" w:type="dxa"/>
+              <w:end w:w="115" w:type="dxa"/>
+            </w:tcMar>
+            <w:shd w:fill="F5F7FA"/>
+            <w:vAlign w:val="center"/>
+          </w:tcPr>
+          <w:p>
+            <w:pPr>
+              <w:keepLines/>
+              <w:spacing w:after="0"/>
+            </w:pPr>
+            <w:r>
+              <w:rPr>
+                <w:rFonts w:ascii="Arial" w:hAnsi="Arial" w:eastAsia="Arial"/>
+                <w:b w:val="0"/>
+                <w:i w:val="0"/>
+                <w:color w:val="20364F"/>
+                <w:sz w:val="12"/>
+              </w:rPr>
+              <w:t>Оплата по счёту или платёжной ссылке, выставленной ZakonExpert для конкретного договора.</w:t>
+            </w:r>
+            <w:r>
+              <w:rPr>
+                <w:rFonts w:ascii="Times New Roman" w:hAnsi="Times New Roman" w:eastAsia="Times New Roman"/>
+                <w:b w:val="0"/>
+                <w:i w:val="0"/>
+                <w:color w:val="171717"/>
+                <w:sz w:val="16"/>
+              </w:rPr>
+            </w:r>
+          </w:p>
+        </w:tc>
+      </w:tr>
+      <w:tr>
+        <w:trPr>
+          <w:trHeight w:val="450" w:hRule="atLeast"/>
+          <w:cantSplit/>
+        </w:trPr>
+        <w:tc>
+          <w:tcPr>
+            <w:tcW w:type="dxa" w:w="5046"/>
+            <w:tcMar>
+              <w:top w:w="75" w:type="dxa"/>
+              <w:start w:w="115" w:type="dxa"/>
+              <w:bottom w:w="75" w:type="dxa"/>
+              <w:end w:w="115" w:type="dxa"/>
+            </w:tcMar>
+            <w:shd w:fill="FBF8F1"/>
+            <w:vAlign w:val="center"/>
+          </w:tcPr>
+          <w:p>
+            <w:pPr>
+              <w:keepLines/>
+              <w:spacing w:after="0"/>
+            </w:pPr>
+            <w:r>
+              <w:rPr>
+                <w:rFonts w:ascii="Arial" w:hAnsi="Arial" w:eastAsia="Arial"/>
+                <w:b/>
+                <w:i w:val="0"/>
+                <w:color w:val="B78A43"/>
+                <w:sz w:val="12"/>
+              </w:rPr>
+              <w:t>ИДЕНТИФИКАЦИЯ</w:t>
+            </w:r>
+            <w:r>
+              <w:rPr>
+                <w:rFonts w:ascii="Times New Roman" w:hAnsi="Times New Roman" w:eastAsia="Times New Roman"/>
+                <w:b w:val="0"/>
+                <w:i w:val="0"/>
+                <w:color w:val="171717"/>
+                <w:sz w:val="16"/>
+              </w:rPr>
+            </w:r>
+          </w:p>
+        </w:tc>
+        <w:tc>
+          <w:tcPr>
+            <w:tcW w:type="dxa" w:w="5046"/>
+            <w:tcMar>
+              <w:top w:w="75" w:type="dxa"/>
+              <w:start w:w="115" w:type="dxa"/>
+              <w:bottom w:w="75" w:type="dxa"/>
+              <w:end w:w="115" w:type="dxa"/>
+            </w:tcMar>
+            <w:shd w:fill="FFFFFF"/>
+            <w:vAlign w:val="center"/>
+          </w:tcPr>
+          <w:p>
+            <w:pPr>
+              <w:keepLines/>
+              <w:spacing w:after="0"/>
+            </w:pPr>
+            <w:r>
+              <w:rPr>
+                <w:rFonts w:ascii="Arial" w:hAnsi="Arial" w:eastAsia="Arial"/>
+                <w:b w:val="0"/>
+                <w:i w:val="0"/>
+                <w:color w:val="20364F"/>
+                <w:sz w:val="12"/>
+              </w:rPr>
+              <w:t>В назначении платежа или платёжном документе должны быть указаны номер договора и сумма.</w:t>
+            </w:r>
+            <w:r>
+              <w:rPr>
+                <w:rFonts w:ascii="Times New Roman" w:hAnsi="Times New Roman" w:eastAsia="Times New Roman"/>
+                <w:b w:val="0"/>
+                <w:i w:val="0"/>
+                <w:color w:val="171717"/>
+                <w:sz w:val="16"/>
+              </w:rPr>
+            </w:r>
+          </w:p>
+        </w:tc>
+      </w:tr>
+      <w:tr>
+        <w:trPr>
+          <w:trHeight w:val="450" w:hRule="atLeast"/>
+          <w:cantSplit/>
+        </w:trPr>
+        <w:tc>
+          <w:tcPr>
+            <w:tcW w:type="dxa" w:w="5046"/>
+            <w:tcMar>
+              <w:top w:w="75" w:type="dxa"/>
+              <w:start w:w="115" w:type="dxa"/>
+              <w:bottom w:w="75" w:type="dxa"/>
+              <w:end w:w="115" w:type="dxa"/>
+            </w:tcMar>
+            <w:shd w:fill="FBF8F1"/>
+            <w:vAlign w:val="center"/>
+          </w:tcPr>
+          <w:p>
+            <w:pPr>
+              <w:keepLines/>
+              <w:spacing w:after="0"/>
+            </w:pPr>
+            <w:r>
+              <w:rPr>
+                <w:rFonts w:ascii="Arial" w:hAnsi="Arial" w:eastAsia="Arial"/>
+                <w:b/>
+                <w:i w:val="0"/>
+                <w:color w:val="B78A43"/>
+                <w:sz w:val="12"/>
+              </w:rPr>
+              <w:t>ПОДТВЕРЖДЕНИЕ</w:t>
+            </w:r>
+            <w:r>
+              <w:rPr>
+                <w:rFonts w:ascii="Times New Roman" w:hAnsi="Times New Roman" w:eastAsia="Times New Roman"/>
+                <w:b/>
+                <w:i w:val="0"/>
+                <w:color w:val="102A43"/>
+                <w:sz w:val="16"/>
+              </w:rPr>
+            </w:r>
+          </w:p>
+        </w:tc>
+        <w:tc>
+          <w:tcPr>
+            <w:tcW w:type="dxa" w:w="5046"/>
+            <w:tcMar>
+              <w:top w:w="75" w:type="dxa"/>
+              <w:start w:w="115" w:type="dxa"/>
+              <w:bottom w:w="75" w:type="dxa"/>
+              <w:end w:w="115" w:type="dxa"/>
+            </w:tcMar>
+            <w:shd w:fill="F5F7FA"/>
+            <w:vAlign w:val="center"/>
+          </w:tcPr>
+          <w:p>
+            <w:pPr>
+              <w:keepLines/>
+              <w:spacing w:after="0"/>
+            </w:pPr>
+            <w:r>
+              <w:rPr>
+                <w:rFonts w:ascii="Arial" w:hAnsi="Arial" w:eastAsia="Arial"/>
+                <w:b w:val="0"/>
+                <w:i w:val="0"/>
+                <w:color w:val="20364F"/>
+                <w:sz w:val="12"/>
+              </w:rPr>
+              <w:t>Факт оплаты подтверждается банковским, кассовым либо иным платёжным документом, позволяющим установить получателя, плательщика, сумму и дату.</w:t>
+            </w:r>
+            <w:r>
+              <w:rPr>
+                <w:rFonts w:ascii="Times New Roman" w:hAnsi="Times New Roman" w:eastAsia="Times New Roman"/>
+                <w:b w:val="0"/>
+                <w:i w:val="0"/>
+                <w:color w:val="171717"/>
+                <w:sz w:val="16"/>
+              </w:rPr>
+            </w:r>
+          </w:p>
+        </w:tc>
+      </w:tr>
+      <w:tr>
+        <w:trPr>
+          <w:trHeight w:val="450" w:hRule="atLeast"/>
+          <w:cantSplit/>
+        </w:trPr>
+        <w:tc>
+          <w:tcPr>
+            <w:tcW w:type="dxa" w:w="5046"/>
+            <w:tcMar>
+              <w:top w:w="75" w:type="dxa"/>
+              <w:start w:w="115" w:type="dxa"/>
+              <w:bottom w:w="75" w:type="dxa"/>
+              <w:end w:w="115" w:type="dxa"/>
+            </w:tcMar>
+            <w:shd w:fill="FBF8F1"/>
+            <w:vAlign w:val="center"/>
+          </w:tcPr>
+          <w:p>
+            <w:pPr>
+              <w:keepLines/>
+              <w:spacing w:after="0"/>
+            </w:pPr>
+            <w:r>
+              <w:rPr>
+                <w:rFonts w:ascii="Arial" w:hAnsi="Arial" w:eastAsia="Arial"/>
+                <w:b/>
+                <w:i w:val="0"/>
+                <w:color w:val="B78A43"/>
+                <w:sz w:val="12"/>
+              </w:rPr>
+              <w:t>КОНТАКТ</w:t>
+            </w:r>
+            <w:r>
+              <w:rPr>
+                <w:rFonts w:ascii="Times New Roman" w:hAnsi="Times New Roman" w:eastAsia="Times New Roman"/>
+                <w:b/>
+                <w:i w:val="0"/>
+                <w:color w:val="102A43"/>
+                <w:sz w:val="16"/>
+              </w:rPr>
+            </w:r>
+          </w:p>
+        </w:tc>
+        <w:tc>
+          <w:tcPr>
+            <w:tcW w:type="dxa" w:w="5046"/>
+            <w:tcMar>
+              <w:top w:w="75" w:type="dxa"/>
+              <w:start w:w="115" w:type="dxa"/>
+              <w:bottom w:w="75" w:type="dxa"/>
+              <w:end w:w="115" w:type="dxa"/>
+            </w:tcMar>
+            <w:shd w:fill="FFFFFF"/>
+            <w:vAlign w:val="center"/>
+          </w:tcPr>
+          <w:p>
+            <w:pPr>
+              <w:keepLines/>
+              <w:spacing w:after="0"/>
+            </w:pPr>
+            <w:r>
+              <w:rPr>
+                <w:rFonts w:ascii="Arial" w:hAnsi="Arial" w:eastAsia="Arial"/>
+                <w:b w:val="0"/>
+                <w:i w:val="0"/>
+                <w:color w:val="20364F"/>
+                <w:sz w:val="12"/>
+              </w:rPr>
+              <w:t>Для получения счёта и подтверждения оплаты: {{ executor_phone }} · {{ executor_website }}.</w:t>
+            </w:r>
+            <w:r>
+              <w:rPr>
+                <w:rFonts w:ascii="Times New Roman" w:hAnsi="Times New Roman" w:eastAsia="Times New Roman"/>
+                <w:b w:val="0"/>
+                <w:i w:val="0"/>
+                <w:color w:val="171717"/>
+                <w:sz w:val="16"/>
+              </w:rPr>
+            </w:r>
+          </w:p>
+        </w:tc>
+      </w:tr>
+    </w:tbl>
+    <w:tbl>
+      <w:tblPr>
+        <w:tblW w:type="dxa" w:w="10091"/>
+        <w:jc w:val="center"/>
+        <w:tblLayout w:type="fixed"/>
+        <w:tblLook w:firstColumn="1" w:firstRow="1" w:lastColumn="0" w:lastRow="0" w:noHBand="0" w:noVBand="1" w:val="04A0"/>
+        <w:tblBorders>
+          <w:top w:val="single" w:sz="6" w:color="B58A3A" w:space="0"/>
+          <w:left w:val="single" w:sz="6" w:color="B58A3A" w:space="0"/>
+          <w:bottom w:val="single" w:sz="6" w:color="B58A3A" w:space="0"/>
+          <w:right w:val="single" w:sz="6" w:color="B58A3A" w:space="0"/>
+          <w:insideH w:val="single" w:sz="6" w:color="B58A3A" w:space="0"/>
+          <w:insideV w:val="single" w:sz="6" w:color="B58A3A" w:space="0"/>
+        </w:tblBorders>
+      </w:tblPr>
+      <w:tblGrid>
+        <w:gridCol w:w="255"/>
+        <w:gridCol w:w="9836"/>
+      </w:tblGrid>
+      <w:tr>
+        <w:trPr>
+          <w:cantSplit/>
+        </w:trPr>
+        <w:tc>
+          <w:tcPr>
+            <w:tcW w:type="dxa" w:w="255"/>
+            <w:tcMar>
+              <w:top w:w="80" w:type="dxa"/>
+              <w:start w:w="95" w:type="dxa"/>
+              <w:bottom w:w="80" w:type="dxa"/>
+              <w:end w:w="95" w:type="dxa"/>
+            </w:tcMar>
+            <w:shd w:fill="B58A3A"/>
+          </w:tcPr>
+          <w:p>
+            <w:pPr>
+              <w:keepLines/>
+            </w:pPr>
+          </w:p>
+        </w:tc>
+        <w:tc>
+          <w:tcPr>
+            <w:tcW w:type="dxa" w:w="9836"/>
+            <w:tcMar>
+              <w:top w:w="80" w:type="dxa"/>
+              <w:start w:w="95" w:type="dxa"/>
+              <w:bottom w:w="80" w:type="dxa"/>
+              <w:end w:w="95" w:type="dxa"/>
+            </w:tcMar>
+            <w:shd w:fill="FBF8F1"/>
+          </w:tcPr>
+          <w:p>
+            <w:pPr>
+              <w:keepLines/>
+            </w:pPr>
+            <w:r>
+              <w:rPr>
+                <w:rFonts w:ascii="Arial" w:hAnsi="Arial" w:eastAsia="Arial"/>
+                <w:b w:val="0"/>
+                <w:i w:val="0"/>
+                <w:color w:val="20364F"/>
+                <w:sz w:val="13"/>
+              </w:rPr>
+              <w:t>БЕЗОПАСНОСТЬ ОПЛАТЫ: оплачивайте только по счёту или платёжной ссылке, полученной от ZakonExpert по этому договору. Не переводите деньги по реквизитам, которых нет в счёте или подтверждённой платёжной ссылке. ZakonExpert не запрашивает SMS-коды, пароли и доступ к банковскому приложению.</w:t>
+            </w:r>
+            <w:r>
+              <w:rPr>
+                <w:rFonts w:ascii="Times New Roman" w:hAnsi="Times New Roman" w:eastAsia="Times New Roman"/>
+                <w:b w:val="0"/>
+                <w:i w:val="0"/>
+                <w:color w:val="171717"/>
+                <w:sz w:val="14"/>
+              </w:rPr>
+            </w:r>
+          </w:p>
+        </w:tc>
+      </w:tr>
+    </w:tbl>
+    <w:p>
+      <w:pPr>
+        <w:spacing w:before="80" w:after="30"/>
+        <w:pBdr>
+          <w:bottom w:val="single" w:sz="8" w:space="2" w:color="B58A3A"/>
+        </w:pBdr>
+      </w:pPr>
+      <w:r>
+        <w:rPr>
+          <w:rFonts w:ascii="Arial" w:hAnsi="Arial" w:eastAsia="Arial"/>
+          <w:b/>
+          <w:i w:val="0"/>
+          <w:color w:val="102A43"/>
+          <w:sz w:val="16"/>
+        </w:rPr>
+        <w:t>ПОДПИСИ СТОРОН</w:t>
+      </w:r>
+      <w:r>
+        <w:rPr>
+          <w:rFonts w:ascii="Arial" w:hAnsi="Arial" w:eastAsia="Arial"/>
+          <w:b w:val="0"/>
+          <w:i w:val="0"/>
+          <w:color w:val="667085"/>
+          <w:sz w:val="14"/>
+        </w:rPr>
+        <w:t xml:space="preserve">  ·  экземпляр становится завершённым после подписания</w:t>
+      </w:r>
+    </w:p>
+    <w:tbl>
+      <w:tblPr>
+        <w:tblW w:type="dxa" w:w="10092"/>
+        <w:jc w:val="center"/>
+        <w:tblLayout w:type="fixed"/>
+        <w:tblLook w:firstColumn="1" w:firstRow="1" w:lastColumn="0" w:lastRow="0" w:noHBand="0" w:noVBand="1" w:val="04A0"/>
+        <w:tblBorders>
+          <w:top w:val="single" w:sz="6" w:color="D1D8E0" w:space="0"/>
+          <w:left w:val="single" w:sz="6" w:color="D1D8E0" w:space="0"/>
+          <w:bottom w:val="single" w:sz="6" w:color="D1D8E0" w:space="0"/>
+          <w:right w:val="single" w:sz="6" w:color="D1D8E0" w:space="0"/>
+          <w:insideH w:val="single" w:sz="6" w:color="D1D8E0" w:space="0"/>
+          <w:insideV w:val="single" w:sz="6" w:color="D1D8E0" w:space="0"/>
+        </w:tblBorders>
+      </w:tblPr>
+      <w:tblGrid>
+        <w:gridCol w:w="5046"/>
+        <w:gridCol w:w="5046"/>
       </w:tblGrid>
       <w:tr>
         <w:tc>
           <w:tcPr>
-            <w:tcW w:type="dxa" w:w="4932"/>
+            <w:tcW w:type="dxa" w:w="5046"/>
             <w:tcMar>
-              <w:top w:w="80" w:type="dxa"/>
-              <w:start w:w="120" w:type="dxa"/>
-              <w:bottom w:w="80" w:type="dxa"/>
-              <w:end w:w="120" w:type="dxa"/>
+              <w:top w:w="55" w:type="dxa"/>
+              <w:start w:w="70" w:type="dxa"/>
+              <w:bottom w:w="55" w:type="dxa"/>
+              <w:end w:w="70" w:type="dxa"/>
             </w:tcMar>
-            <w:shd w:fill="EAF0F7"/>
+            <w:shd w:fill="F3F6F9"/>
           </w:tcPr>
           <w:p>
             <w:pPr>
@@ -1080,25 +3337,26 @@
             </w:pPr>
             <w:r>
               <w:rPr>
-                <w:rFonts w:ascii="Times New Roman" w:hAnsi="Times New Roman" w:eastAsia="Times New Roman"/>
+                <w:rFonts w:ascii="Arial" w:hAnsi="Arial" w:eastAsia="Arial"/>
                 <w:b/>
-                <w:color w:val="000000"/>
-                <w:sz w:val="19"/>
+                <w:i w:val="0"/>
+                <w:color w:val="20364F"/>
+                <w:sz w:val="14"/>
               </w:rPr>
-              <w:t>ПОДПИСЬ И ПЕЧАТЬ ИСПОЛНИТЕЛЯ</w:t>
+              <w:t>ИСПОЛНИТЕЛЬ</w:t>
             </w:r>
           </w:p>
         </w:tc>
         <w:tc>
           <w:tcPr>
-            <w:tcW w:type="dxa" w:w="4933"/>
+            <w:tcW w:type="dxa" w:w="5046"/>
             <w:tcMar>
-              <w:top w:w="80" w:type="dxa"/>
-              <w:start w:w="120" w:type="dxa"/>
-              <w:bottom w:w="80" w:type="dxa"/>
-              <w:end w:w="120" w:type="dxa"/>
+              <w:top w:w="55" w:type="dxa"/>
+              <w:start w:w="70" w:type="dxa"/>
+              <w:bottom w:w="55" w:type="dxa"/>
+              <w:end w:w="70" w:type="dxa"/>
             </w:tcMar>
-            <w:shd w:fill="EAF0F7"/>
+            <w:shd w:fill="F3F6F9"/>
           </w:tcPr>
           <w:p>
             <w:pPr>
@@ -1106,47 +3364,53 @@
             </w:pPr>
             <w:r>
               <w:rPr>
-                <w:rFonts w:ascii="Times New Roman" w:hAnsi="Times New Roman" w:eastAsia="Times New Roman"/>
+                <w:rFonts w:ascii="Arial" w:hAnsi="Arial" w:eastAsia="Arial"/>
                 <w:b/>
-                <w:color w:val="000000"/>
-                <w:sz w:val="19"/>
+                <w:i w:val="0"/>
+                <w:color w:val="20364F"/>
+                <w:sz w:val="14"/>
               </w:rPr>
-              <w:t>ПОДПИСЬ КЛИЕНТА</w:t>
+              <w:t>КЛИЕНТ</w:t>
             </w:r>
           </w:p>
         </w:tc>
       </w:tr>
       <w:tr>
+        <w:trPr>
+          <w:trHeight w:val="1900" w:hRule="atLeast"/>
+          <w:cantSplit/>
+        </w:trPr>
         <w:tc>
           <w:tcPr>
-            <w:tcW w:type="dxa" w:w="4932"/>
+            <w:tcW w:type="dxa" w:w="5046"/>
             <w:tcMar>
-              <w:top w:w="140" w:type="dxa"/>
-              <w:start w:w="140" w:type="dxa"/>
-              <w:bottom w:w="140" w:type="dxa"/>
-              <w:end w:w="140" w:type="dxa"/>
+              <w:top w:w="95" w:type="dxa"/>
+              <w:start w:w="120" w:type="dxa"/>
+              <w:bottom w:w="80" w:type="dxa"/>
+              <w:end w:w="120" w:type="dxa"/>
             </w:tcMar>
+            <w:shd w:fill="FFFFFF"/>
             <w:vAlign w:val="center"/>
           </w:tcPr>
           <w:p>
             <w:pPr>
               <w:keepLines/>
-              <w:spacing w:after="60"/>
-              <w:jc w:val="left"/>
             </w:pPr>
             <w:r>
               <w:rPr>
-                <w:rFonts w:ascii="Times New Roman" w:hAnsi="Times New Roman" w:eastAsia="Times New Roman"/>
+                <w:rFonts w:ascii="Arial" w:hAnsi="Arial" w:eastAsia="Arial"/>
                 <w:b/>
-                <w:sz w:val="19"/>
+                <w:i w:val="0"/>
+                <w:color w:val="102A43"/>
+                <w:sz w:val="15"/>
               </w:rPr>
-              <w:t>Руководитель</w:t>
+              <w:t>Руководитель · {{ executor_signer_short_name }}</w:t>
             </w:r>
           </w:p>
           <w:p>
             <w:pPr>
               <w:keepLines/>
-              <w:spacing w:before="0" w:after="0" w:line="240" w:lineRule="auto"/>
+              <w:spacing w:before="40" w:after="0"/>
               <w:jc w:val="center"/>
             </w:pPr>
             <w:r>
@@ -1156,15 +3420,64 @@
         </w:tc>
         <w:tc>
           <w:tcPr>
-            <w:tcW w:type="dxa" w:w="4933"/>
+            <w:tcW w:type="dxa" w:w="5046"/>
             <w:tcMar>
-              <w:top w:w="140" w:type="dxa"/>
+              <w:top w:w="95" w:type="dxa"/>
               <w:start w:w="140" w:type="dxa"/>
-              <w:bottom w:w="140" w:type="dxa"/>
+              <w:bottom w:w="80" w:type="dxa"/>
               <w:end w:w="140" w:type="dxa"/>
             </w:tcMar>
+            <w:shd w:fill="FFFFFF"/>
             <w:vAlign w:val="top"/>
           </w:tcPr>
+          <w:p>
+            <w:pPr>
+              <w:keepLines/>
+              <w:spacing w:after="160"/>
+            </w:pPr>
+            <w:r>
+              <w:rPr>
+                <w:rFonts w:ascii="Arial" w:hAnsi="Arial" w:eastAsia="Arial"/>
+                <w:b/>
+                <w:i w:val="0"/>
+                <w:color w:val="102A43"/>
+                <w:sz w:val="15"/>
+              </w:rPr>
+              <w:t>Подпись Клиента</w:t>
+            </w:r>
+          </w:p>
+          <w:p>
+            <w:pPr>
+              <w:keepLines/>
+              <w:spacing w:after="120"/>
+            </w:pPr>
+            <w:r>
+              <w:rPr>
+                <w:rFonts w:ascii="Times New Roman" w:hAnsi="Times New Roman" w:eastAsia="Times New Roman"/>
+                <w:b w:val="0"/>
+                <w:i w:val="0"/>
+                <w:color w:val="171717"/>
+                <w:sz w:val="16"/>
+              </w:rPr>
+              <w:t>{{ client_signature }}</w:t>
+            </w:r>
+          </w:p>
+          <w:p>
+            <w:pPr>
+              <w:keepLines/>
+              <w:spacing w:after="100"/>
+            </w:pPr>
+            <w:r>
+              <w:rPr>
+                <w:rFonts w:ascii="Times New Roman" w:hAnsi="Times New Roman" w:eastAsia="Times New Roman"/>
+                <w:b w:val="0"/>
+                <w:i w:val="0"/>
+                <w:color w:val="102A43"/>
+                <w:sz w:val="17"/>
+              </w:rPr>
+              <w:t>______________________</w:t>
+            </w:r>
+          </w:p>
           <w:p>
             <w:pPr>
               <w:keepLines/>
@@ -1174,54 +3487,25 @@
               <w:rPr>
                 <w:rFonts w:ascii="Times New Roman" w:hAnsi="Times New Roman" w:eastAsia="Times New Roman"/>
                 <w:b/>
-                <w:sz w:val="19"/>
+                <w:i w:val="0"/>
+                <w:color w:val="171717"/>
+                <w:sz w:val="16"/>
               </w:rPr>
-              <w:t>Подпись Клиента:</w:t>
+              <w:t>{{ client_full_name }}</w:t>
             </w:r>
           </w:p>
           <w:p>
             <w:pPr>
               <w:keepLines/>
-              <w:spacing w:before="0" w:after="0" w:line="240" w:lineRule="auto"/>
+              <w:spacing w:after="0"/>
             </w:pPr>
             <w:r>
               <w:rPr>
                 <w:rFonts w:ascii="Times New Roman" w:hAnsi="Times New Roman" w:eastAsia="Times New Roman"/>
-                <w:sz w:val="19"/>
-              </w:rPr>
-              <w:t>{{ client_signature }}</w:t>
-            </w:r>
-            <w:r>
-              <w:rPr>
-                <w:rFonts w:ascii="Times New Roman" w:hAnsi="Times New Roman" w:eastAsia="Times New Roman"/>
-                <w:sz w:val="19"/>
-              </w:rPr>
-              <w:br/>
-              <w:br/>
-            </w:r>
-          </w:p>
-          <w:p>
-            <w:pPr>
-              <w:keepLines/>
-              <w:spacing w:before="0" w:after="100"/>
-            </w:pPr>
-            <w:r>
-              <w:rPr>
-                <w:rFonts w:ascii="Times New Roman" w:hAnsi="Times New Roman" w:eastAsia="Times New Roman"/>
-                <w:sz w:val="19"/>
-              </w:rPr>
-              <w:t>________________ / {{ client_full_name }} /</w:t>
-            </w:r>
-          </w:p>
-          <w:p>
-            <w:pPr>
-              <w:keepLines/>
-              <w:spacing w:before="0" w:after="0"/>
-            </w:pPr>
-            <w:r>
-              <w:rPr>
-                <w:rFonts w:ascii="Times New Roman" w:hAnsi="Times New Roman" w:eastAsia="Times New Roman"/>
-                <w:sz w:val="19"/>
+                <w:b w:val="0"/>
+                <w:i w:val="0"/>
+                <w:color w:val="667085"/>
+                <w:sz w:val="15"/>
               </w:rPr>
               <w:t>Дата подписания: {{ client_signature_date }}</w:t>
             </w:r>
@@ -1229,11 +3513,27 @@
         </w:tc>
       </w:tr>
     </w:tbl>
+    <w:p>
+      <w:pPr>
+        <w:spacing w:before="40" w:after="0"/>
+        <w:jc w:val="center"/>
+      </w:pPr>
+      <w:r>
+        <w:rPr>
+          <w:rFonts w:ascii="Times New Roman" w:hAnsi="Times New Roman" w:eastAsia="Times New Roman"/>
+          <w:b w:val="0"/>
+          <w:i/>
+          <w:color w:val="667085"/>
+          <w:sz w:val="13"/>
+        </w:rPr>
+        <w:t>Подписывая договор, Клиент подтверждает, что ознакомился с ключевыми условиями, объёмом услуг, стоимостью, порядком оплаты и правилами прекращения договора.</w:t>
+      </w:r>
+    </w:p>
     <w:sectPr>
       <w:headerReference w:type="default" r:id="rId9"/>
       <w:footerReference w:type="default" r:id="rId10"/>
       <w:pgSz w:w="11906" w:h="16838"/>
-      <w:pgMar w:top="1020" w:right="1020" w:bottom="1020" w:left="1020" w:header="397" w:footer="510" w:gutter="0"/>
+      <w:pgMar w:top="850" w:right="907" w:bottom="850" w:left="907" w:header="312" w:footer="369" w:gutter="0"/>
       <w:cols w:space="720"/>
       <w:docGrid w:linePitch="360"/>
     </w:sectPr>
@@ -1246,18 +3546,144 @@
   <w:p>
     <w:pPr>
       <w:pStyle w:val="Footer"/>
-      <w:spacing w:before="0"/>
+    </w:pPr>
+  </w:p>
+  <w:tbl>
+    <w:tblPr>
+      <w:tblW w:type="dxa" w:w="10091"/>
       <w:jc w:val="center"/>
-    </w:pPr>
-    <w:r>
-      <w:rPr>
-        <w:rFonts w:ascii="Times New Roman" w:hAnsi="Times New Roman" w:eastAsia="Times New Roman"/>
-        <w:color w:val="667085"/>
-        <w:sz w:val="16"/>
-      </w:rPr>
-      <w:t>ТОО «ZakonExpert» | {{ executor_phone }} | zakonexpertt.kz</w:t>
-    </w:r>
-  </w:p>
+      <w:tblLayout w:type="fixed"/>
+      <w:tblLook w:firstColumn="1" w:firstRow="1" w:lastColumn="0" w:lastRow="0" w:noHBand="0" w:noVBand="1" w:val="04A0"/>
+      <w:tblBorders>
+        <w:top w:val="nil" w:sz="0" w:color="FFFFFF" w:space="0"/>
+        <w:left w:val="nil" w:sz="0" w:color="FFFFFF" w:space="0"/>
+        <w:bottom w:val="nil" w:sz="0" w:color="FFFFFF" w:space="0"/>
+        <w:right w:val="nil" w:sz="0" w:color="FFFFFF" w:space="0"/>
+        <w:insideH w:val="nil" w:sz="0" w:color="FFFFFF" w:space="0"/>
+        <w:insideV w:val="nil" w:sz="0" w:color="FFFFFF" w:space="0"/>
+      </w:tblBorders>
+    </w:tblPr>
+    <w:tblGrid>
+      <w:gridCol w:w="5216"/>
+      <w:gridCol w:w="3288"/>
+      <w:gridCol w:w="1587"/>
+    </w:tblGrid>
+    <w:tr>
+      <w:tc>
+        <w:tcPr>
+          <w:tcW w:type="dxa" w:w="5216"/>
+          <w:tcMar>
+            <w:top w:w="0" w:type="dxa"/>
+            <w:start w:w="0" w:type="dxa"/>
+            <w:bottom w:w="0" w:type="dxa"/>
+            <w:end w:w="0" w:type="dxa"/>
+          </w:tcMar>
+        </w:tcPr>
+        <w:p>
+          <w:r>
+            <w:rPr>
+              <w:rFonts w:ascii="Arial" w:hAnsi="Arial" w:eastAsia="Arial"/>
+              <w:b w:val="0"/>
+              <w:i w:val="0"/>
+              <w:color w:val="667085"/>
+              <w:sz w:val="13"/>
+            </w:rPr>
+            <w:t>ТОО «ZakonExpert» · БИН {{ executor_identifier }}</w:t>
+          </w:r>
+        </w:p>
+      </w:tc>
+      <w:tc>
+        <w:tcPr>
+          <w:tcW w:type="dxa" w:w="3288"/>
+          <w:tcMar>
+            <w:top w:w="0" w:type="dxa"/>
+            <w:start w:w="0" w:type="dxa"/>
+            <w:bottom w:w="0" w:type="dxa"/>
+            <w:end w:w="0" w:type="dxa"/>
+          </w:tcMar>
+        </w:tcPr>
+        <w:p>
+          <w:pPr>
+            <w:jc w:val="center"/>
+          </w:pPr>
+          <w:r>
+            <w:rPr>
+              <w:rFonts w:ascii="Arial" w:hAnsi="Arial" w:eastAsia="Arial"/>
+              <w:b w:val="0"/>
+              <w:i w:val="0"/>
+              <w:color w:val="667085"/>
+              <w:sz w:val="13"/>
+            </w:rPr>
+            <w:t>{{ executor_phone }} · {{ executor_website }}</w:t>
+          </w:r>
+        </w:p>
+      </w:tc>
+      <w:tc>
+        <w:tcPr>
+          <w:tcW w:type="dxa" w:w="1587"/>
+          <w:tcMar>
+            <w:top w:w="0" w:type="dxa"/>
+            <w:start w:w="0" w:type="dxa"/>
+            <w:bottom w:w="0" w:type="dxa"/>
+            <w:end w:w="0" w:type="dxa"/>
+          </w:tcMar>
+        </w:tcPr>
+        <w:p>
+          <w:pPr>
+            <w:jc w:val="right"/>
+          </w:pPr>
+          <w:r>
+            <w:rPr>
+              <w:rFonts w:ascii="Arial" w:hAnsi="Arial" w:eastAsia="Arial"/>
+              <w:b w:val="0"/>
+              <w:i w:val="0"/>
+              <w:color w:val="667085"/>
+              <w:sz w:val="13"/>
+            </w:rPr>
+            <w:t xml:space="preserve">СТР. </w:t>
+          </w:r>
+          <w:r>
+            <w:rPr>
+              <w:rFonts w:ascii="Arial" w:hAnsi="Arial" w:eastAsia="Arial"/>
+              <w:b w:val="0"/>
+              <w:i w:val="0"/>
+              <w:color w:val="667085"/>
+              <w:sz w:val="14"/>
+            </w:rPr>
+            <w:fldChar w:fldCharType="begin"/>
+            <w:instrText xml:space="preserve">PAGE</w:instrText>
+            <w:fldChar w:fldCharType="separate"/>
+            <w:t>1</w:t>
+            <w:fldChar w:fldCharType="end"/>
+          </w:r>
+          <w:r>
+            <w:rPr>
+              <w:rFonts w:ascii="Arial" w:hAnsi="Arial" w:eastAsia="Arial"/>
+              <w:b w:val="0"/>
+              <w:i w:val="0"/>
+              <w:color w:val="667085"/>
+              <w:sz w:val="13"/>
+            </w:rPr>
+            <w:t xml:space="preserve"> / </w:t>
+          </w:r>
+          <w:r>
+            <w:rPr>
+              <w:rFonts w:ascii="Arial" w:hAnsi="Arial" w:eastAsia="Arial"/>
+              <w:b w:val="0"/>
+              <w:i w:val="0"/>
+              <w:color w:val="667085"/>
+              <w:sz w:val="14"/>
+            </w:rPr>
+            <w:fldChar w:fldCharType="begin"/>
+            <w:instrText xml:space="preserve">NUMPAGES</w:instrText>
+            <w:fldChar w:fldCharType="separate"/>
+            <w:t>1</w:t>
+            <w:fldChar w:fldCharType="end"/>
+          </w:r>
+        </w:p>
+      </w:tc>
+    </w:tr>
+  </w:tbl>
 </w:ftr>
 </file>
 
@@ -1270,73 +3696,160 @@
   </w:p>
   <w:tbl>
     <w:tblPr>
-      <w:tblW w:type="dxa" w:w="9865"/>
+      <w:tblW w:type="dxa" w:w="10092"/>
       <w:jc w:val="center"/>
       <w:tblLayout w:type="fixed"/>
       <w:tblLook w:firstColumn="1" w:firstRow="1" w:lastColumn="0" w:lastRow="0" w:noHBand="0" w:noVBand="1" w:val="04A0"/>
-      <w:tblInd w:w="0" w:type="dxa"/>
       <w:tblBorders>
-        <w:top w:val="nil"/>
-        <w:left w:val="nil"/>
-        <w:bottom w:val="nil"/>
-        <w:right w:val="nil"/>
-        <w:insideH w:val="nil"/>
-        <w:insideV w:val="nil"/>
+        <w:top w:val="nil" w:sz="0" w:color="FFFFFF" w:space="0"/>
+        <w:left w:val="nil" w:sz="0" w:color="FFFFFF" w:space="0"/>
+        <w:bottom w:val="nil" w:sz="0" w:color="FFFFFF" w:space="0"/>
+        <w:right w:val="nil" w:sz="0" w:color="FFFFFF" w:space="0"/>
+        <w:insideH w:val="nil" w:sz="0" w:color="FFFFFF" w:space="0"/>
+        <w:insideV w:val="nil" w:sz="0" w:color="FFFFFF" w:space="0"/>
       </w:tblBorders>
     </w:tblPr>
     <w:tblGrid>
-      <w:gridCol w:w="4932"/>
-      <w:gridCol w:w="4933"/>
+      <w:gridCol w:w="794"/>
+      <w:gridCol w:w="5896"/>
+      <w:gridCol w:w="3402"/>
     </w:tblGrid>
     <w:tr>
       <w:tc>
         <w:tcPr>
-          <w:tcW w:type="dxa" w:w="4932"/>
+          <w:tcW w:type="dxa" w:w="794"/>
           <w:tcMar>
-            <w:top w:w="80" w:type="dxa"/>
-            <w:start w:w="120" w:type="dxa"/>
-            <w:bottom w:w="80" w:type="dxa"/>
-            <w:end w:w="120" w:type="dxa"/>
+            <w:top w:w="0" w:type="dxa"/>
+            <w:start w:w="0" w:type="dxa"/>
+            <w:bottom w:w="0" w:type="dxa"/>
+            <w:end w:w="0" w:type="dxa"/>
           </w:tcMar>
         </w:tcPr>
         <w:p>
+          <w:pPr>
+            <w:jc w:val="left"/>
+          </w:pPr>
           <w:r>
-            <w:rPr>
-              <w:rFonts w:ascii="Times New Roman" w:hAnsi="Times New Roman" w:eastAsia="Times New Roman"/>
-              <w:b/>
-              <w:color w:val="000000"/>
-              <w:sz w:val="17"/>
-            </w:rPr>
-            <w:t>ZAKONEXPERT</w:t>
+            <w:drawing>
+              <wp:inline xmlns:a="http://schemas.openxmlformats.org/drawingml/2006/main" xmlns:pic="http://schemas.openxmlformats.org/drawingml/2006/picture">
+                <wp:extent cx="378000" cy="378000"/>
+                <wp:docPr id="1" name="Picture 1"/>
+                <wp:cNvGraphicFramePr>
+                  <a:graphicFrameLocks noChangeAspect="1"/>
+                </wp:cNvGraphicFramePr>
+                <a:graphic>
+                  <a:graphicData uri="http://schemas.openxmlformats.org/drawingml/2006/picture">
+                    <pic:pic>
+                      <pic:nvPicPr>
+                        <pic:cNvPr id="0" name="image.png"/>
+                        <pic:cNvPicPr/>
+                      </pic:nvPicPr>
+                      <pic:blipFill>
+                        <a:blip r:embed="rId1"/>
+                        <a:stretch>
+                          <a:fillRect/>
+                        </a:stretch>
+                      </pic:blipFill>
+                      <pic:spPr>
+                        <a:xfrm>
+                          <a:off x="0" y="0"/>
+                          <a:ext cx="378000" cy="378000"/>
+                        </a:xfrm>
+                        <a:prstGeom prst="rect"/>
+                      </pic:spPr>
+                    </pic:pic>
+                  </a:graphicData>
+                </a:graphic>
+              </wp:inline>
+            </w:drawing>
           </w:r>
         </w:p>
       </w:tc>
       <w:tc>
         <w:tcPr>
-          <w:tcW w:type="dxa" w:w="4933"/>
+          <w:tcW w:type="dxa" w:w="5896"/>
           <w:tcMar>
-            <w:top w:w="80" w:type="dxa"/>
-            <w:start w:w="120" w:type="dxa"/>
-            <w:bottom w:w="80" w:type="dxa"/>
-            <w:end w:w="120" w:type="dxa"/>
+            <w:top w:w="0" w:type="dxa"/>
+            <w:start w:w="0" w:type="dxa"/>
+            <w:bottom w:w="0" w:type="dxa"/>
+            <w:end w:w="0" w:type="dxa"/>
           </w:tcMar>
         </w:tcPr>
         <w:p>
           <w:pPr>
+            <w:spacing w:after="0"/>
+          </w:pPr>
+          <w:r>
+            <w:rPr>
+              <w:rFonts w:ascii="Arial" w:hAnsi="Arial" w:eastAsia="Arial"/>
+              <w:b/>
+              <w:i w:val="0"/>
+              <w:color w:val="102A43"/>
+              <w:sz w:val="18"/>
+            </w:rPr>
+            <w:t>ZAKONEXPERT</w:t>
+            <w:br/>
+          </w:r>
+          <w:r>
+            <w:rPr>
+              <w:rFonts w:ascii="Arial" w:hAnsi="Arial" w:eastAsia="Arial"/>
+              <w:b/>
+              <w:i w:val="0"/>
+              <w:color w:val="B58A3A"/>
+              <w:sz w:val="12"/>
+            </w:rPr>
+            <w:t>ЮРИДИЧЕСКОЕ СОПРОВОЖДЕНИЕ</w:t>
+          </w:r>
+        </w:p>
+      </w:tc>
+      <w:tc>
+        <w:tcPr>
+          <w:tcW w:type="dxa" w:w="3402"/>
+          <w:tcMar>
+            <w:top w:w="0" w:type="dxa"/>
+            <w:start w:w="0" w:type="dxa"/>
+            <w:bottom w:w="0" w:type="dxa"/>
+            <w:end w:w="0" w:type="dxa"/>
+          </w:tcMar>
+        </w:tcPr>
+        <w:p>
+          <w:pPr>
+            <w:spacing w:after="0"/>
             <w:jc w:val="right"/>
           </w:pPr>
           <w:r>
             <w:rPr>
-              <w:rFonts w:ascii="Times New Roman" w:hAnsi="Times New Roman" w:eastAsia="Times New Roman"/>
+              <w:rFonts w:ascii="Arial" w:hAnsi="Arial" w:eastAsia="Arial"/>
+              <w:b/>
+              <w:i w:val="0"/>
+              <w:color w:val="102A43"/>
+              <w:sz w:val="15"/>
+            </w:rPr>
+            <w:t>ДОГОВОР № {{ contract_number }}</w:t>
+            <w:br/>
+          </w:r>
+          <w:r>
+            <w:rPr>
+              <w:rFonts w:ascii="Arial" w:hAnsi="Arial" w:eastAsia="Arial"/>
+              <w:b w:val="0"/>
+              <w:i w:val="0"/>
               <w:color w:val="667085"/>
-              <w:sz w:val="17"/>
+              <w:sz w:val="13"/>
             </w:rPr>
-            <w:t>Договор оказания услуг № {{ contract_number }}</w:t>
+            <w:t>{{ contract_date }}</w:t>
           </w:r>
         </w:p>
       </w:tc>
     </w:tr>
   </w:tbl>
+  <w:p>
+    <w:pPr>
+      <w:spacing w:before="0" w:after="0"/>
+      <w:pBdr>
+        <w:bottom w:val="single" w:sz="8" w:space="0" w:color="B58A3A"/>
+      </w:pBdr>
+    </w:pPr>
+  </w:p>
 </w:hdr>
 </file>
 
@@ -1704,7 +4217,7 @@
     <w:qFormat/>
     <w:rsid w:val="00FC693F"/>
     <w:pPr>
-      <w:spacing w:before="0" w:after="60" w:line="259" w:lineRule="auto"/>
+      <w:spacing w:before="0" w:after="36" w:line="245" w:lineRule="auto"/>
     </w:pPr>
     <w:rPr>
       <w:rFonts w:ascii="Times New Roman" w:hAnsi="Times New Roman" w:eastAsia="Times New Roman"/>
@@ -13392,20 +15905,6 @@
         <w:shd w:val="clear" w:color="auto" w:fill="FBCAA2" w:themeFill="accent6" w:themeFillTint="7F"/>
       </w:tcPr>
     </w:tblStylePr>
-  </w:style>
-  <w:style w:type="paragraph" w:customStyle="1" w:styleId="ZESection">
-    <w:name w:val="ZE Section"/>
-    <w:basedOn w:val="Normal"/>
-    <w:pPr>
-      <w:keepNext/>
-      <w:spacing w:before="180" w:after="80"/>
-    </w:pPr>
-    <w:rPr>
-      <w:rFonts w:ascii="Times New Roman" w:hAnsi="Times New Roman"/>
-      <w:b/>
-      <w:color w:val="000000"/>
-      <w:sz w:val="21"/>
-    </w:rPr>
   </w:style>
 </w:styles>
 </file>

</xml_diff>